<commit_message>
Primera version del listado de la tabla de amortizacion
</commit_message>
<xml_diff>
--- a/documentacion/ChatDesarrollo_001.docx
+++ b/documentacion/ChatDesarrollo_001.docx
@@ -4822,68 +4822,113 @@
     <w:p>
       <w:pPr>
         <w:spacing w:after="0" w:line="240" w:lineRule="auto"/>
-      </w:pPr>
-      <w:proofErr w:type="spellStart"/>
-      <w:r>
+        <w:rPr>
+          <w:lang w:val="en-US"/>
+        </w:rPr>
+      </w:pPr>
+      <w:proofErr w:type="spellStart"/>
+      <w:r>
+        <w:rPr>
+          <w:lang w:val="en-US"/>
+        </w:rPr>
         <w:t>php</w:t>
       </w:r>
       <w:proofErr w:type="spellEnd"/>
       <w:r>
-        <w:t xml:space="preserve"> </w:t>
-      </w:r>
-      <w:proofErr w:type="spellStart"/>
-      <w:r>
-        <w:t>artisan</w:t>
-      </w:r>
-      <w:proofErr w:type="spellEnd"/>
-      <w:r>
-        <w:t xml:space="preserve"> </w:t>
+        <w:rPr>
+          <w:lang w:val="en-US"/>
+        </w:rPr>
+        <w:t xml:space="preserve"> artisan </w:t>
       </w:r>
       <w:proofErr w:type="spellStart"/>
       <w:proofErr w:type="gramStart"/>
       <w:r>
+        <w:rPr>
+          <w:lang w:val="en-US"/>
+        </w:rPr>
         <w:t>make:controller</w:t>
       </w:r>
       <w:proofErr w:type="spellEnd"/>
       <w:proofErr w:type="gramEnd"/>
       <w:r>
+        <w:rPr>
+          <w:lang w:val="en-US"/>
+        </w:rPr>
         <w:t xml:space="preserve"> API/</w:t>
       </w:r>
       <w:proofErr w:type="spellStart"/>
       <w:r>
+        <w:rPr>
+          <w:lang w:val="en-US"/>
+        </w:rPr>
         <w:t>PersonaController</w:t>
       </w:r>
       <w:proofErr w:type="spellEnd"/>
       <w:r>
+        <w:rPr>
+          <w:lang w:val="en-US"/>
+        </w:rPr>
+        <w:t xml:space="preserve"> --</w:t>
+      </w:r>
+      <w:proofErr w:type="spellStart"/>
+      <w:r>
+        <w:rPr>
+          <w:lang w:val="en-US"/>
+        </w:rPr>
+        <w:t>api</w:t>
+      </w:r>
+      <w:proofErr w:type="spellEnd"/>
+    </w:p>
+    <w:p>
+      <w:pPr>
+        <w:spacing w:after="0" w:line="240" w:lineRule="auto"/>
+        <w:rPr>
+          <w:lang w:val="en-US"/>
+        </w:rPr>
+      </w:pPr>
+      <w:proofErr w:type="spellStart"/>
+      <w:r>
+        <w:rPr>
+          <w:lang w:val="en-US"/>
+        </w:rPr>
+        <w:t>php</w:t>
+      </w:r>
+      <w:proofErr w:type="spellEnd"/>
+      <w:r>
+        <w:rPr>
+          <w:lang w:val="en-US"/>
+        </w:rPr>
+        <w:t xml:space="preserve"> artisan </w:t>
+      </w:r>
+      <w:proofErr w:type="spellStart"/>
+      <w:proofErr w:type="gramStart"/>
+      <w:r>
+        <w:rPr>
+          <w:lang w:val="en-US"/>
+        </w:rPr>
+        <w:t>make:controller</w:t>
+      </w:r>
+      <w:proofErr w:type="spellEnd"/>
+      <w:proofErr w:type="gramEnd"/>
+      <w:r>
+        <w:rPr>
+          <w:lang w:val="en-US"/>
+        </w:rPr>
+        <w:t xml:space="preserve"> API/</w:t>
+      </w:r>
+      <w:proofErr w:type="spellStart"/>
+      <w:r>
+        <w:rPr>
+          <w:lang w:val="en-US"/>
+        </w:rPr>
+        <w:t>GrupoFamiliarController</w:t>
+      </w:r>
+      <w:proofErr w:type="spellEnd"/>
+      <w:r>
+        <w:rPr>
+          <w:lang w:val="en-US"/>
+        </w:rPr>
         <w:t xml:space="preserve"> --api</w:t>
-      </w:r>
-    </w:p>
-    <w:p>
-      <w:pPr>
-        <w:spacing w:after="0" w:line="240" w:lineRule="auto"/>
-        <w:rPr>
-          <w:lang w:val="en-US"/>
-        </w:rPr>
-      </w:pPr>
-      <w:r>
-        <w:rPr>
-          <w:lang w:val="en-US"/>
-        </w:rPr>
-        <w:t xml:space="preserve">php artisan </w:t>
-      </w:r>
-      <w:proofErr w:type="gramStart"/>
-      <w:r>
-        <w:rPr>
-          <w:lang w:val="en-US"/>
-        </w:rPr>
-        <w:t>make:controller</w:t>
-      </w:r>
-      <w:proofErr w:type="gramEnd"/>
-      <w:r>
-        <w:rPr>
-          <w:lang w:val="en-US"/>
-        </w:rPr>
-        <w:t xml:space="preserve"> API/GrupoFamiliarController --api</w:t>
       </w:r>
     </w:p>
     <w:p>
@@ -5724,6 +5769,1233 @@
       <w:r>
         <w:t>Si de acuerdo</w:t>
       </w:r>
+    </w:p>
+    <w:p>
+      <w:pPr>
+        <w:spacing w:after="0" w:line="240" w:lineRule="auto"/>
+      </w:pPr>
+    </w:p>
+    <w:p>
+      <w:pPr>
+        <w:spacing w:after="0" w:line="240" w:lineRule="auto"/>
+      </w:pPr>
+      <w:proofErr w:type="gramStart"/>
+      <w:r>
+        <w:t>Recuerdas el plan que teníamos para el desarrollo?</w:t>
+      </w:r>
+      <w:proofErr w:type="gramEnd"/>
+      <w:r>
+        <w:t xml:space="preserve"> </w:t>
+      </w:r>
+      <w:proofErr w:type="spellStart"/>
+      <w:proofErr w:type="gramStart"/>
+      <w:r>
+        <w:t>Cual</w:t>
+      </w:r>
+      <w:proofErr w:type="spellEnd"/>
+      <w:r>
+        <w:t xml:space="preserve"> sería el siguiente paso?</w:t>
+      </w:r>
+      <w:proofErr w:type="gramEnd"/>
+    </w:p>
+    <w:p>
+      <w:pPr>
+        <w:spacing w:after="0" w:line="240" w:lineRule="auto"/>
+      </w:pPr>
+      <w:r>
+        <w:t>Según el resumen de la sesión anterior, el objetivo principal era </w:t>
+      </w:r>
+      <w:r>
+        <w:rPr>
+          <w:b/>
+          <w:bCs/>
+        </w:rPr>
+        <w:t>estandarizar los botones de los modales</w:t>
+      </w:r>
+      <w:r>
+        <w:t> usando </w:t>
+      </w:r>
+      <w:proofErr w:type="spellStart"/>
+      <w:r>
+        <w:t>ModalActionsComponent</w:t>
+      </w:r>
+      <w:proofErr w:type="spellEnd"/>
+      <w:r>
+        <w:t>, lo cual ya completamos aplicándolo a:</w:t>
+      </w:r>
+    </w:p>
+    <w:p>
+      <w:pPr>
+        <w:numPr>
+          <w:ilvl w:val="0"/>
+          <w:numId w:val="52"/>
+        </w:numPr>
+        <w:spacing w:after="0" w:line="240" w:lineRule="auto"/>
+      </w:pPr>
+      <w:r>
+        <w:t>Instrumentos</w:t>
+      </w:r>
+    </w:p>
+    <w:p>
+      <w:pPr>
+        <w:numPr>
+          <w:ilvl w:val="0"/>
+          <w:numId w:val="52"/>
+        </w:numPr>
+        <w:spacing w:after="0" w:line="240" w:lineRule="auto"/>
+      </w:pPr>
+      <w:r>
+        <w:t>Grupos Familiares</w:t>
+      </w:r>
+    </w:p>
+    <w:p>
+      <w:pPr>
+        <w:numPr>
+          <w:ilvl w:val="0"/>
+          <w:numId w:val="52"/>
+        </w:numPr>
+        <w:spacing w:after="0" w:line="240" w:lineRule="auto"/>
+      </w:pPr>
+      <w:r>
+        <w:t>Emisores</w:t>
+      </w:r>
+    </w:p>
+    <w:p>
+      <w:pPr>
+        <w:numPr>
+          <w:ilvl w:val="0"/>
+          <w:numId w:val="52"/>
+        </w:numPr>
+        <w:spacing w:after="0" w:line="240" w:lineRule="auto"/>
+      </w:pPr>
+      <w:r>
+        <w:t>Inversiones</w:t>
+      </w:r>
+    </w:p>
+    <w:p>
+      <w:pPr>
+        <w:numPr>
+          <w:ilvl w:val="0"/>
+          <w:numId w:val="52"/>
+        </w:numPr>
+        <w:spacing w:after="0" w:line="240" w:lineRule="auto"/>
+      </w:pPr>
+      <w:r>
+        <w:t>Personas</w:t>
+      </w:r>
+    </w:p>
+    <w:p>
+      <w:pPr>
+        <w:numPr>
+          <w:ilvl w:val="0"/>
+          <w:numId w:val="52"/>
+        </w:numPr>
+        <w:spacing w:after="0" w:line="240" w:lineRule="auto"/>
+      </w:pPr>
+      <w:proofErr w:type="spellStart"/>
+      <w:r>
+        <w:t>Catalogos</w:t>
+      </w:r>
+      <w:proofErr w:type="spellEnd"/>
+    </w:p>
+    <w:p>
+      <w:pPr>
+        <w:spacing w:after="0" w:line="240" w:lineRule="auto"/>
+      </w:pPr>
+      <w:r>
+        <w:t xml:space="preserve">Después de eso, hemos estado resolviendo problemas puntuales del módulo de Inversiones </w:t>
+      </w:r>
+      <w:proofErr w:type="spellStart"/>
+      <w:r>
+        <w:t>y</w:t>
+      </w:r>
+      <w:proofErr w:type="spellEnd"/>
+      <w:r>
+        <w:t xml:space="preserve"> Instrumentos.</w:t>
+      </w:r>
+    </w:p>
+    <w:p>
+      <w:pPr>
+        <w:spacing w:after="0" w:line="240" w:lineRule="auto"/>
+      </w:pPr>
+      <w:r>
+        <w:t>No tengo un plan explícito definido más allá de la estandarización. ¿Cuál sería el siguiente paso que te gustaría abordar? Algunas opciones podrían ser:</w:t>
+      </w:r>
+    </w:p>
+    <w:p>
+      <w:pPr>
+        <w:numPr>
+          <w:ilvl w:val="0"/>
+          <w:numId w:val="53"/>
+        </w:numPr>
+        <w:spacing w:after="0" w:line="240" w:lineRule="auto"/>
+      </w:pPr>
+      <w:r>
+        <w:t>Continuar refinando el módulo de Inversiones</w:t>
+      </w:r>
+    </w:p>
+    <w:p>
+      <w:pPr>
+        <w:numPr>
+          <w:ilvl w:val="0"/>
+          <w:numId w:val="53"/>
+        </w:numPr>
+        <w:spacing w:after="0" w:line="240" w:lineRule="auto"/>
+      </w:pPr>
+      <w:r>
+        <w:t>Implementar funcionalidades pendientes en otros módulos</w:t>
+      </w:r>
+    </w:p>
+    <w:p>
+      <w:pPr>
+        <w:numPr>
+          <w:ilvl w:val="0"/>
+          <w:numId w:val="53"/>
+        </w:numPr>
+        <w:spacing w:after="0" w:line="240" w:lineRule="auto"/>
+      </w:pPr>
+      <w:r>
+        <w:t>Desarrollar nuevos módulos</w:t>
+      </w:r>
+    </w:p>
+    <w:p>
+      <w:pPr>
+        <w:numPr>
+          <w:ilvl w:val="0"/>
+          <w:numId w:val="53"/>
+        </w:numPr>
+        <w:spacing w:after="0" w:line="240" w:lineRule="auto"/>
+      </w:pPr>
+      <w:r>
+        <w:t>Mejorar el </w:t>
+      </w:r>
+      <w:proofErr w:type="spellStart"/>
+      <w:r>
+        <w:t>Dashboard</w:t>
+      </w:r>
+      <w:proofErr w:type="spellEnd"/>
+      <w:r>
+        <w:t xml:space="preserve"> con datos reales</w:t>
+      </w:r>
+    </w:p>
+    <w:p>
+      <w:pPr>
+        <w:numPr>
+          <w:ilvl w:val="0"/>
+          <w:numId w:val="53"/>
+        </w:numPr>
+        <w:spacing w:after="0" w:line="240" w:lineRule="auto"/>
+      </w:pPr>
+      <w:r>
+        <w:t>Implementar reportes</w:t>
+      </w:r>
+    </w:p>
+    <w:p>
+      <w:pPr>
+        <w:numPr>
+          <w:ilvl w:val="0"/>
+          <w:numId w:val="53"/>
+        </w:numPr>
+        <w:spacing w:after="0" w:line="240" w:lineRule="auto"/>
+      </w:pPr>
+      <w:r>
+        <w:t>Otro aspecto que tengas en mente</w:t>
+      </w:r>
+    </w:p>
+    <w:p>
+      <w:pPr>
+        <w:spacing w:after="0" w:line="240" w:lineRule="auto"/>
+      </w:pPr>
+    </w:p>
+    <w:p>
+      <w:pPr>
+        <w:spacing w:after="0" w:line="240" w:lineRule="auto"/>
+      </w:pPr>
+    </w:p>
+    <w:p>
+      <w:pPr>
+        <w:spacing w:after="0" w:line="240" w:lineRule="auto"/>
+      </w:pPr>
+      <w:proofErr w:type="gramStart"/>
+      <w:r>
+        <w:t xml:space="preserve">Creo que necesitamos el módulo de tablas de </w:t>
+      </w:r>
+      <w:proofErr w:type="spellStart"/>
+      <w:r>
+        <w:t>amortizacion</w:t>
+      </w:r>
+      <w:proofErr w:type="spellEnd"/>
+      <w:r>
+        <w:t>, porque esto va atado a la tabla de inversiones, estás de acuerdo?</w:t>
+      </w:r>
+      <w:proofErr w:type="gramEnd"/>
+      <w:r>
+        <w:t xml:space="preserve"> </w:t>
+      </w:r>
+      <w:proofErr w:type="gramStart"/>
+      <w:r>
+        <w:t>Qué funcionalidades me recomiendas implementar?</w:t>
+      </w:r>
+      <w:proofErr w:type="gramEnd"/>
+    </w:p>
+    <w:p>
+      <w:pPr>
+        <w:spacing w:after="0" w:line="240" w:lineRule="auto"/>
+      </w:pPr>
+      <w:r>
+        <w:t xml:space="preserve">Sí, estoy de acuerdo. Las tablas de amortización son fundamentales para las inversiones. Voy a revisar el modelo de </w:t>
+      </w:r>
+      <w:proofErr w:type="spellStart"/>
+      <w:r>
+        <w:t>Inversion</w:t>
+      </w:r>
+      <w:proofErr w:type="spellEnd"/>
+      <w:r>
+        <w:t xml:space="preserve"> para ver la relación:</w:t>
+      </w:r>
+    </w:p>
+    <w:p>
+      <w:pPr>
+        <w:spacing w:after="0" w:line="240" w:lineRule="auto"/>
+      </w:pPr>
+      <w:r>
+        <w:lastRenderedPageBreak/>
+        <w:t>Perfecto, el modelo </w:t>
+      </w:r>
+    </w:p>
+    <w:p>
+      <w:pPr>
+        <w:spacing w:after="0" w:line="240" w:lineRule="auto"/>
+      </w:pPr>
+      <w:proofErr w:type="spellStart"/>
+      <w:r>
+        <w:t>Amortizacion</w:t>
+      </w:r>
+      <w:proofErr w:type="spellEnd"/>
+      <w:r>
+        <w:t> ya existe con una estructura completa. Basándome en los campos disponibles, te recomiendo las siguientes funcionalidades:</w:t>
+      </w:r>
+    </w:p>
+    <w:p>
+      <w:pPr>
+        <w:spacing w:after="0" w:line="240" w:lineRule="auto"/>
+      </w:pPr>
+      <w:r>
+        <w:rPr>
+          <w:b/>
+          <w:bCs/>
+        </w:rPr>
+        <w:t>Funcionalidades recomendadas para el módulo de Amortizaciones:</w:t>
+      </w:r>
+    </w:p>
+    <w:p>
+      <w:pPr>
+        <w:numPr>
+          <w:ilvl w:val="0"/>
+          <w:numId w:val="54"/>
+        </w:numPr>
+        <w:spacing w:after="0" w:line="240" w:lineRule="auto"/>
+      </w:pPr>
+      <w:r>
+        <w:rPr>
+          <w:b/>
+          <w:bCs/>
+        </w:rPr>
+        <w:t>Listado de amortizaciones</w:t>
+      </w:r>
+    </w:p>
+    <w:p>
+      <w:pPr>
+        <w:numPr>
+          <w:ilvl w:val="1"/>
+          <w:numId w:val="54"/>
+        </w:numPr>
+        <w:spacing w:after="0" w:line="240" w:lineRule="auto"/>
+      </w:pPr>
+      <w:r>
+        <w:t>Tabla con todas las amortizaciones del sistema</w:t>
+      </w:r>
+    </w:p>
+    <w:p>
+      <w:pPr>
+        <w:numPr>
+          <w:ilvl w:val="1"/>
+          <w:numId w:val="54"/>
+        </w:numPr>
+        <w:spacing w:after="0" w:line="240" w:lineRule="auto"/>
+      </w:pPr>
+      <w:r>
+        <w:t>Filtros por inversión, estado, rango de fechas</w:t>
+      </w:r>
+    </w:p>
+    <w:p>
+      <w:pPr>
+        <w:numPr>
+          <w:ilvl w:val="1"/>
+          <w:numId w:val="54"/>
+        </w:numPr>
+        <w:spacing w:after="0" w:line="240" w:lineRule="auto"/>
+      </w:pPr>
+      <w:r>
+        <w:t xml:space="preserve">Columnas: </w:t>
+      </w:r>
+      <w:proofErr w:type="spellStart"/>
+      <w:r>
+        <w:t>N°</w:t>
+      </w:r>
+      <w:proofErr w:type="spellEnd"/>
+      <w:r>
+        <w:t xml:space="preserve"> Cuota, Fecha Pago, Interés, Capital, Descuento, Total, Retención, Estado, Pagada</w:t>
+      </w:r>
+    </w:p>
+    <w:p>
+      <w:pPr>
+        <w:numPr>
+          <w:ilvl w:val="0"/>
+          <w:numId w:val="54"/>
+        </w:numPr>
+        <w:spacing w:after="0" w:line="240" w:lineRule="auto"/>
+      </w:pPr>
+      <w:r>
+        <w:rPr>
+          <w:b/>
+          <w:bCs/>
+        </w:rPr>
+        <w:t>Generación automática de tabla de amortización</w:t>
+      </w:r>
+    </w:p>
+    <w:p>
+      <w:pPr>
+        <w:numPr>
+          <w:ilvl w:val="1"/>
+          <w:numId w:val="54"/>
+        </w:numPr>
+        <w:spacing w:after="0" w:line="240" w:lineRule="auto"/>
+      </w:pPr>
+      <w:r>
+        <w:t>Desde el formulario de inversión, botón para generar automáticamente las cuotas</w:t>
+      </w:r>
+    </w:p>
+    <w:p>
+      <w:pPr>
+        <w:numPr>
+          <w:ilvl w:val="1"/>
+          <w:numId w:val="54"/>
+        </w:numPr>
+        <w:spacing w:after="0" w:line="240" w:lineRule="auto"/>
+      </w:pPr>
+      <w:r>
+        <w:t>Cálculo basado en: capital invertido, tasa de interés, fecha compra, fecha vencimiento del instrumento</w:t>
+      </w:r>
+    </w:p>
+    <w:p>
+      <w:pPr>
+        <w:numPr>
+          <w:ilvl w:val="1"/>
+          <w:numId w:val="54"/>
+        </w:numPr>
+        <w:spacing w:after="0" w:line="240" w:lineRule="auto"/>
+      </w:pPr>
+      <w:r>
+        <w:t>Método de amortización (francés, alemán, etc.)</w:t>
+      </w:r>
+    </w:p>
+    <w:p>
+      <w:pPr>
+        <w:numPr>
+          <w:ilvl w:val="0"/>
+          <w:numId w:val="54"/>
+        </w:numPr>
+        <w:spacing w:after="0" w:line="240" w:lineRule="auto"/>
+      </w:pPr>
+      <w:r>
+        <w:rPr>
+          <w:b/>
+          <w:bCs/>
+        </w:rPr>
+        <w:t>Edición manual de amortizaciones</w:t>
+      </w:r>
+    </w:p>
+    <w:p>
+      <w:pPr>
+        <w:numPr>
+          <w:ilvl w:val="1"/>
+          <w:numId w:val="54"/>
+        </w:numPr>
+        <w:spacing w:after="0" w:line="240" w:lineRule="auto"/>
+      </w:pPr>
+      <w:r>
+        <w:t>Modal para editar valores individuales de cada cuota</w:t>
+      </w:r>
+    </w:p>
+    <w:p>
+      <w:pPr>
+        <w:numPr>
+          <w:ilvl w:val="1"/>
+          <w:numId w:val="54"/>
+        </w:numPr>
+        <w:spacing w:after="0" w:line="240" w:lineRule="auto"/>
+      </w:pPr>
+      <w:r>
+        <w:t>Ajustes manuales de interés, capital, descuento, retención</w:t>
+      </w:r>
+    </w:p>
+    <w:p>
+      <w:pPr>
+        <w:numPr>
+          <w:ilvl w:val="0"/>
+          <w:numId w:val="54"/>
+        </w:numPr>
+        <w:spacing w:after="0" w:line="240" w:lineRule="auto"/>
+      </w:pPr>
+      <w:r>
+        <w:rPr>
+          <w:b/>
+          <w:bCs/>
+        </w:rPr>
+        <w:t>Marcar como pagada</w:t>
+      </w:r>
+    </w:p>
+    <w:p>
+      <w:pPr>
+        <w:numPr>
+          <w:ilvl w:val="1"/>
+          <w:numId w:val="54"/>
+        </w:numPr>
+        <w:spacing w:after="0" w:line="240" w:lineRule="auto"/>
+      </w:pPr>
+      <w:r>
+        <w:t>Funcionalidad para marcar cuotas como pagadas</w:t>
+      </w:r>
+    </w:p>
+    <w:p>
+      <w:pPr>
+        <w:numPr>
+          <w:ilvl w:val="1"/>
+          <w:numId w:val="54"/>
+        </w:numPr>
+        <w:spacing w:after="0" w:line="240" w:lineRule="auto"/>
+      </w:pPr>
+      <w:r>
+        <w:t>Registro de fecha de pago real</w:t>
+      </w:r>
+    </w:p>
+    <w:p>
+      <w:pPr>
+        <w:numPr>
+          <w:ilvl w:val="0"/>
+          <w:numId w:val="54"/>
+        </w:numPr>
+        <w:spacing w:after="0" w:line="240" w:lineRule="auto"/>
+      </w:pPr>
+      <w:r>
+        <w:rPr>
+          <w:b/>
+          <w:bCs/>
+        </w:rPr>
+        <w:t>Vista detallada por inversión</w:t>
+      </w:r>
+    </w:p>
+    <w:p>
+      <w:pPr>
+        <w:numPr>
+          <w:ilvl w:val="1"/>
+          <w:numId w:val="54"/>
+        </w:numPr>
+        <w:spacing w:after="0" w:line="240" w:lineRule="auto"/>
+      </w:pPr>
+      <w:r>
+        <w:t>Desde la lista de inversiones, botón para ver sus amortizaciones</w:t>
+      </w:r>
+    </w:p>
+    <w:p>
+      <w:pPr>
+        <w:numPr>
+          <w:ilvl w:val="1"/>
+          <w:numId w:val="54"/>
+        </w:numPr>
+        <w:spacing w:after="0" w:line="240" w:lineRule="auto"/>
+      </w:pPr>
+      <w:r>
+        <w:t>Resumen: total pagado, total pendiente, próxima cuota</w:t>
+      </w:r>
+    </w:p>
+    <w:p>
+      <w:pPr>
+        <w:numPr>
+          <w:ilvl w:val="0"/>
+          <w:numId w:val="54"/>
+        </w:numPr>
+        <w:spacing w:after="0" w:line="240" w:lineRule="auto"/>
+      </w:pPr>
+      <w:r>
+        <w:rPr>
+          <w:b/>
+          <w:bCs/>
+        </w:rPr>
+        <w:t>Cálculo automático de totales</w:t>
+      </w:r>
+    </w:p>
+    <w:p>
+      <w:pPr>
+        <w:numPr>
+          <w:ilvl w:val="1"/>
+          <w:numId w:val="54"/>
+        </w:numPr>
+        <w:spacing w:after="0" w:line="240" w:lineRule="auto"/>
+      </w:pPr>
+      <w:r>
+        <w:t>Suma de intereses, capital, descuentos, retenciones</w:t>
+      </w:r>
+    </w:p>
+    <w:p>
+      <w:pPr>
+        <w:numPr>
+          <w:ilvl w:val="1"/>
+          <w:numId w:val="54"/>
+        </w:numPr>
+        <w:spacing w:after="0" w:line="240" w:lineRule="auto"/>
+      </w:pPr>
+      <w:proofErr w:type="spellStart"/>
+      <w:r>
+        <w:t>Display</w:t>
+      </w:r>
+      <w:proofErr w:type="spellEnd"/>
+      <w:r>
+        <w:t xml:space="preserve"> de totales en la vista de detalle</w:t>
+      </w:r>
+    </w:p>
+    <w:p>
+      <w:pPr>
+        <w:numPr>
+          <w:ilvl w:val="0"/>
+          <w:numId w:val="54"/>
+        </w:numPr>
+        <w:spacing w:after="0" w:line="240" w:lineRule="auto"/>
+      </w:pPr>
+      <w:r>
+        <w:rPr>
+          <w:b/>
+          <w:bCs/>
+        </w:rPr>
+        <w:t>Estados de amortización</w:t>
+      </w:r>
+    </w:p>
+    <w:p>
+      <w:pPr>
+        <w:numPr>
+          <w:ilvl w:val="1"/>
+          <w:numId w:val="54"/>
+        </w:numPr>
+        <w:spacing w:after="0" w:line="240" w:lineRule="auto"/>
+      </w:pPr>
+      <w:r>
+        <w:t>Usar catálogo para estados: Pendiente, Pagada, Vencida, Cancelada</w:t>
+      </w:r>
+    </w:p>
+    <w:p>
+      <w:pPr>
+        <w:numPr>
+          <w:ilvl w:val="0"/>
+          <w:numId w:val="54"/>
+        </w:numPr>
+        <w:spacing w:after="0" w:line="240" w:lineRule="auto"/>
+      </w:pPr>
+      <w:r>
+        <w:rPr>
+          <w:b/>
+          <w:bCs/>
+        </w:rPr>
+        <w:t>Exportar tabla</w:t>
+      </w:r>
+    </w:p>
+    <w:p>
+      <w:pPr>
+        <w:numPr>
+          <w:ilvl w:val="1"/>
+          <w:numId w:val="54"/>
+        </w:numPr>
+        <w:spacing w:after="0" w:line="240" w:lineRule="auto"/>
+      </w:pPr>
+      <w:r>
+        <w:t>Exportar a Excel/PDF la tabla de amortización de una inversión</w:t>
+      </w:r>
+    </w:p>
+    <w:p>
+      <w:pPr>
+        <w:spacing w:after="0" w:line="240" w:lineRule="auto"/>
+      </w:pPr>
+    </w:p>
+    <w:p>
+      <w:pPr>
+        <w:spacing w:after="0" w:line="240" w:lineRule="auto"/>
+      </w:pPr>
+    </w:p>
+    <w:p>
+      <w:pPr>
+        <w:spacing w:after="0" w:line="240" w:lineRule="auto"/>
+      </w:pPr>
+      <w:r>
+        <w:t xml:space="preserve">Perfecto, el </w:t>
+      </w:r>
+      <w:proofErr w:type="spellStart"/>
+      <w:r>
+        <w:t>frontend</w:t>
+      </w:r>
+      <w:proofErr w:type="spellEnd"/>
+      <w:r>
+        <w:t xml:space="preserve"> ya está compilado. He completado la implementación del módulo de amortizaciones:</w:t>
+      </w:r>
+    </w:p>
+    <w:p>
+      <w:pPr>
+        <w:numPr>
+          <w:ilvl w:val="0"/>
+          <w:numId w:val="9"/>
+        </w:numPr>
+        <w:tabs>
+          <w:tab w:val="num" w:pos="360"/>
+        </w:tabs>
+        <w:spacing w:after="0" w:line="240" w:lineRule="auto"/>
+        <w:rPr>
+          <w:b/>
+          <w:bCs/>
+        </w:rPr>
+      </w:pPr>
+      <w:r>
+        <w:rPr>
+          <w:b/>
+          <w:bCs/>
+        </w:rPr>
+        <w:t>Resumen de lo implementado:</w:t>
+      </w:r>
+    </w:p>
+    <w:p>
+      <w:pPr>
+        <w:numPr>
+          <w:ilvl w:val="0"/>
+          <w:numId w:val="10"/>
+        </w:numPr>
+        <w:tabs>
+          <w:tab w:val="clear" w:pos="720"/>
+          <w:tab w:val="num" w:pos="360"/>
+        </w:tabs>
+        <w:spacing w:after="0" w:line="240" w:lineRule="auto"/>
+        <w:rPr>
+          <w:b/>
+          <w:bCs/>
+        </w:rPr>
+      </w:pPr>
+      <w:proofErr w:type="spellStart"/>
+      <w:r>
+        <w:rPr>
+          <w:b/>
+          <w:bCs/>
+        </w:rPr>
+        <w:t>Backend</w:t>
+      </w:r>
+      <w:proofErr w:type="spellEnd"/>
+      <w:r>
+        <w:rPr>
+          <w:b/>
+          <w:bCs/>
+        </w:rPr>
+        <w:t>:</w:t>
+      </w:r>
+    </w:p>
+    <w:p>
+      <w:pPr>
+        <w:numPr>
+          <w:ilvl w:val="0"/>
+          <w:numId w:val="55"/>
+        </w:numPr>
+        <w:spacing w:after="0" w:line="240" w:lineRule="auto"/>
+      </w:pPr>
+      <w:r>
+        <w:rPr>
+          <w:b/>
+          <w:bCs/>
+        </w:rPr>
+        <w:t>Modelo Amortización</w:t>
+      </w:r>
+      <w:r>
+        <w:t> - Actualizado con campo </w:t>
+      </w:r>
+      <w:proofErr w:type="spellStart"/>
+      <w:r>
+        <w:t>int_parcial</w:t>
+      </w:r>
+      <w:proofErr w:type="spellEnd"/>
+    </w:p>
+    <w:p>
+      <w:pPr>
+        <w:numPr>
+          <w:ilvl w:val="0"/>
+          <w:numId w:val="55"/>
+        </w:numPr>
+        <w:spacing w:after="0" w:line="240" w:lineRule="auto"/>
+      </w:pPr>
+      <w:proofErr w:type="spellStart"/>
+      <w:r>
+        <w:rPr>
+          <w:b/>
+          <w:bCs/>
+        </w:rPr>
+        <w:t>AmortizacionController</w:t>
+      </w:r>
+      <w:proofErr w:type="spellEnd"/>
+      <w:r>
+        <w:t> - CRUD completo con relaciones</w:t>
+      </w:r>
+    </w:p>
+    <w:p>
+      <w:pPr>
+        <w:numPr>
+          <w:ilvl w:val="0"/>
+          <w:numId w:val="55"/>
+        </w:numPr>
+        <w:spacing w:after="0" w:line="240" w:lineRule="auto"/>
+      </w:pPr>
+      <w:r>
+        <w:rPr>
+          <w:b/>
+          <w:bCs/>
+        </w:rPr>
+        <w:t>Rutas API</w:t>
+      </w:r>
+      <w:r>
+        <w:t> - /api/amortizaciones y /api/amortizaciones/</w:t>
+      </w:r>
+      <w:proofErr w:type="spellStart"/>
+      <w:r>
+        <w:t>inversion</w:t>
+      </w:r>
+      <w:proofErr w:type="spellEnd"/>
+      <w:r>
+        <w:t>/{id}</w:t>
+      </w:r>
+    </w:p>
+    <w:p>
+      <w:pPr>
+        <w:numPr>
+          <w:ilvl w:val="0"/>
+          <w:numId w:val="10"/>
+        </w:numPr>
+        <w:tabs>
+          <w:tab w:val="clear" w:pos="720"/>
+          <w:tab w:val="num" w:pos="360"/>
+        </w:tabs>
+        <w:spacing w:after="0" w:line="240" w:lineRule="auto"/>
+        <w:rPr>
+          <w:b/>
+          <w:bCs/>
+        </w:rPr>
+      </w:pPr>
+      <w:proofErr w:type="spellStart"/>
+      <w:r>
+        <w:rPr>
+          <w:b/>
+          <w:bCs/>
+        </w:rPr>
+        <w:t>Frontend</w:t>
+      </w:r>
+      <w:proofErr w:type="spellEnd"/>
+      <w:r>
+        <w:rPr>
+          <w:b/>
+          <w:bCs/>
+        </w:rPr>
+        <w:t>:</w:t>
+      </w:r>
+    </w:p>
+    <w:p>
+      <w:pPr>
+        <w:numPr>
+          <w:ilvl w:val="0"/>
+          <w:numId w:val="56"/>
+        </w:numPr>
+        <w:spacing w:after="0" w:line="240" w:lineRule="auto"/>
+      </w:pPr>
+      <w:proofErr w:type="spellStart"/>
+      <w:r>
+        <w:rPr>
+          <w:b/>
+          <w:bCs/>
+        </w:rPr>
+        <w:t>AmortizacionService</w:t>
+      </w:r>
+      <w:proofErr w:type="spellEnd"/>
+      <w:r>
+        <w:t> - Servicio para comunicación con API</w:t>
+      </w:r>
+    </w:p>
+    <w:p>
+      <w:pPr>
+        <w:numPr>
+          <w:ilvl w:val="0"/>
+          <w:numId w:val="56"/>
+        </w:numPr>
+        <w:spacing w:after="0" w:line="240" w:lineRule="auto"/>
+      </w:pPr>
+      <w:proofErr w:type="spellStart"/>
+      <w:r>
+        <w:rPr>
+          <w:b/>
+          <w:bCs/>
+        </w:rPr>
+        <w:t>AmortizacionListComponent</w:t>
+      </w:r>
+      <w:proofErr w:type="spellEnd"/>
+      <w:r>
+        <w:t> - Componente completo con:</w:t>
+      </w:r>
+    </w:p>
+    <w:p>
+      <w:pPr>
+        <w:numPr>
+          <w:ilvl w:val="1"/>
+          <w:numId w:val="56"/>
+        </w:numPr>
+        <w:spacing w:after="0" w:line="240" w:lineRule="auto"/>
+      </w:pPr>
+      <w:r>
+        <w:t>Listado paginado y filtrable</w:t>
+      </w:r>
+    </w:p>
+    <w:p>
+      <w:pPr>
+        <w:numPr>
+          <w:ilvl w:val="1"/>
+          <w:numId w:val="56"/>
+        </w:numPr>
+        <w:spacing w:after="0" w:line="240" w:lineRule="auto"/>
+      </w:pPr>
+      <w:r>
+        <w:t>Modal para crear/editar usando </w:t>
+      </w:r>
+      <w:proofErr w:type="spellStart"/>
+      <w:r>
+        <w:t>ModalActionsComponent</w:t>
+      </w:r>
+      <w:proofErr w:type="spellEnd"/>
+    </w:p>
+    <w:p>
+      <w:pPr>
+        <w:numPr>
+          <w:ilvl w:val="1"/>
+          <w:numId w:val="56"/>
+        </w:numPr>
+        <w:spacing w:after="0" w:line="240" w:lineRule="auto"/>
+      </w:pPr>
+      <w:r>
+        <w:t>Formato de moneda y fechas</w:t>
+      </w:r>
+    </w:p>
+    <w:p>
+      <w:pPr>
+        <w:numPr>
+          <w:ilvl w:val="1"/>
+          <w:numId w:val="56"/>
+        </w:numPr>
+        <w:spacing w:after="0" w:line="240" w:lineRule="auto"/>
+      </w:pPr>
+      <w:r>
+        <w:t>Tags de estado con colores</w:t>
+      </w:r>
+    </w:p>
+    <w:p>
+      <w:pPr>
+        <w:numPr>
+          <w:ilvl w:val="1"/>
+          <w:numId w:val="56"/>
+        </w:numPr>
+        <w:spacing w:after="0" w:line="240" w:lineRule="auto"/>
+      </w:pPr>
+      <w:r>
+        <w:t>Botones de acción</w:t>
+      </w:r>
+    </w:p>
+    <w:p>
+      <w:pPr>
+        <w:numPr>
+          <w:ilvl w:val="0"/>
+          <w:numId w:val="56"/>
+        </w:numPr>
+        <w:spacing w:after="0" w:line="240" w:lineRule="auto"/>
+      </w:pPr>
+      <w:proofErr w:type="spellStart"/>
+      <w:r>
+        <w:rPr>
+          <w:b/>
+          <w:bCs/>
+        </w:rPr>
+        <w:t>Routing</w:t>
+      </w:r>
+      <w:proofErr w:type="spellEnd"/>
+      <w:r>
+        <w:t> - Agregada ruta /amortizaciones</w:t>
+      </w:r>
+    </w:p>
+    <w:p>
+      <w:pPr>
+        <w:numPr>
+          <w:ilvl w:val="0"/>
+          <w:numId w:val="56"/>
+        </w:numPr>
+        <w:spacing w:after="0" w:line="240" w:lineRule="auto"/>
+      </w:pPr>
+      <w:r>
+        <w:rPr>
+          <w:b/>
+          <w:bCs/>
+        </w:rPr>
+        <w:t>Menú</w:t>
+      </w:r>
+      <w:r>
+        <w:t xml:space="preserve"> - Ya está configurado en el </w:t>
+      </w:r>
+      <w:proofErr w:type="spellStart"/>
+      <w:r>
+        <w:t>sidebar</w:t>
+      </w:r>
+      <w:proofErr w:type="spellEnd"/>
+      <w:r>
+        <w:t xml:space="preserve"> bajo "Inversiones"</w:t>
+      </w:r>
+    </w:p>
+    <w:p>
+      <w:pPr>
+        <w:numPr>
+          <w:ilvl w:val="0"/>
+          <w:numId w:val="10"/>
+        </w:numPr>
+        <w:tabs>
+          <w:tab w:val="clear" w:pos="720"/>
+          <w:tab w:val="num" w:pos="360"/>
+        </w:tabs>
+        <w:spacing w:after="0" w:line="240" w:lineRule="auto"/>
+        <w:rPr>
+          <w:b/>
+          <w:bCs/>
+        </w:rPr>
+      </w:pPr>
+      <w:r>
+        <w:rPr>
+          <w:b/>
+          <w:bCs/>
+        </w:rPr>
+        <w:t>Características implementadas:</w:t>
+      </w:r>
+    </w:p>
+    <w:p>
+      <w:pPr>
+        <w:numPr>
+          <w:ilvl w:val="0"/>
+          <w:numId w:val="57"/>
+        </w:numPr>
+        <w:spacing w:after="0" w:line="240" w:lineRule="auto"/>
+      </w:pPr>
+      <w:r>
+        <w:rPr>
+          <w:rFonts w:ascii="Segoe UI Emoji" w:hAnsi="Segoe UI Emoji" w:cs="Segoe UI Emoji"/>
+        </w:rPr>
+        <w:t>✅</w:t>
+      </w:r>
+      <w:r>
+        <w:t xml:space="preserve"> Listado de amortizaciones con paginación</w:t>
+      </w:r>
+    </w:p>
+    <w:p>
+      <w:pPr>
+        <w:numPr>
+          <w:ilvl w:val="0"/>
+          <w:numId w:val="57"/>
+        </w:numPr>
+        <w:spacing w:after="0" w:line="240" w:lineRule="auto"/>
+      </w:pPr>
+      <w:r>
+        <w:rPr>
+          <w:rFonts w:ascii="Segoe UI Emoji" w:hAnsi="Segoe UI Emoji" w:cs="Segoe UI Emoji"/>
+        </w:rPr>
+        <w:lastRenderedPageBreak/>
+        <w:t>✅</w:t>
+      </w:r>
+      <w:r>
+        <w:t xml:space="preserve"> Filtros por inversión, estado, rango de fechas</w:t>
+      </w:r>
+    </w:p>
+    <w:p>
+      <w:pPr>
+        <w:numPr>
+          <w:ilvl w:val="0"/>
+          <w:numId w:val="57"/>
+        </w:numPr>
+        <w:spacing w:after="0" w:line="240" w:lineRule="auto"/>
+      </w:pPr>
+      <w:r>
+        <w:rPr>
+          <w:rFonts w:ascii="Segoe UI Emoji" w:hAnsi="Segoe UI Emoji" w:cs="Segoe UI Emoji"/>
+        </w:rPr>
+        <w:t>✅</w:t>
+      </w:r>
+      <w:r>
+        <w:t xml:space="preserve"> Columnas: </w:t>
+      </w:r>
+      <w:proofErr w:type="spellStart"/>
+      <w:r>
+        <w:t>N°</w:t>
+      </w:r>
+      <w:proofErr w:type="spellEnd"/>
+      <w:r>
+        <w:t xml:space="preserve"> Cuota, Fecha Pago, Interés, Capital, Descuento, Total, </w:t>
+      </w:r>
+      <w:proofErr w:type="spellStart"/>
+      <w:r>
+        <w:t>Int</w:t>
+      </w:r>
+      <w:proofErr w:type="spellEnd"/>
+      <w:r>
+        <w:t>. Parcial, Retención, Estado, Pagada</w:t>
+      </w:r>
+    </w:p>
+    <w:p>
+      <w:pPr>
+        <w:numPr>
+          <w:ilvl w:val="0"/>
+          <w:numId w:val="57"/>
+        </w:numPr>
+        <w:spacing w:after="0" w:line="240" w:lineRule="auto"/>
+      </w:pPr>
+      <w:r>
+        <w:rPr>
+          <w:rFonts w:ascii="Segoe UI Emoji" w:hAnsi="Segoe UI Emoji" w:cs="Segoe UI Emoji"/>
+        </w:rPr>
+        <w:t>✅</w:t>
+      </w:r>
+      <w:r>
+        <w:t xml:space="preserve"> Formulario de creación/edición</w:t>
+      </w:r>
+    </w:p>
+    <w:p>
+      <w:pPr>
+        <w:numPr>
+          <w:ilvl w:val="0"/>
+          <w:numId w:val="57"/>
+        </w:numPr>
+        <w:spacing w:after="0" w:line="240" w:lineRule="auto"/>
+      </w:pPr>
+      <w:r>
+        <w:rPr>
+          <w:rFonts w:ascii="Segoe UI Emoji" w:hAnsi="Segoe UI Emoji" w:cs="Segoe UI Emoji"/>
+        </w:rPr>
+        <w:t>✅</w:t>
+      </w:r>
+      <w:r>
+        <w:t xml:space="preserve"> Botones estandarizados con </w:t>
+      </w:r>
+      <w:proofErr w:type="spellStart"/>
+      <w:r>
+        <w:t>ModalActionsComponent</w:t>
+      </w:r>
+      <w:proofErr w:type="spellEnd"/>
+    </w:p>
+    <w:p>
+      <w:pPr>
+        <w:numPr>
+          <w:ilvl w:val="0"/>
+          <w:numId w:val="57"/>
+        </w:numPr>
+        <w:spacing w:after="0" w:line="240" w:lineRule="auto"/>
+      </w:pPr>
+      <w:r>
+        <w:rPr>
+          <w:rFonts w:ascii="Segoe UI Emoji" w:hAnsi="Segoe UI Emoji" w:cs="Segoe UI Emoji"/>
+        </w:rPr>
+        <w:t>✅</w:t>
+      </w:r>
+      <w:r>
+        <w:t xml:space="preserve"> Formato de moneda y fechas</w:t>
+      </w:r>
+    </w:p>
+    <w:p>
+      <w:pPr>
+        <w:numPr>
+          <w:ilvl w:val="0"/>
+          <w:numId w:val="57"/>
+        </w:numPr>
+        <w:spacing w:after="0" w:line="240" w:lineRule="auto"/>
+      </w:pPr>
+      <w:r>
+        <w:rPr>
+          <w:rFonts w:ascii="Segoe UI Emoji" w:hAnsi="Segoe UI Emoji" w:cs="Segoe UI Emoji"/>
+        </w:rPr>
+        <w:t>✅</w:t>
+      </w:r>
+      <w:r>
+        <w:t xml:space="preserve"> Tags de estado con colores</w:t>
+      </w:r>
+    </w:p>
+    <w:p>
+      <w:pPr>
+        <w:numPr>
+          <w:ilvl w:val="0"/>
+          <w:numId w:val="57"/>
+        </w:numPr>
+        <w:spacing w:after="0" w:line="240" w:lineRule="auto"/>
+      </w:pPr>
+      <w:r>
+        <w:rPr>
+          <w:rFonts w:ascii="Segoe UI Emoji" w:hAnsi="Segoe UI Emoji" w:cs="Segoe UI Emoji"/>
+        </w:rPr>
+        <w:t>✅</w:t>
+      </w:r>
+      <w:r>
+        <w:t xml:space="preserve"> </w:t>
+      </w:r>
+      <w:proofErr w:type="spellStart"/>
+      <w:r>
+        <w:t>Soft</w:t>
+      </w:r>
+      <w:proofErr w:type="spellEnd"/>
+      <w:r>
+        <w:t xml:space="preserve"> </w:t>
+      </w:r>
+      <w:proofErr w:type="spellStart"/>
+      <w:r>
+        <w:t>delete</w:t>
+      </w:r>
+      <w:proofErr w:type="spellEnd"/>
+    </w:p>
+    <w:p>
+      <w:pPr>
+        <w:numPr>
+          <w:ilvl w:val="0"/>
+          <w:numId w:val="57"/>
+        </w:numPr>
+        <w:spacing w:after="0" w:line="240" w:lineRule="auto"/>
+      </w:pPr>
+      <w:r>
+        <w:rPr>
+          <w:rFonts w:ascii="Segoe UI Emoji" w:hAnsi="Segoe UI Emoji" w:cs="Segoe UI Emoji"/>
+        </w:rPr>
+        <w:t>✅</w:t>
+      </w:r>
+      <w:r>
+        <w:t xml:space="preserve"> Relaciones con inversiones y catálogos</w:t>
+      </w:r>
+    </w:p>
+    <w:p>
+      <w:pPr>
+        <w:spacing w:after="0" w:line="240" w:lineRule="auto"/>
+      </w:pPr>
+      <w:r>
+        <w:t>El módulo está listo para usar. Puedes acceder a través del menú "Inversiones → Amortizaciones" o directamente en /amortizaciones.</w:t>
+      </w:r>
+    </w:p>
+    <w:p>
+      <w:pPr>
+        <w:spacing w:after="0" w:line="240" w:lineRule="auto"/>
+      </w:pPr>
     </w:p>
     <w:sectPr>
       <w:pgSz w:w="11906" w:h="16838"/>
@@ -5852,6 +7124,119 @@
     </w:lvl>
   </w:abstractNum>
   <w:abstractNum w:abstractNumId="1" w15:restartNumberingAfterBreak="0">
+    <w:nsid w:val="02F22EA1"/>
+    <w:multiLevelType w:val="multilevel"/>
+    <w:tmpl w:val="3AE8340C"/>
+    <w:lvl w:ilvl="0">
+      <w:start w:val="1"/>
+      <w:numFmt w:val="decimal"/>
+      <w:lvlText w:val="%1."/>
+      <w:lvlJc w:val="left"/>
+      <w:pPr>
+        <w:tabs>
+          <w:tab w:val="num" w:pos="720"/>
+        </w:tabs>
+        <w:ind w:left="720" w:hanging="360"/>
+      </w:pPr>
+    </w:lvl>
+    <w:lvl w:ilvl="1" w:tentative="1">
+      <w:start w:val="1"/>
+      <w:numFmt w:val="decimal"/>
+      <w:lvlText w:val="%2."/>
+      <w:lvlJc w:val="left"/>
+      <w:pPr>
+        <w:tabs>
+          <w:tab w:val="num" w:pos="1440"/>
+        </w:tabs>
+        <w:ind w:left="1440" w:hanging="360"/>
+      </w:pPr>
+    </w:lvl>
+    <w:lvl w:ilvl="2" w:tentative="1">
+      <w:start w:val="1"/>
+      <w:numFmt w:val="decimal"/>
+      <w:lvlText w:val="%3."/>
+      <w:lvlJc w:val="left"/>
+      <w:pPr>
+        <w:tabs>
+          <w:tab w:val="num" w:pos="2160"/>
+        </w:tabs>
+        <w:ind w:left="2160" w:hanging="360"/>
+      </w:pPr>
+    </w:lvl>
+    <w:lvl w:ilvl="3" w:tentative="1">
+      <w:start w:val="1"/>
+      <w:numFmt w:val="decimal"/>
+      <w:lvlText w:val="%4."/>
+      <w:lvlJc w:val="left"/>
+      <w:pPr>
+        <w:tabs>
+          <w:tab w:val="num" w:pos="2880"/>
+        </w:tabs>
+        <w:ind w:left="2880" w:hanging="360"/>
+      </w:pPr>
+    </w:lvl>
+    <w:lvl w:ilvl="4" w:tentative="1">
+      <w:start w:val="1"/>
+      <w:numFmt w:val="decimal"/>
+      <w:lvlText w:val="%5."/>
+      <w:lvlJc w:val="left"/>
+      <w:pPr>
+        <w:tabs>
+          <w:tab w:val="num" w:pos="3600"/>
+        </w:tabs>
+        <w:ind w:left="3600" w:hanging="360"/>
+      </w:pPr>
+    </w:lvl>
+    <w:lvl w:ilvl="5" w:tentative="1">
+      <w:start w:val="1"/>
+      <w:numFmt w:val="decimal"/>
+      <w:lvlText w:val="%6."/>
+      <w:lvlJc w:val="left"/>
+      <w:pPr>
+        <w:tabs>
+          <w:tab w:val="num" w:pos="4320"/>
+        </w:tabs>
+        <w:ind w:left="4320" w:hanging="360"/>
+      </w:pPr>
+    </w:lvl>
+    <w:lvl w:ilvl="6" w:tentative="1">
+      <w:start w:val="1"/>
+      <w:numFmt w:val="decimal"/>
+      <w:lvlText w:val="%7."/>
+      <w:lvlJc w:val="left"/>
+      <w:pPr>
+        <w:tabs>
+          <w:tab w:val="num" w:pos="5040"/>
+        </w:tabs>
+        <w:ind w:left="5040" w:hanging="360"/>
+      </w:pPr>
+    </w:lvl>
+    <w:lvl w:ilvl="7" w:tentative="1">
+      <w:start w:val="1"/>
+      <w:numFmt w:val="decimal"/>
+      <w:lvlText w:val="%8."/>
+      <w:lvlJc w:val="left"/>
+      <w:pPr>
+        <w:tabs>
+          <w:tab w:val="num" w:pos="5760"/>
+        </w:tabs>
+        <w:ind w:left="5760" w:hanging="360"/>
+      </w:pPr>
+    </w:lvl>
+    <w:lvl w:ilvl="8" w:tentative="1">
+      <w:start w:val="1"/>
+      <w:numFmt w:val="decimal"/>
+      <w:lvlText w:val="%9."/>
+      <w:lvlJc w:val="left"/>
+      <w:pPr>
+        <w:tabs>
+          <w:tab w:val="num" w:pos="6480"/>
+        </w:tabs>
+        <w:ind w:left="6480" w:hanging="360"/>
+      </w:pPr>
+    </w:lvl>
+  </w:abstractNum>
+  <w:abstractNum w:abstractNumId="2" w15:restartNumberingAfterBreak="0">
     <w:nsid w:val="078350FA"/>
     <w:multiLevelType w:val="multilevel"/>
     <w:tmpl w:val="9BC20AF6"/>
@@ -6000,7 +7385,7 @@
       </w:rPr>
     </w:lvl>
   </w:abstractNum>
-  <w:abstractNum w:abstractNumId="2" w15:restartNumberingAfterBreak="0">
+  <w:abstractNum w:abstractNumId="3" w15:restartNumberingAfterBreak="0">
     <w:nsid w:val="0A004243"/>
     <w:multiLevelType w:val="multilevel"/>
     <w:tmpl w:val="79A0936A"/>
@@ -6113,7 +7498,7 @@
       </w:pPr>
     </w:lvl>
   </w:abstractNum>
-  <w:abstractNum w:abstractNumId="3" w15:restartNumberingAfterBreak="0">
+  <w:abstractNum w:abstractNumId="4" w15:restartNumberingAfterBreak="0">
     <w:nsid w:val="0AE6547E"/>
     <w:multiLevelType w:val="multilevel"/>
     <w:tmpl w:val="6846A23A"/>
@@ -6262,7 +7647,7 @@
       </w:rPr>
     </w:lvl>
   </w:abstractNum>
-  <w:abstractNum w:abstractNumId="4" w15:restartNumberingAfterBreak="0">
+  <w:abstractNum w:abstractNumId="5" w15:restartNumberingAfterBreak="0">
     <w:nsid w:val="0B0318D1"/>
     <w:multiLevelType w:val="multilevel"/>
     <w:tmpl w:val="7A080088"/>
@@ -6375,7 +7760,7 @@
       </w:pPr>
     </w:lvl>
   </w:abstractNum>
-  <w:abstractNum w:abstractNumId="5" w15:restartNumberingAfterBreak="0">
+  <w:abstractNum w:abstractNumId="6" w15:restartNumberingAfterBreak="0">
     <w:nsid w:val="0DAD632A"/>
     <w:multiLevelType w:val="multilevel"/>
     <w:tmpl w:val="268C4BFA"/>
@@ -6524,7 +7909,7 @@
       </w:rPr>
     </w:lvl>
   </w:abstractNum>
-  <w:abstractNum w:abstractNumId="6" w15:restartNumberingAfterBreak="0">
+  <w:abstractNum w:abstractNumId="7" w15:restartNumberingAfterBreak="0">
     <w:nsid w:val="0E5745B8"/>
     <w:multiLevelType w:val="multilevel"/>
     <w:tmpl w:val="AF4A1808"/>
@@ -6637,7 +8022,7 @@
       </w:pPr>
     </w:lvl>
   </w:abstractNum>
-  <w:abstractNum w:abstractNumId="7" w15:restartNumberingAfterBreak="0">
+  <w:abstractNum w:abstractNumId="8" w15:restartNumberingAfterBreak="0">
     <w:nsid w:val="13BF333E"/>
     <w:multiLevelType w:val="multilevel"/>
     <w:tmpl w:val="294CBFC6"/>
@@ -6786,7 +8171,7 @@
       </w:rPr>
     </w:lvl>
   </w:abstractNum>
-  <w:abstractNum w:abstractNumId="8" w15:restartNumberingAfterBreak="0">
+  <w:abstractNum w:abstractNumId="9" w15:restartNumberingAfterBreak="0">
     <w:nsid w:val="14D573BE"/>
     <w:multiLevelType w:val="multilevel"/>
     <w:tmpl w:val="1256E958"/>
@@ -6935,7 +8320,7 @@
       </w:rPr>
     </w:lvl>
   </w:abstractNum>
-  <w:abstractNum w:abstractNumId="9" w15:restartNumberingAfterBreak="0">
+  <w:abstractNum w:abstractNumId="10" w15:restartNumberingAfterBreak="0">
     <w:nsid w:val="14D73988"/>
     <w:multiLevelType w:val="multilevel"/>
     <w:tmpl w:val="2012C62A"/>
@@ -7021,7 +8406,7 @@
       </w:pPr>
     </w:lvl>
   </w:abstractNum>
-  <w:abstractNum w:abstractNumId="10" w15:restartNumberingAfterBreak="0">
+  <w:abstractNum w:abstractNumId="11" w15:restartNumberingAfterBreak="0">
     <w:nsid w:val="1A34041A"/>
     <w:multiLevelType w:val="multilevel"/>
     <w:tmpl w:val="1FF45668"/>
@@ -7170,7 +8555,7 @@
       </w:rPr>
     </w:lvl>
   </w:abstractNum>
-  <w:abstractNum w:abstractNumId="11" w15:restartNumberingAfterBreak="0">
+  <w:abstractNum w:abstractNumId="12" w15:restartNumberingAfterBreak="0">
     <w:nsid w:val="1AA600F3"/>
     <w:multiLevelType w:val="multilevel"/>
     <w:tmpl w:val="AD5E5BBC"/>
@@ -7258,7 +8643,7 @@
       </w:pPr>
     </w:lvl>
   </w:abstractNum>
-  <w:abstractNum w:abstractNumId="12" w15:restartNumberingAfterBreak="0">
+  <w:abstractNum w:abstractNumId="13" w15:restartNumberingAfterBreak="0">
     <w:nsid w:val="23CE53C7"/>
     <w:multiLevelType w:val="multilevel"/>
     <w:tmpl w:val="667879D4"/>
@@ -7371,7 +8756,7 @@
       </w:pPr>
     </w:lvl>
   </w:abstractNum>
-  <w:abstractNum w:abstractNumId="13" w15:restartNumberingAfterBreak="0">
+  <w:abstractNum w:abstractNumId="14" w15:restartNumberingAfterBreak="0">
     <w:nsid w:val="278559B4"/>
     <w:multiLevelType w:val="multilevel"/>
     <w:tmpl w:val="3368A96E"/>
@@ -7520,7 +8905,7 @@
       </w:rPr>
     </w:lvl>
   </w:abstractNum>
-  <w:abstractNum w:abstractNumId="14" w15:restartNumberingAfterBreak="0">
+  <w:abstractNum w:abstractNumId="15" w15:restartNumberingAfterBreak="0">
     <w:nsid w:val="2B29706E"/>
     <w:multiLevelType w:val="multilevel"/>
     <w:tmpl w:val="EC0E537E"/>
@@ -7633,7 +9018,156 @@
       </w:pPr>
     </w:lvl>
   </w:abstractNum>
-  <w:abstractNum w:abstractNumId="15" w15:restartNumberingAfterBreak="0">
+  <w:abstractNum w:abstractNumId="16" w15:restartNumberingAfterBreak="0">
+    <w:nsid w:val="2CAB5DF1"/>
+    <w:multiLevelType w:val="multilevel"/>
+    <w:tmpl w:val="47504734"/>
+    <w:lvl w:ilvl="0">
+      <w:start w:val="1"/>
+      <w:numFmt w:val="bullet"/>
+      <w:lvlText w:val=""/>
+      <w:lvlJc w:val="left"/>
+      <w:pPr>
+        <w:tabs>
+          <w:tab w:val="num" w:pos="720"/>
+        </w:tabs>
+        <w:ind w:left="720" w:hanging="360"/>
+      </w:pPr>
+      <w:rPr>
+        <w:rFonts w:ascii="Symbol" w:hAnsi="Symbol" w:hint="default"/>
+        <w:sz w:val="20"/>
+      </w:rPr>
+    </w:lvl>
+    <w:lvl w:ilvl="1" w:tentative="1">
+      <w:start w:val="1"/>
+      <w:numFmt w:val="bullet"/>
+      <w:lvlText w:val=""/>
+      <w:lvlJc w:val="left"/>
+      <w:pPr>
+        <w:tabs>
+          <w:tab w:val="num" w:pos="1440"/>
+        </w:tabs>
+        <w:ind w:left="1440" w:hanging="360"/>
+      </w:pPr>
+      <w:rPr>
+        <w:rFonts w:ascii="Symbol" w:hAnsi="Symbol" w:hint="default"/>
+        <w:sz w:val="20"/>
+      </w:rPr>
+    </w:lvl>
+    <w:lvl w:ilvl="2" w:tentative="1">
+      <w:start w:val="1"/>
+      <w:numFmt w:val="bullet"/>
+      <w:lvlText w:val=""/>
+      <w:lvlJc w:val="left"/>
+      <w:pPr>
+        <w:tabs>
+          <w:tab w:val="num" w:pos="2160"/>
+        </w:tabs>
+        <w:ind w:left="2160" w:hanging="360"/>
+      </w:pPr>
+      <w:rPr>
+        <w:rFonts w:ascii="Symbol" w:hAnsi="Symbol" w:hint="default"/>
+        <w:sz w:val="20"/>
+      </w:rPr>
+    </w:lvl>
+    <w:lvl w:ilvl="3" w:tentative="1">
+      <w:start w:val="1"/>
+      <w:numFmt w:val="bullet"/>
+      <w:lvlText w:val=""/>
+      <w:lvlJc w:val="left"/>
+      <w:pPr>
+        <w:tabs>
+          <w:tab w:val="num" w:pos="2880"/>
+        </w:tabs>
+        <w:ind w:left="2880" w:hanging="360"/>
+      </w:pPr>
+      <w:rPr>
+        <w:rFonts w:ascii="Symbol" w:hAnsi="Symbol" w:hint="default"/>
+        <w:sz w:val="20"/>
+      </w:rPr>
+    </w:lvl>
+    <w:lvl w:ilvl="4" w:tentative="1">
+      <w:start w:val="1"/>
+      <w:numFmt w:val="bullet"/>
+      <w:lvlText w:val=""/>
+      <w:lvlJc w:val="left"/>
+      <w:pPr>
+        <w:tabs>
+          <w:tab w:val="num" w:pos="3600"/>
+        </w:tabs>
+        <w:ind w:left="3600" w:hanging="360"/>
+      </w:pPr>
+      <w:rPr>
+        <w:rFonts w:ascii="Symbol" w:hAnsi="Symbol" w:hint="default"/>
+        <w:sz w:val="20"/>
+      </w:rPr>
+    </w:lvl>
+    <w:lvl w:ilvl="5" w:tentative="1">
+      <w:start w:val="1"/>
+      <w:numFmt w:val="bullet"/>
+      <w:lvlText w:val=""/>
+      <w:lvlJc w:val="left"/>
+      <w:pPr>
+        <w:tabs>
+          <w:tab w:val="num" w:pos="4320"/>
+        </w:tabs>
+        <w:ind w:left="4320" w:hanging="360"/>
+      </w:pPr>
+      <w:rPr>
+        <w:rFonts w:ascii="Symbol" w:hAnsi="Symbol" w:hint="default"/>
+        <w:sz w:val="20"/>
+      </w:rPr>
+    </w:lvl>
+    <w:lvl w:ilvl="6" w:tentative="1">
+      <w:start w:val="1"/>
+      <w:numFmt w:val="bullet"/>
+      <w:lvlText w:val=""/>
+      <w:lvlJc w:val="left"/>
+      <w:pPr>
+        <w:tabs>
+          <w:tab w:val="num" w:pos="5040"/>
+        </w:tabs>
+        <w:ind w:left="5040" w:hanging="360"/>
+      </w:pPr>
+      <w:rPr>
+        <w:rFonts w:ascii="Symbol" w:hAnsi="Symbol" w:hint="default"/>
+        <w:sz w:val="20"/>
+      </w:rPr>
+    </w:lvl>
+    <w:lvl w:ilvl="7" w:tentative="1">
+      <w:start w:val="1"/>
+      <w:numFmt w:val="bullet"/>
+      <w:lvlText w:val=""/>
+      <w:lvlJc w:val="left"/>
+      <w:pPr>
+        <w:tabs>
+          <w:tab w:val="num" w:pos="5760"/>
+        </w:tabs>
+        <w:ind w:left="5760" w:hanging="360"/>
+      </w:pPr>
+      <w:rPr>
+        <w:rFonts w:ascii="Symbol" w:hAnsi="Symbol" w:hint="default"/>
+        <w:sz w:val="20"/>
+      </w:rPr>
+    </w:lvl>
+    <w:lvl w:ilvl="8" w:tentative="1">
+      <w:start w:val="1"/>
+      <w:numFmt w:val="bullet"/>
+      <w:lvlText w:val=""/>
+      <w:lvlJc w:val="left"/>
+      <w:pPr>
+        <w:tabs>
+          <w:tab w:val="num" w:pos="6480"/>
+        </w:tabs>
+        <w:ind w:left="6480" w:hanging="360"/>
+      </w:pPr>
+      <w:rPr>
+        <w:rFonts w:ascii="Symbol" w:hAnsi="Symbol" w:hint="default"/>
+        <w:sz w:val="20"/>
+      </w:rPr>
+    </w:lvl>
+  </w:abstractNum>
+  <w:abstractNum w:abstractNumId="17" w15:restartNumberingAfterBreak="0">
     <w:nsid w:val="2EBD3824"/>
     <w:multiLevelType w:val="multilevel"/>
     <w:tmpl w:val="FF2E27D4"/>
@@ -7782,7 +9316,7 @@
       </w:rPr>
     </w:lvl>
   </w:abstractNum>
-  <w:abstractNum w:abstractNumId="16" w15:restartNumberingAfterBreak="0">
+  <w:abstractNum w:abstractNumId="18" w15:restartNumberingAfterBreak="0">
     <w:nsid w:val="304C1262"/>
     <w:multiLevelType w:val="multilevel"/>
     <w:tmpl w:val="BC2C63D2"/>
@@ -7895,7 +9429,7 @@
       </w:pPr>
     </w:lvl>
   </w:abstractNum>
-  <w:abstractNum w:abstractNumId="17" w15:restartNumberingAfterBreak="0">
+  <w:abstractNum w:abstractNumId="19" w15:restartNumberingAfterBreak="0">
     <w:nsid w:val="30B977EC"/>
     <w:multiLevelType w:val="multilevel"/>
     <w:tmpl w:val="159A3530"/>
@@ -7981,7 +9515,7 @@
       </w:pPr>
     </w:lvl>
   </w:abstractNum>
-  <w:abstractNum w:abstractNumId="18" w15:restartNumberingAfterBreak="0">
+  <w:abstractNum w:abstractNumId="20" w15:restartNumberingAfterBreak="0">
     <w:nsid w:val="327C0F1F"/>
     <w:multiLevelType w:val="multilevel"/>
     <w:tmpl w:val="78D28CD2"/>
@@ -8098,7 +9632,7 @@
       </w:pPr>
     </w:lvl>
   </w:abstractNum>
-  <w:abstractNum w:abstractNumId="19" w15:restartNumberingAfterBreak="0">
+  <w:abstractNum w:abstractNumId="21" w15:restartNumberingAfterBreak="0">
     <w:nsid w:val="36E36430"/>
     <w:multiLevelType w:val="multilevel"/>
     <w:tmpl w:val="B27E1E5C"/>
@@ -8247,7 +9781,7 @@
       </w:rPr>
     </w:lvl>
   </w:abstractNum>
-  <w:abstractNum w:abstractNumId="20" w15:restartNumberingAfterBreak="0">
+  <w:abstractNum w:abstractNumId="22" w15:restartNumberingAfterBreak="0">
     <w:nsid w:val="3944229B"/>
     <w:multiLevelType w:val="multilevel"/>
     <w:tmpl w:val="B16CF786"/>
@@ -8360,7 +9894,7 @@
       </w:pPr>
     </w:lvl>
   </w:abstractNum>
-  <w:abstractNum w:abstractNumId="21" w15:restartNumberingAfterBreak="0">
+  <w:abstractNum w:abstractNumId="23" w15:restartNumberingAfterBreak="0">
     <w:nsid w:val="3AA05221"/>
     <w:multiLevelType w:val="multilevel"/>
     <w:tmpl w:val="057CAD90"/>
@@ -8473,7 +10007,7 @@
       </w:pPr>
     </w:lvl>
   </w:abstractNum>
-  <w:abstractNum w:abstractNumId="22" w15:restartNumberingAfterBreak="0">
+  <w:abstractNum w:abstractNumId="24" w15:restartNumberingAfterBreak="0">
     <w:nsid w:val="3CBB1D0D"/>
     <w:multiLevelType w:val="multilevel"/>
     <w:tmpl w:val="77F8F694"/>
@@ -8622,7 +10156,124 @@
       </w:rPr>
     </w:lvl>
   </w:abstractNum>
-  <w:abstractNum w:abstractNumId="23" w15:restartNumberingAfterBreak="0">
+  <w:abstractNum w:abstractNumId="25" w15:restartNumberingAfterBreak="0">
+    <w:nsid w:val="3DF809D4"/>
+    <w:multiLevelType w:val="multilevel"/>
+    <w:tmpl w:val="84D43534"/>
+    <w:lvl w:ilvl="0">
+      <w:start w:val="1"/>
+      <w:numFmt w:val="decimal"/>
+      <w:lvlText w:val="%1."/>
+      <w:lvlJc w:val="left"/>
+      <w:pPr>
+        <w:tabs>
+          <w:tab w:val="num" w:pos="720"/>
+        </w:tabs>
+        <w:ind w:left="720" w:hanging="360"/>
+      </w:pPr>
+    </w:lvl>
+    <w:lvl w:ilvl="1">
+      <w:start w:val="1"/>
+      <w:numFmt w:val="bullet"/>
+      <w:lvlText w:val=""/>
+      <w:lvlJc w:val="left"/>
+      <w:pPr>
+        <w:tabs>
+          <w:tab w:val="num" w:pos="1440"/>
+        </w:tabs>
+        <w:ind w:left="1440" w:hanging="360"/>
+      </w:pPr>
+      <w:rPr>
+        <w:rFonts w:ascii="Symbol" w:hAnsi="Symbol" w:hint="default"/>
+        <w:sz w:val="20"/>
+      </w:rPr>
+    </w:lvl>
+    <w:lvl w:ilvl="2" w:tentative="1">
+      <w:start w:val="1"/>
+      <w:numFmt w:val="decimal"/>
+      <w:lvlText w:val="%3."/>
+      <w:lvlJc w:val="left"/>
+      <w:pPr>
+        <w:tabs>
+          <w:tab w:val="num" w:pos="2160"/>
+        </w:tabs>
+        <w:ind w:left="2160" w:hanging="360"/>
+      </w:pPr>
+    </w:lvl>
+    <w:lvl w:ilvl="3" w:tentative="1">
+      <w:start w:val="1"/>
+      <w:numFmt w:val="decimal"/>
+      <w:lvlText w:val="%4."/>
+      <w:lvlJc w:val="left"/>
+      <w:pPr>
+        <w:tabs>
+          <w:tab w:val="num" w:pos="2880"/>
+        </w:tabs>
+        <w:ind w:left="2880" w:hanging="360"/>
+      </w:pPr>
+    </w:lvl>
+    <w:lvl w:ilvl="4" w:tentative="1">
+      <w:start w:val="1"/>
+      <w:numFmt w:val="decimal"/>
+      <w:lvlText w:val="%5."/>
+      <w:lvlJc w:val="left"/>
+      <w:pPr>
+        <w:tabs>
+          <w:tab w:val="num" w:pos="3600"/>
+        </w:tabs>
+        <w:ind w:left="3600" w:hanging="360"/>
+      </w:pPr>
+    </w:lvl>
+    <w:lvl w:ilvl="5" w:tentative="1">
+      <w:start w:val="1"/>
+      <w:numFmt w:val="decimal"/>
+      <w:lvlText w:val="%6."/>
+      <w:lvlJc w:val="left"/>
+      <w:pPr>
+        <w:tabs>
+          <w:tab w:val="num" w:pos="4320"/>
+        </w:tabs>
+        <w:ind w:left="4320" w:hanging="360"/>
+      </w:pPr>
+    </w:lvl>
+    <w:lvl w:ilvl="6" w:tentative="1">
+      <w:start w:val="1"/>
+      <w:numFmt w:val="decimal"/>
+      <w:lvlText w:val="%7."/>
+      <w:lvlJc w:val="left"/>
+      <w:pPr>
+        <w:tabs>
+          <w:tab w:val="num" w:pos="5040"/>
+        </w:tabs>
+        <w:ind w:left="5040" w:hanging="360"/>
+      </w:pPr>
+    </w:lvl>
+    <w:lvl w:ilvl="7" w:tentative="1">
+      <w:start w:val="1"/>
+      <w:numFmt w:val="decimal"/>
+      <w:lvlText w:val="%8."/>
+      <w:lvlJc w:val="left"/>
+      <w:pPr>
+        <w:tabs>
+          <w:tab w:val="num" w:pos="5760"/>
+        </w:tabs>
+        <w:ind w:left="5760" w:hanging="360"/>
+      </w:pPr>
+    </w:lvl>
+    <w:lvl w:ilvl="8" w:tentative="1">
+      <w:start w:val="1"/>
+      <w:numFmt w:val="decimal"/>
+      <w:lvlText w:val="%9."/>
+      <w:lvlJc w:val="left"/>
+      <w:pPr>
+        <w:tabs>
+          <w:tab w:val="num" w:pos="6480"/>
+        </w:tabs>
+        <w:ind w:left="6480" w:hanging="360"/>
+      </w:pPr>
+    </w:lvl>
+  </w:abstractNum>
+  <w:abstractNum w:abstractNumId="26" w15:restartNumberingAfterBreak="0">
     <w:nsid w:val="3E7A129E"/>
     <w:multiLevelType w:val="multilevel"/>
     <w:tmpl w:val="F294C722"/>
@@ -8735,7 +10386,7 @@
       </w:pPr>
     </w:lvl>
   </w:abstractNum>
-  <w:abstractNum w:abstractNumId="24" w15:restartNumberingAfterBreak="0">
+  <w:abstractNum w:abstractNumId="27" w15:restartNumberingAfterBreak="0">
     <w:nsid w:val="4B4F68E1"/>
     <w:multiLevelType w:val="multilevel"/>
     <w:tmpl w:val="B1E64690"/>
@@ -8884,7 +10535,7 @@
       </w:rPr>
     </w:lvl>
   </w:abstractNum>
-  <w:abstractNum w:abstractNumId="25" w15:restartNumberingAfterBreak="0">
+  <w:abstractNum w:abstractNumId="28" w15:restartNumberingAfterBreak="0">
     <w:nsid w:val="4B97274B"/>
     <w:multiLevelType w:val="multilevel"/>
     <w:tmpl w:val="510EE886"/>
@@ -9033,7 +10684,7 @@
       </w:rPr>
     </w:lvl>
   </w:abstractNum>
-  <w:abstractNum w:abstractNumId="26" w15:restartNumberingAfterBreak="0">
+  <w:abstractNum w:abstractNumId="29" w15:restartNumberingAfterBreak="0">
     <w:nsid w:val="52887E87"/>
     <w:multiLevelType w:val="multilevel"/>
     <w:tmpl w:val="B64871D6"/>
@@ -9146,7 +10797,7 @@
       </w:pPr>
     </w:lvl>
   </w:abstractNum>
-  <w:abstractNum w:abstractNumId="27" w15:restartNumberingAfterBreak="0">
+  <w:abstractNum w:abstractNumId="30" w15:restartNumberingAfterBreak="0">
     <w:nsid w:val="53D018E9"/>
     <w:multiLevelType w:val="multilevel"/>
     <w:tmpl w:val="C082F168"/>
@@ -9232,7 +10883,124 @@
       </w:pPr>
     </w:lvl>
   </w:abstractNum>
-  <w:abstractNum w:abstractNumId="28" w15:restartNumberingAfterBreak="0">
+  <w:abstractNum w:abstractNumId="31" w15:restartNumberingAfterBreak="0">
+    <w:nsid w:val="573E1B6D"/>
+    <w:multiLevelType w:val="multilevel"/>
+    <w:tmpl w:val="C8785470"/>
+    <w:lvl w:ilvl="0">
+      <w:start w:val="1"/>
+      <w:numFmt w:val="decimal"/>
+      <w:lvlText w:val="%1."/>
+      <w:lvlJc w:val="left"/>
+      <w:pPr>
+        <w:tabs>
+          <w:tab w:val="num" w:pos="720"/>
+        </w:tabs>
+        <w:ind w:left="720" w:hanging="360"/>
+      </w:pPr>
+    </w:lvl>
+    <w:lvl w:ilvl="1">
+      <w:start w:val="1"/>
+      <w:numFmt w:val="bullet"/>
+      <w:lvlText w:val=""/>
+      <w:lvlJc w:val="left"/>
+      <w:pPr>
+        <w:tabs>
+          <w:tab w:val="num" w:pos="1440"/>
+        </w:tabs>
+        <w:ind w:left="1440" w:hanging="360"/>
+      </w:pPr>
+      <w:rPr>
+        <w:rFonts w:ascii="Symbol" w:hAnsi="Symbol" w:hint="default"/>
+        <w:sz w:val="20"/>
+      </w:rPr>
+    </w:lvl>
+    <w:lvl w:ilvl="2" w:tentative="1">
+      <w:start w:val="1"/>
+      <w:numFmt w:val="decimal"/>
+      <w:lvlText w:val="%3."/>
+      <w:lvlJc w:val="left"/>
+      <w:pPr>
+        <w:tabs>
+          <w:tab w:val="num" w:pos="2160"/>
+        </w:tabs>
+        <w:ind w:left="2160" w:hanging="360"/>
+      </w:pPr>
+    </w:lvl>
+    <w:lvl w:ilvl="3" w:tentative="1">
+      <w:start w:val="1"/>
+      <w:numFmt w:val="decimal"/>
+      <w:lvlText w:val="%4."/>
+      <w:lvlJc w:val="left"/>
+      <w:pPr>
+        <w:tabs>
+          <w:tab w:val="num" w:pos="2880"/>
+        </w:tabs>
+        <w:ind w:left="2880" w:hanging="360"/>
+      </w:pPr>
+    </w:lvl>
+    <w:lvl w:ilvl="4" w:tentative="1">
+      <w:start w:val="1"/>
+      <w:numFmt w:val="decimal"/>
+      <w:lvlText w:val="%5."/>
+      <w:lvlJc w:val="left"/>
+      <w:pPr>
+        <w:tabs>
+          <w:tab w:val="num" w:pos="3600"/>
+        </w:tabs>
+        <w:ind w:left="3600" w:hanging="360"/>
+      </w:pPr>
+    </w:lvl>
+    <w:lvl w:ilvl="5" w:tentative="1">
+      <w:start w:val="1"/>
+      <w:numFmt w:val="decimal"/>
+      <w:lvlText w:val="%6."/>
+      <w:lvlJc w:val="left"/>
+      <w:pPr>
+        <w:tabs>
+          <w:tab w:val="num" w:pos="4320"/>
+        </w:tabs>
+        <w:ind w:left="4320" w:hanging="360"/>
+      </w:pPr>
+    </w:lvl>
+    <w:lvl w:ilvl="6" w:tentative="1">
+      <w:start w:val="1"/>
+      <w:numFmt w:val="decimal"/>
+      <w:lvlText w:val="%7."/>
+      <w:lvlJc w:val="left"/>
+      <w:pPr>
+        <w:tabs>
+          <w:tab w:val="num" w:pos="5040"/>
+        </w:tabs>
+        <w:ind w:left="5040" w:hanging="360"/>
+      </w:pPr>
+    </w:lvl>
+    <w:lvl w:ilvl="7" w:tentative="1">
+      <w:start w:val="1"/>
+      <w:numFmt w:val="decimal"/>
+      <w:lvlText w:val="%8."/>
+      <w:lvlJc w:val="left"/>
+      <w:pPr>
+        <w:tabs>
+          <w:tab w:val="num" w:pos="5760"/>
+        </w:tabs>
+        <w:ind w:left="5760" w:hanging="360"/>
+      </w:pPr>
+    </w:lvl>
+    <w:lvl w:ilvl="8" w:tentative="1">
+      <w:start w:val="1"/>
+      <w:numFmt w:val="decimal"/>
+      <w:lvlText w:val="%9."/>
+      <w:lvlJc w:val="left"/>
+      <w:pPr>
+        <w:tabs>
+          <w:tab w:val="num" w:pos="6480"/>
+        </w:tabs>
+        <w:ind w:left="6480" w:hanging="360"/>
+      </w:pPr>
+    </w:lvl>
+  </w:abstractNum>
+  <w:abstractNum w:abstractNumId="32" w15:restartNumberingAfterBreak="0">
     <w:nsid w:val="59CD5DA7"/>
     <w:multiLevelType w:val="multilevel"/>
     <w:tmpl w:val="206C4B6E"/>
@@ -9345,7 +11113,7 @@
       </w:pPr>
     </w:lvl>
   </w:abstractNum>
-  <w:abstractNum w:abstractNumId="29" w15:restartNumberingAfterBreak="0">
+  <w:abstractNum w:abstractNumId="33" w15:restartNumberingAfterBreak="0">
     <w:nsid w:val="59EB4366"/>
     <w:multiLevelType w:val="multilevel"/>
     <w:tmpl w:val="A140AF52"/>
@@ -9494,7 +11262,156 @@
       </w:rPr>
     </w:lvl>
   </w:abstractNum>
-  <w:abstractNum w:abstractNumId="30" w15:restartNumberingAfterBreak="0">
+  <w:abstractNum w:abstractNumId="34" w15:restartNumberingAfterBreak="0">
+    <w:nsid w:val="5D2B1017"/>
+    <w:multiLevelType w:val="multilevel"/>
+    <w:tmpl w:val="E44A977E"/>
+    <w:lvl w:ilvl="0">
+      <w:start w:val="1"/>
+      <w:numFmt w:val="bullet"/>
+      <w:lvlText w:val=""/>
+      <w:lvlJc w:val="left"/>
+      <w:pPr>
+        <w:tabs>
+          <w:tab w:val="num" w:pos="720"/>
+        </w:tabs>
+        <w:ind w:left="720" w:hanging="360"/>
+      </w:pPr>
+      <w:rPr>
+        <w:rFonts w:ascii="Symbol" w:hAnsi="Symbol" w:hint="default"/>
+        <w:sz w:val="20"/>
+      </w:rPr>
+    </w:lvl>
+    <w:lvl w:ilvl="1" w:tentative="1">
+      <w:start w:val="1"/>
+      <w:numFmt w:val="bullet"/>
+      <w:lvlText w:val=""/>
+      <w:lvlJc w:val="left"/>
+      <w:pPr>
+        <w:tabs>
+          <w:tab w:val="num" w:pos="1440"/>
+        </w:tabs>
+        <w:ind w:left="1440" w:hanging="360"/>
+      </w:pPr>
+      <w:rPr>
+        <w:rFonts w:ascii="Symbol" w:hAnsi="Symbol" w:hint="default"/>
+        <w:sz w:val="20"/>
+      </w:rPr>
+    </w:lvl>
+    <w:lvl w:ilvl="2" w:tentative="1">
+      <w:start w:val="1"/>
+      <w:numFmt w:val="bullet"/>
+      <w:lvlText w:val=""/>
+      <w:lvlJc w:val="left"/>
+      <w:pPr>
+        <w:tabs>
+          <w:tab w:val="num" w:pos="2160"/>
+        </w:tabs>
+        <w:ind w:left="2160" w:hanging="360"/>
+      </w:pPr>
+      <w:rPr>
+        <w:rFonts w:ascii="Symbol" w:hAnsi="Symbol" w:hint="default"/>
+        <w:sz w:val="20"/>
+      </w:rPr>
+    </w:lvl>
+    <w:lvl w:ilvl="3" w:tentative="1">
+      <w:start w:val="1"/>
+      <w:numFmt w:val="bullet"/>
+      <w:lvlText w:val=""/>
+      <w:lvlJc w:val="left"/>
+      <w:pPr>
+        <w:tabs>
+          <w:tab w:val="num" w:pos="2880"/>
+        </w:tabs>
+        <w:ind w:left="2880" w:hanging="360"/>
+      </w:pPr>
+      <w:rPr>
+        <w:rFonts w:ascii="Symbol" w:hAnsi="Symbol" w:hint="default"/>
+        <w:sz w:val="20"/>
+      </w:rPr>
+    </w:lvl>
+    <w:lvl w:ilvl="4" w:tentative="1">
+      <w:start w:val="1"/>
+      <w:numFmt w:val="bullet"/>
+      <w:lvlText w:val=""/>
+      <w:lvlJc w:val="left"/>
+      <w:pPr>
+        <w:tabs>
+          <w:tab w:val="num" w:pos="3600"/>
+        </w:tabs>
+        <w:ind w:left="3600" w:hanging="360"/>
+      </w:pPr>
+      <w:rPr>
+        <w:rFonts w:ascii="Symbol" w:hAnsi="Symbol" w:hint="default"/>
+        <w:sz w:val="20"/>
+      </w:rPr>
+    </w:lvl>
+    <w:lvl w:ilvl="5" w:tentative="1">
+      <w:start w:val="1"/>
+      <w:numFmt w:val="bullet"/>
+      <w:lvlText w:val=""/>
+      <w:lvlJc w:val="left"/>
+      <w:pPr>
+        <w:tabs>
+          <w:tab w:val="num" w:pos="4320"/>
+        </w:tabs>
+        <w:ind w:left="4320" w:hanging="360"/>
+      </w:pPr>
+      <w:rPr>
+        <w:rFonts w:ascii="Symbol" w:hAnsi="Symbol" w:hint="default"/>
+        <w:sz w:val="20"/>
+      </w:rPr>
+    </w:lvl>
+    <w:lvl w:ilvl="6" w:tentative="1">
+      <w:start w:val="1"/>
+      <w:numFmt w:val="bullet"/>
+      <w:lvlText w:val=""/>
+      <w:lvlJc w:val="left"/>
+      <w:pPr>
+        <w:tabs>
+          <w:tab w:val="num" w:pos="5040"/>
+        </w:tabs>
+        <w:ind w:left="5040" w:hanging="360"/>
+      </w:pPr>
+      <w:rPr>
+        <w:rFonts w:ascii="Symbol" w:hAnsi="Symbol" w:hint="default"/>
+        <w:sz w:val="20"/>
+      </w:rPr>
+    </w:lvl>
+    <w:lvl w:ilvl="7" w:tentative="1">
+      <w:start w:val="1"/>
+      <w:numFmt w:val="bullet"/>
+      <w:lvlText w:val=""/>
+      <w:lvlJc w:val="left"/>
+      <w:pPr>
+        <w:tabs>
+          <w:tab w:val="num" w:pos="5760"/>
+        </w:tabs>
+        <w:ind w:left="5760" w:hanging="360"/>
+      </w:pPr>
+      <w:rPr>
+        <w:rFonts w:ascii="Symbol" w:hAnsi="Symbol" w:hint="default"/>
+        <w:sz w:val="20"/>
+      </w:rPr>
+    </w:lvl>
+    <w:lvl w:ilvl="8" w:tentative="1">
+      <w:start w:val="1"/>
+      <w:numFmt w:val="bullet"/>
+      <w:lvlText w:val=""/>
+      <w:lvlJc w:val="left"/>
+      <w:pPr>
+        <w:tabs>
+          <w:tab w:val="num" w:pos="6480"/>
+        </w:tabs>
+        <w:ind w:left="6480" w:hanging="360"/>
+      </w:pPr>
+      <w:rPr>
+        <w:rFonts w:ascii="Symbol" w:hAnsi="Symbol" w:hint="default"/>
+        <w:sz w:val="20"/>
+      </w:rPr>
+    </w:lvl>
+  </w:abstractNum>
+  <w:abstractNum w:abstractNumId="35" w15:restartNumberingAfterBreak="0">
     <w:nsid w:val="606A128E"/>
     <w:multiLevelType w:val="multilevel"/>
     <w:tmpl w:val="27A40982"/>
@@ -9607,7 +11524,7 @@
       </w:pPr>
     </w:lvl>
   </w:abstractNum>
-  <w:abstractNum w:abstractNumId="31" w15:restartNumberingAfterBreak="0">
+  <w:abstractNum w:abstractNumId="36" w15:restartNumberingAfterBreak="0">
     <w:nsid w:val="60EA4256"/>
     <w:multiLevelType w:val="multilevel"/>
     <w:tmpl w:val="3460AD88"/>
@@ -9756,7 +11673,7 @@
       </w:rPr>
     </w:lvl>
   </w:abstractNum>
-  <w:abstractNum w:abstractNumId="32" w15:restartNumberingAfterBreak="0">
+  <w:abstractNum w:abstractNumId="37" w15:restartNumberingAfterBreak="0">
     <w:nsid w:val="63CE2007"/>
     <w:multiLevelType w:val="multilevel"/>
     <w:tmpl w:val="DB36306E"/>
@@ -9905,7 +11822,7 @@
       </w:rPr>
     </w:lvl>
   </w:abstractNum>
-  <w:abstractNum w:abstractNumId="33" w15:restartNumberingAfterBreak="0">
+  <w:abstractNum w:abstractNumId="38" w15:restartNumberingAfterBreak="0">
     <w:nsid w:val="646B3AEC"/>
     <w:multiLevelType w:val="multilevel"/>
     <w:tmpl w:val="40289B9C"/>
@@ -10054,7 +11971,7 @@
       </w:rPr>
     </w:lvl>
   </w:abstractNum>
-  <w:abstractNum w:abstractNumId="34" w15:restartNumberingAfterBreak="0">
+  <w:abstractNum w:abstractNumId="39" w15:restartNumberingAfterBreak="0">
     <w:nsid w:val="66E942C2"/>
     <w:multiLevelType w:val="multilevel"/>
     <w:tmpl w:val="855CC1A4"/>
@@ -10203,7 +12120,7 @@
       </w:rPr>
     </w:lvl>
   </w:abstractNum>
-  <w:abstractNum w:abstractNumId="35" w15:restartNumberingAfterBreak="0">
+  <w:abstractNum w:abstractNumId="40" w15:restartNumberingAfterBreak="0">
     <w:nsid w:val="68997961"/>
     <w:multiLevelType w:val="multilevel"/>
     <w:tmpl w:val="A2EA5AD4"/>
@@ -10289,7 +12206,7 @@
       </w:pPr>
     </w:lvl>
   </w:abstractNum>
-  <w:abstractNum w:abstractNumId="36" w15:restartNumberingAfterBreak="0">
+  <w:abstractNum w:abstractNumId="41" w15:restartNumberingAfterBreak="0">
     <w:nsid w:val="6A2E2E53"/>
     <w:multiLevelType w:val="multilevel"/>
     <w:tmpl w:val="9990B534"/>
@@ -10375,7 +12292,7 @@
       </w:pPr>
     </w:lvl>
   </w:abstractNum>
-  <w:abstractNum w:abstractNumId="37" w15:restartNumberingAfterBreak="0">
+  <w:abstractNum w:abstractNumId="42" w15:restartNumberingAfterBreak="0">
     <w:nsid w:val="6B0D2D62"/>
     <w:multiLevelType w:val="multilevel"/>
     <w:tmpl w:val="6DF82B7C"/>
@@ -10488,7 +12405,7 @@
       </w:pPr>
     </w:lvl>
   </w:abstractNum>
-  <w:abstractNum w:abstractNumId="38" w15:restartNumberingAfterBreak="0">
+  <w:abstractNum w:abstractNumId="43" w15:restartNumberingAfterBreak="0">
     <w:nsid w:val="6BEB5902"/>
     <w:multiLevelType w:val="multilevel"/>
     <w:tmpl w:val="DC08DE0E"/>
@@ -10637,7 +12554,7 @@
       </w:rPr>
     </w:lvl>
   </w:abstractNum>
-  <w:abstractNum w:abstractNumId="39" w15:restartNumberingAfterBreak="0">
+  <w:abstractNum w:abstractNumId="44" w15:restartNumberingAfterBreak="0">
     <w:nsid w:val="6FF6017B"/>
     <w:multiLevelType w:val="multilevel"/>
     <w:tmpl w:val="0ECAB75C"/>
@@ -10786,7 +12703,7 @@
       </w:rPr>
     </w:lvl>
   </w:abstractNum>
-  <w:abstractNum w:abstractNumId="40" w15:restartNumberingAfterBreak="0">
+  <w:abstractNum w:abstractNumId="45" w15:restartNumberingAfterBreak="0">
     <w:nsid w:val="71703412"/>
     <w:multiLevelType w:val="multilevel"/>
     <w:tmpl w:val="8272B990"/>
@@ -10903,7 +12820,7 @@
       </w:pPr>
     </w:lvl>
   </w:abstractNum>
-  <w:abstractNum w:abstractNumId="41" w15:restartNumberingAfterBreak="0">
+  <w:abstractNum w:abstractNumId="46" w15:restartNumberingAfterBreak="0">
     <w:nsid w:val="767F2668"/>
     <w:multiLevelType w:val="multilevel"/>
     <w:tmpl w:val="21727A62"/>
@@ -11052,7 +12969,7 @@
       </w:rPr>
     </w:lvl>
   </w:abstractNum>
-  <w:abstractNum w:abstractNumId="42" w15:restartNumberingAfterBreak="0">
+  <w:abstractNum w:abstractNumId="47" w15:restartNumberingAfterBreak="0">
     <w:nsid w:val="77E85D3D"/>
     <w:multiLevelType w:val="multilevel"/>
     <w:tmpl w:val="5E2E9860"/>
@@ -11165,7 +13082,7 @@
       </w:pPr>
     </w:lvl>
   </w:abstractNum>
-  <w:abstractNum w:abstractNumId="43" w15:restartNumberingAfterBreak="0">
+  <w:abstractNum w:abstractNumId="48" w15:restartNumberingAfterBreak="0">
     <w:nsid w:val="78047FE7"/>
     <w:multiLevelType w:val="multilevel"/>
     <w:tmpl w:val="095ECB90"/>
@@ -11314,7 +13231,156 @@
       </w:rPr>
     </w:lvl>
   </w:abstractNum>
-  <w:abstractNum w:abstractNumId="44" w15:restartNumberingAfterBreak="0">
+  <w:abstractNum w:abstractNumId="49" w15:restartNumberingAfterBreak="0">
+    <w:nsid w:val="7A611C99"/>
+    <w:multiLevelType w:val="multilevel"/>
+    <w:tmpl w:val="95462DA8"/>
+    <w:lvl w:ilvl="0">
+      <w:start w:val="1"/>
+      <w:numFmt w:val="bullet"/>
+      <w:lvlText w:val=""/>
+      <w:lvlJc w:val="left"/>
+      <w:pPr>
+        <w:tabs>
+          <w:tab w:val="num" w:pos="720"/>
+        </w:tabs>
+        <w:ind w:left="720" w:hanging="360"/>
+      </w:pPr>
+      <w:rPr>
+        <w:rFonts w:ascii="Symbol" w:hAnsi="Symbol" w:hint="default"/>
+        <w:sz w:val="20"/>
+      </w:rPr>
+    </w:lvl>
+    <w:lvl w:ilvl="1" w:tentative="1">
+      <w:start w:val="1"/>
+      <w:numFmt w:val="bullet"/>
+      <w:lvlText w:val=""/>
+      <w:lvlJc w:val="left"/>
+      <w:pPr>
+        <w:tabs>
+          <w:tab w:val="num" w:pos="1440"/>
+        </w:tabs>
+        <w:ind w:left="1440" w:hanging="360"/>
+      </w:pPr>
+      <w:rPr>
+        <w:rFonts w:ascii="Symbol" w:hAnsi="Symbol" w:hint="default"/>
+        <w:sz w:val="20"/>
+      </w:rPr>
+    </w:lvl>
+    <w:lvl w:ilvl="2" w:tentative="1">
+      <w:start w:val="1"/>
+      <w:numFmt w:val="bullet"/>
+      <w:lvlText w:val=""/>
+      <w:lvlJc w:val="left"/>
+      <w:pPr>
+        <w:tabs>
+          <w:tab w:val="num" w:pos="2160"/>
+        </w:tabs>
+        <w:ind w:left="2160" w:hanging="360"/>
+      </w:pPr>
+      <w:rPr>
+        <w:rFonts w:ascii="Symbol" w:hAnsi="Symbol" w:hint="default"/>
+        <w:sz w:val="20"/>
+      </w:rPr>
+    </w:lvl>
+    <w:lvl w:ilvl="3" w:tentative="1">
+      <w:start w:val="1"/>
+      <w:numFmt w:val="bullet"/>
+      <w:lvlText w:val=""/>
+      <w:lvlJc w:val="left"/>
+      <w:pPr>
+        <w:tabs>
+          <w:tab w:val="num" w:pos="2880"/>
+        </w:tabs>
+        <w:ind w:left="2880" w:hanging="360"/>
+      </w:pPr>
+      <w:rPr>
+        <w:rFonts w:ascii="Symbol" w:hAnsi="Symbol" w:hint="default"/>
+        <w:sz w:val="20"/>
+      </w:rPr>
+    </w:lvl>
+    <w:lvl w:ilvl="4" w:tentative="1">
+      <w:start w:val="1"/>
+      <w:numFmt w:val="bullet"/>
+      <w:lvlText w:val=""/>
+      <w:lvlJc w:val="left"/>
+      <w:pPr>
+        <w:tabs>
+          <w:tab w:val="num" w:pos="3600"/>
+        </w:tabs>
+        <w:ind w:left="3600" w:hanging="360"/>
+      </w:pPr>
+      <w:rPr>
+        <w:rFonts w:ascii="Symbol" w:hAnsi="Symbol" w:hint="default"/>
+        <w:sz w:val="20"/>
+      </w:rPr>
+    </w:lvl>
+    <w:lvl w:ilvl="5" w:tentative="1">
+      <w:start w:val="1"/>
+      <w:numFmt w:val="bullet"/>
+      <w:lvlText w:val=""/>
+      <w:lvlJc w:val="left"/>
+      <w:pPr>
+        <w:tabs>
+          <w:tab w:val="num" w:pos="4320"/>
+        </w:tabs>
+        <w:ind w:left="4320" w:hanging="360"/>
+      </w:pPr>
+      <w:rPr>
+        <w:rFonts w:ascii="Symbol" w:hAnsi="Symbol" w:hint="default"/>
+        <w:sz w:val="20"/>
+      </w:rPr>
+    </w:lvl>
+    <w:lvl w:ilvl="6" w:tentative="1">
+      <w:start w:val="1"/>
+      <w:numFmt w:val="bullet"/>
+      <w:lvlText w:val=""/>
+      <w:lvlJc w:val="left"/>
+      <w:pPr>
+        <w:tabs>
+          <w:tab w:val="num" w:pos="5040"/>
+        </w:tabs>
+        <w:ind w:left="5040" w:hanging="360"/>
+      </w:pPr>
+      <w:rPr>
+        <w:rFonts w:ascii="Symbol" w:hAnsi="Symbol" w:hint="default"/>
+        <w:sz w:val="20"/>
+      </w:rPr>
+    </w:lvl>
+    <w:lvl w:ilvl="7" w:tentative="1">
+      <w:start w:val="1"/>
+      <w:numFmt w:val="bullet"/>
+      <w:lvlText w:val=""/>
+      <w:lvlJc w:val="left"/>
+      <w:pPr>
+        <w:tabs>
+          <w:tab w:val="num" w:pos="5760"/>
+        </w:tabs>
+        <w:ind w:left="5760" w:hanging="360"/>
+      </w:pPr>
+      <w:rPr>
+        <w:rFonts w:ascii="Symbol" w:hAnsi="Symbol" w:hint="default"/>
+        <w:sz w:val="20"/>
+      </w:rPr>
+    </w:lvl>
+    <w:lvl w:ilvl="8" w:tentative="1">
+      <w:start w:val="1"/>
+      <w:numFmt w:val="bullet"/>
+      <w:lvlText w:val=""/>
+      <w:lvlJc w:val="left"/>
+      <w:pPr>
+        <w:tabs>
+          <w:tab w:val="num" w:pos="6480"/>
+        </w:tabs>
+        <w:ind w:left="6480" w:hanging="360"/>
+      </w:pPr>
+      <w:rPr>
+        <w:rFonts w:ascii="Symbol" w:hAnsi="Symbol" w:hint="default"/>
+        <w:sz w:val="20"/>
+      </w:rPr>
+    </w:lvl>
+  </w:abstractNum>
+  <w:abstractNum w:abstractNumId="50" w15:restartNumberingAfterBreak="0">
     <w:nsid w:val="7A63723F"/>
     <w:multiLevelType w:val="multilevel"/>
     <w:tmpl w:val="7CC2955C"/>
@@ -11427,7 +13493,7 @@
       </w:pPr>
     </w:lvl>
   </w:abstractNum>
-  <w:abstractNum w:abstractNumId="45" w15:restartNumberingAfterBreak="0">
+  <w:abstractNum w:abstractNumId="51" w15:restartNumberingAfterBreak="0">
     <w:nsid w:val="7D550074"/>
     <w:multiLevelType w:val="multilevel"/>
     <w:tmpl w:val="2AAEB2E6"/>
@@ -11540,7 +13606,7 @@
       </w:pPr>
     </w:lvl>
   </w:abstractNum>
-  <w:abstractNum w:abstractNumId="46" w15:restartNumberingAfterBreak="0">
+  <w:abstractNum w:abstractNumId="52" w15:restartNumberingAfterBreak="0">
     <w:nsid w:val="7DAC78E6"/>
     <w:multiLevelType w:val="multilevel"/>
     <w:tmpl w:val="9F9A87E2"/>
@@ -11689,7 +13755,7 @@
       </w:rPr>
     </w:lvl>
   </w:abstractNum>
-  <w:abstractNum w:abstractNumId="47" w15:restartNumberingAfterBreak="0">
+  <w:abstractNum w:abstractNumId="53" w15:restartNumberingAfterBreak="0">
     <w:nsid w:val="7F693EFF"/>
     <w:multiLevelType w:val="multilevel"/>
     <w:tmpl w:val="F5EADD5A"/>
@@ -11806,7 +13872,7 @@
       </w:pPr>
     </w:lvl>
   </w:abstractNum>
-  <w:abstractNum w:abstractNumId="48" w15:restartNumberingAfterBreak="0">
+  <w:abstractNum w:abstractNumId="54" w15:restartNumberingAfterBreak="0">
     <w:nsid w:val="7FC04D11"/>
     <w:multiLevelType w:val="multilevel"/>
     <w:tmpl w:val="8500B184"/>
@@ -11920,157 +13986,175 @@
     </w:lvl>
   </w:abstractNum>
   <w:num w:numId="1" w16cid:durableId="1044669842">
-    <w:abstractNumId w:val="35"/>
+    <w:abstractNumId w:val="40"/>
   </w:num>
   <w:num w:numId="2" w16cid:durableId="751859171">
-    <w:abstractNumId w:val="9"/>
+    <w:abstractNumId w:val="10"/>
   </w:num>
   <w:num w:numId="3" w16cid:durableId="1391689702">
-    <w:abstractNumId w:val="17"/>
+    <w:abstractNumId w:val="19"/>
   </w:num>
   <w:num w:numId="4" w16cid:durableId="1537884721">
-    <w:abstractNumId w:val="36"/>
+    <w:abstractNumId w:val="41"/>
   </w:num>
   <w:num w:numId="5" w16cid:durableId="543714735">
-    <w:abstractNumId w:val="27"/>
+    <w:abstractNumId w:val="30"/>
   </w:num>
   <w:num w:numId="6" w16cid:durableId="962272814">
-    <w:abstractNumId w:val="20"/>
+    <w:abstractNumId w:val="22"/>
   </w:num>
   <w:num w:numId="7" w16cid:durableId="550650192">
-    <w:abstractNumId w:val="11"/>
+    <w:abstractNumId w:val="12"/>
   </w:num>
   <w:num w:numId="8" w16cid:durableId="240793494">
-    <w:abstractNumId w:val="11"/>
+    <w:abstractNumId w:val="12"/>
   </w:num>
   <w:num w:numId="9" w16cid:durableId="626743724">
-    <w:abstractNumId w:val="11"/>
+    <w:abstractNumId w:val="12"/>
   </w:num>
   <w:num w:numId="10" w16cid:durableId="297152199">
     <w:abstractNumId w:val="0"/>
   </w:num>
   <w:num w:numId="11" w16cid:durableId="2134857441">
+    <w:abstractNumId w:val="28"/>
+  </w:num>
+  <w:num w:numId="12" w16cid:durableId="814032841">
+    <w:abstractNumId w:val="11"/>
+  </w:num>
+  <w:num w:numId="13" w16cid:durableId="1611469133">
+    <w:abstractNumId w:val="54"/>
+  </w:num>
+  <w:num w:numId="14" w16cid:durableId="1231963603">
+    <w:abstractNumId w:val="42"/>
+  </w:num>
+  <w:num w:numId="15" w16cid:durableId="1777359005">
+    <w:abstractNumId w:val="51"/>
+  </w:num>
+  <w:num w:numId="16" w16cid:durableId="211432699">
+    <w:abstractNumId w:val="23"/>
+  </w:num>
+  <w:num w:numId="17" w16cid:durableId="543905616">
+    <w:abstractNumId w:val="17"/>
+  </w:num>
+  <w:num w:numId="18" w16cid:durableId="2130739007">
+    <w:abstractNumId w:val="44"/>
+  </w:num>
+  <w:num w:numId="19" w16cid:durableId="1284850338">
+    <w:abstractNumId w:val="50"/>
+  </w:num>
+  <w:num w:numId="20" w16cid:durableId="800343201">
+    <w:abstractNumId w:val="38"/>
+  </w:num>
+  <w:num w:numId="21" w16cid:durableId="869955518">
+    <w:abstractNumId w:val="15"/>
+  </w:num>
+  <w:num w:numId="22" w16cid:durableId="483279714">
+    <w:abstractNumId w:val="7"/>
+  </w:num>
+  <w:num w:numId="23" w16cid:durableId="65495663">
+    <w:abstractNumId w:val="26"/>
+  </w:num>
+  <w:num w:numId="24" w16cid:durableId="127867809">
+    <w:abstractNumId w:val="47"/>
+  </w:num>
+  <w:num w:numId="25" w16cid:durableId="757484285">
+    <w:abstractNumId w:val="13"/>
+  </w:num>
+  <w:num w:numId="26" w16cid:durableId="1768774031">
+    <w:abstractNumId w:val="5"/>
+  </w:num>
+  <w:num w:numId="27" w16cid:durableId="1512796923">
+    <w:abstractNumId w:val="3"/>
+  </w:num>
+  <w:num w:numId="28" w16cid:durableId="855384913">
+    <w:abstractNumId w:val="52"/>
+  </w:num>
+  <w:num w:numId="29" w16cid:durableId="1894847561">
+    <w:abstractNumId w:val="2"/>
+  </w:num>
+  <w:num w:numId="30" w16cid:durableId="1105540154">
+    <w:abstractNumId w:val="43"/>
+  </w:num>
+  <w:num w:numId="31" w16cid:durableId="394666317">
+    <w:abstractNumId w:val="32"/>
+  </w:num>
+  <w:num w:numId="32" w16cid:durableId="1389106037">
+    <w:abstractNumId w:val="46"/>
+  </w:num>
+  <w:num w:numId="33" w16cid:durableId="1488548116">
+    <w:abstractNumId w:val="8"/>
+  </w:num>
+  <w:num w:numId="34" w16cid:durableId="614288931">
+    <w:abstractNumId w:val="33"/>
+  </w:num>
+  <w:num w:numId="35" w16cid:durableId="765223985">
+    <w:abstractNumId w:val="53"/>
+  </w:num>
+  <w:num w:numId="36" w16cid:durableId="805123109">
+    <w:abstractNumId w:val="45"/>
+  </w:num>
+  <w:num w:numId="37" w16cid:durableId="1601916474">
+    <w:abstractNumId w:val="20"/>
+  </w:num>
+  <w:num w:numId="38" w16cid:durableId="428503132">
+    <w:abstractNumId w:val="24"/>
+  </w:num>
+  <w:num w:numId="39" w16cid:durableId="386301620">
+    <w:abstractNumId w:val="21"/>
+  </w:num>
+  <w:num w:numId="40" w16cid:durableId="1005983543">
+    <w:abstractNumId w:val="9"/>
+  </w:num>
+  <w:num w:numId="41" w16cid:durableId="1383094397">
+    <w:abstractNumId w:val="29"/>
+  </w:num>
+  <w:num w:numId="42" w16cid:durableId="132797494">
+    <w:abstractNumId w:val="48"/>
+  </w:num>
+  <w:num w:numId="43" w16cid:durableId="410811088">
+    <w:abstractNumId w:val="37"/>
+  </w:num>
+  <w:num w:numId="44" w16cid:durableId="966667809">
+    <w:abstractNumId w:val="27"/>
+  </w:num>
+  <w:num w:numId="45" w16cid:durableId="1544976151">
+    <w:abstractNumId w:val="36"/>
+  </w:num>
+  <w:num w:numId="46" w16cid:durableId="118570661">
+    <w:abstractNumId w:val="35"/>
+  </w:num>
+  <w:num w:numId="47" w16cid:durableId="558786331">
+    <w:abstractNumId w:val="6"/>
+  </w:num>
+  <w:num w:numId="48" w16cid:durableId="865364272">
+    <w:abstractNumId w:val="39"/>
+  </w:num>
+  <w:num w:numId="49" w16cid:durableId="240606995">
+    <w:abstractNumId w:val="4"/>
+  </w:num>
+  <w:num w:numId="50" w16cid:durableId="1074281219">
+    <w:abstractNumId w:val="14"/>
+  </w:num>
+  <w:num w:numId="51" w16cid:durableId="76825477">
+    <w:abstractNumId w:val="18"/>
+  </w:num>
+  <w:num w:numId="52" w16cid:durableId="461265046">
+    <w:abstractNumId w:val="34"/>
+  </w:num>
+  <w:num w:numId="53" w16cid:durableId="363403658">
+    <w:abstractNumId w:val="16"/>
+  </w:num>
+  <w:num w:numId="54" w16cid:durableId="1202480351">
     <w:abstractNumId w:val="25"/>
   </w:num>
-  <w:num w:numId="12" w16cid:durableId="814032841">
-    <w:abstractNumId w:val="10"/>
-  </w:num>
-  <w:num w:numId="13" w16cid:durableId="1611469133">
-    <w:abstractNumId w:val="48"/>
-  </w:num>
-  <w:num w:numId="14" w16cid:durableId="1231963603">
-    <w:abstractNumId w:val="37"/>
-  </w:num>
-  <w:num w:numId="15" w16cid:durableId="1777359005">
-    <w:abstractNumId w:val="45"/>
-  </w:num>
-  <w:num w:numId="16" w16cid:durableId="211432699">
-    <w:abstractNumId w:val="21"/>
-  </w:num>
-  <w:num w:numId="17" w16cid:durableId="543905616">
-    <w:abstractNumId w:val="15"/>
-  </w:num>
-  <w:num w:numId="18" w16cid:durableId="2130739007">
-    <w:abstractNumId w:val="39"/>
-  </w:num>
-  <w:num w:numId="19" w16cid:durableId="1284850338">
-    <w:abstractNumId w:val="44"/>
-  </w:num>
-  <w:num w:numId="20" w16cid:durableId="800343201">
-    <w:abstractNumId w:val="33"/>
-  </w:num>
-  <w:num w:numId="21" w16cid:durableId="869955518">
-    <w:abstractNumId w:val="14"/>
-  </w:num>
-  <w:num w:numId="22" w16cid:durableId="483279714">
-    <w:abstractNumId w:val="6"/>
-  </w:num>
-  <w:num w:numId="23" w16cid:durableId="65495663">
-    <w:abstractNumId w:val="23"/>
-  </w:num>
-  <w:num w:numId="24" w16cid:durableId="127867809">
-    <w:abstractNumId w:val="42"/>
-  </w:num>
-  <w:num w:numId="25" w16cid:durableId="757484285">
-    <w:abstractNumId w:val="12"/>
-  </w:num>
-  <w:num w:numId="26" w16cid:durableId="1768774031">
-    <w:abstractNumId w:val="4"/>
-  </w:num>
-  <w:num w:numId="27" w16cid:durableId="1512796923">
-    <w:abstractNumId w:val="2"/>
-  </w:num>
-  <w:num w:numId="28" w16cid:durableId="855384913">
-    <w:abstractNumId w:val="46"/>
-  </w:num>
-  <w:num w:numId="29" w16cid:durableId="1894847561">
+  <w:num w:numId="55" w16cid:durableId="458957407">
     <w:abstractNumId w:val="1"/>
   </w:num>
-  <w:num w:numId="30" w16cid:durableId="1105540154">
-    <w:abstractNumId w:val="38"/>
-  </w:num>
-  <w:num w:numId="31" w16cid:durableId="394666317">
-    <w:abstractNumId w:val="28"/>
-  </w:num>
-  <w:num w:numId="32" w16cid:durableId="1389106037">
-    <w:abstractNumId w:val="41"/>
-  </w:num>
-  <w:num w:numId="33" w16cid:durableId="1488548116">
-    <w:abstractNumId w:val="7"/>
-  </w:num>
-  <w:num w:numId="34" w16cid:durableId="614288931">
-    <w:abstractNumId w:val="29"/>
-  </w:num>
-  <w:num w:numId="35" w16cid:durableId="765223985">
-    <w:abstractNumId w:val="47"/>
-  </w:num>
-  <w:num w:numId="36" w16cid:durableId="805123109">
-    <w:abstractNumId w:val="40"/>
-  </w:num>
-  <w:num w:numId="37" w16cid:durableId="1601916474">
-    <w:abstractNumId w:val="18"/>
-  </w:num>
-  <w:num w:numId="38" w16cid:durableId="428503132">
-    <w:abstractNumId w:val="22"/>
-  </w:num>
-  <w:num w:numId="39" w16cid:durableId="386301620">
-    <w:abstractNumId w:val="19"/>
-  </w:num>
-  <w:num w:numId="40" w16cid:durableId="1005983543">
-    <w:abstractNumId w:val="8"/>
-  </w:num>
-  <w:num w:numId="41" w16cid:durableId="1383094397">
-    <w:abstractNumId w:val="26"/>
-  </w:num>
-  <w:num w:numId="42" w16cid:durableId="132797494">
-    <w:abstractNumId w:val="43"/>
-  </w:num>
-  <w:num w:numId="43" w16cid:durableId="410811088">
-    <w:abstractNumId w:val="32"/>
-  </w:num>
-  <w:num w:numId="44" w16cid:durableId="966667809">
-    <w:abstractNumId w:val="24"/>
-  </w:num>
-  <w:num w:numId="45" w16cid:durableId="1544976151">
+  <w:num w:numId="56" w16cid:durableId="1373506403">
     <w:abstractNumId w:val="31"/>
   </w:num>
-  <w:num w:numId="46" w16cid:durableId="118570661">
-    <w:abstractNumId w:val="30"/>
-  </w:num>
-  <w:num w:numId="47" w16cid:durableId="558786331">
-    <w:abstractNumId w:val="5"/>
-  </w:num>
-  <w:num w:numId="48" w16cid:durableId="865364272">
-    <w:abstractNumId w:val="34"/>
-  </w:num>
-  <w:num w:numId="49" w16cid:durableId="240606995">
-    <w:abstractNumId w:val="3"/>
-  </w:num>
-  <w:num w:numId="50" w16cid:durableId="1074281219">
-    <w:abstractNumId w:val="13"/>
-  </w:num>
-  <w:num w:numId="51" w16cid:durableId="76825477">
-    <w:abstractNumId w:val="16"/>
+  <w:num w:numId="57" w16cid:durableId="1949003165">
+    <w:abstractNumId w:val="49"/>
   </w:num>
 </w:numbering>
 </file>

</xml_diff>

<commit_message>
Se corrige problemas con el listado de amortizaciones
</commit_message>
<xml_diff>
--- a/documentacion/ChatDesarrollo_001.docx
+++ b/documentacion/ChatDesarrollo_001.docx
@@ -7250,8 +7250,339 @@
     </w:p>
     <w:p>
       <w:pPr>
-        <w:spacing w:after="0" w:line="240" w:lineRule="auto"/>
-      </w:pPr>
+        <w:pBdr>
+          <w:bottom w:val="single" w:sz="6" w:space="1" w:color="auto"/>
+        </w:pBdr>
+        <w:spacing w:after="0" w:line="240" w:lineRule="auto"/>
+      </w:pPr>
+    </w:p>
+    <w:p>
+      <w:pPr>
+        <w:spacing w:after="0" w:line="240" w:lineRule="auto"/>
+      </w:pPr>
+      <w:r>
+        <w:t>Estilos para los modales:</w:t>
+      </w:r>
+    </w:p>
+    <w:p>
+      <w:pPr>
+        <w:numPr>
+          <w:ilvl w:val="0"/>
+          <w:numId w:val="2"/>
+        </w:numPr>
+        <w:tabs>
+          <w:tab w:val="clear" w:pos="720"/>
+          <w:tab w:val="num" w:pos="360"/>
+        </w:tabs>
+        <w:spacing w:after="0" w:line="240" w:lineRule="auto"/>
+        <w:rPr>
+          <w:b/>
+          <w:bCs/>
+        </w:rPr>
+      </w:pPr>
+      <w:r>
+        <w:rPr>
+          <w:b/>
+          <w:bCs/>
+        </w:rPr>
+        <w:t>2. Estilos de Fondo Mejorados:</w:t>
+      </w:r>
+    </w:p>
+    <w:p>
+      <w:pPr>
+        <w:numPr>
+          <w:ilvl w:val="0"/>
+          <w:numId w:val="31"/>
+        </w:numPr>
+        <w:spacing w:after="0" w:line="240" w:lineRule="auto"/>
+      </w:pPr>
+      <w:r>
+        <w:rPr>
+          <w:rFonts w:ascii="Segoe UI Emoji" w:hAnsi="Segoe UI Emoji" w:cs="Segoe UI Emoji"/>
+        </w:rPr>
+        <w:t>✅</w:t>
+      </w:r>
+      <w:r>
+        <w:t> </w:t>
+      </w:r>
+      <w:proofErr w:type="spellStart"/>
+      <w:r>
+        <w:rPr>
+          <w:b/>
+          <w:bCs/>
+        </w:rPr>
+        <w:t>Header</w:t>
+      </w:r>
+      <w:proofErr w:type="spellEnd"/>
+      <w:r>
+        <w:rPr>
+          <w:b/>
+          <w:bCs/>
+        </w:rPr>
+        <w:t xml:space="preserve"> modal:</w:t>
+      </w:r>
+      <w:r>
+        <w:t> Gradiente verde (#28a745 a #20c997)</w:t>
+      </w:r>
+    </w:p>
+    <w:p>
+      <w:pPr>
+        <w:numPr>
+          <w:ilvl w:val="0"/>
+          <w:numId w:val="31"/>
+        </w:numPr>
+        <w:spacing w:after="0" w:line="240" w:lineRule="auto"/>
+      </w:pPr>
+      <w:r>
+        <w:rPr>
+          <w:rFonts w:ascii="Segoe UI Emoji" w:hAnsi="Segoe UI Emoji" w:cs="Segoe UI Emoji"/>
+        </w:rPr>
+        <w:t>✅</w:t>
+      </w:r>
+      <w:r>
+        <w:t> </w:t>
+      </w:r>
+      <w:r>
+        <w:rPr>
+          <w:b/>
+          <w:bCs/>
+        </w:rPr>
+        <w:t xml:space="preserve">Texto </w:t>
+      </w:r>
+      <w:proofErr w:type="spellStart"/>
+      <w:r>
+        <w:rPr>
+          <w:b/>
+          <w:bCs/>
+        </w:rPr>
+        <w:t>header</w:t>
+      </w:r>
+      <w:proofErr w:type="spellEnd"/>
+      <w:r>
+        <w:rPr>
+          <w:b/>
+          <w:bCs/>
+        </w:rPr>
+        <w:t>:</w:t>
+      </w:r>
+      <w:r>
+        <w:t> Blanco </w:t>
+      </w:r>
+      <w:proofErr w:type="gramStart"/>
+      <w:r>
+        <w:t>con !</w:t>
+      </w:r>
+      <w:proofErr w:type="spellStart"/>
+      <w:r>
+        <w:t>important</w:t>
+      </w:r>
+      <w:proofErr w:type="spellEnd"/>
+      <w:proofErr w:type="gramEnd"/>
+    </w:p>
+    <w:p>
+      <w:pPr>
+        <w:numPr>
+          <w:ilvl w:val="0"/>
+          <w:numId w:val="31"/>
+        </w:numPr>
+        <w:spacing w:after="0" w:line="240" w:lineRule="auto"/>
+      </w:pPr>
+      <w:r>
+        <w:rPr>
+          <w:rFonts w:ascii="Segoe UI Emoji" w:hAnsi="Segoe UI Emoji" w:cs="Segoe UI Emoji"/>
+        </w:rPr>
+        <w:t>✅</w:t>
+      </w:r>
+      <w:r>
+        <w:t> </w:t>
+      </w:r>
+      <w:r>
+        <w:rPr>
+          <w:b/>
+          <w:bCs/>
+        </w:rPr>
+        <w:t>Valores mostrados:</w:t>
+      </w:r>
+      <w:r>
+        <w:t> Fondo gris #f8f9fa con borde</w:t>
+      </w:r>
+    </w:p>
+    <w:p>
+      <w:pPr>
+        <w:numPr>
+          <w:ilvl w:val="0"/>
+          <w:numId w:val="31"/>
+        </w:numPr>
+        <w:spacing w:after="0" w:line="240" w:lineRule="auto"/>
+      </w:pPr>
+      <w:r>
+        <w:rPr>
+          <w:rFonts w:ascii="Segoe UI Emoji" w:hAnsi="Segoe UI Emoji" w:cs="Segoe UI Emoji"/>
+        </w:rPr>
+        <w:t>✅</w:t>
+      </w:r>
+      <w:r>
+        <w:t> </w:t>
+      </w:r>
+      <w:r>
+        <w:rPr>
+          <w:b/>
+          <w:bCs/>
+        </w:rPr>
+        <w:t>Input fecha:</w:t>
+      </w:r>
+      <w:r>
+        <w:t> Borde verde #28a745 con transición</w:t>
+      </w:r>
+    </w:p>
+    <w:p>
+      <w:pPr>
+        <w:numPr>
+          <w:ilvl w:val="0"/>
+          <w:numId w:val="31"/>
+        </w:numPr>
+        <w:spacing w:after="0" w:line="240" w:lineRule="auto"/>
+      </w:pPr>
+      <w:r>
+        <w:rPr>
+          <w:rFonts w:ascii="Segoe UI Emoji" w:hAnsi="Segoe UI Emoji" w:cs="Segoe UI Emoji"/>
+        </w:rPr>
+        <w:t>✅</w:t>
+      </w:r>
+      <w:r>
+        <w:t> </w:t>
+      </w:r>
+      <w:r>
+        <w:rPr>
+          <w:b/>
+          <w:bCs/>
+        </w:rPr>
+        <w:t>Botón venta:</w:t>
+      </w:r>
+      <w:r>
+        <w:t xml:space="preserve"> Efecto </w:t>
+      </w:r>
+      <w:proofErr w:type="spellStart"/>
+      <w:r>
+        <w:t>hover</w:t>
+      </w:r>
+      <w:proofErr w:type="spellEnd"/>
+      <w:r>
+        <w:t xml:space="preserve"> con sombra verde</w:t>
+      </w:r>
+    </w:p>
+    <w:p>
+      <w:pPr>
+        <w:numPr>
+          <w:ilvl w:val="0"/>
+          <w:numId w:val="31"/>
+        </w:numPr>
+        <w:spacing w:after="0" w:line="240" w:lineRule="auto"/>
+      </w:pPr>
+      <w:r>
+        <w:rPr>
+          <w:rFonts w:ascii="Segoe UI Emoji" w:hAnsi="Segoe UI Emoji" w:cs="Segoe UI Emoji"/>
+        </w:rPr>
+        <w:t>✅</w:t>
+      </w:r>
+      <w:r>
+        <w:t> </w:t>
+      </w:r>
+      <w:r>
+        <w:rPr>
+          <w:b/>
+          <w:bCs/>
+        </w:rPr>
+        <w:t>Clase aplicada:</w:t>
+      </w:r>
+      <w:r>
+        <w:t> </w:t>
+      </w:r>
+      <w:proofErr w:type="spellStart"/>
+      <w:r>
+        <w:t>styleClass</w:t>
+      </w:r>
+      <w:proofErr w:type="spellEnd"/>
+      <w:r>
+        <w:t>="venta-modal" y </w:t>
+      </w:r>
+      <w:proofErr w:type="spellStart"/>
+      <w:r>
+        <w:t>class</w:t>
+      </w:r>
+      <w:proofErr w:type="spellEnd"/>
+      <w:r>
+        <w:t>="venta-modal"</w:t>
+      </w:r>
+    </w:p>
+    <w:p>
+      <w:pPr>
+        <w:spacing w:after="0" w:line="240" w:lineRule="auto"/>
+      </w:pPr>
+    </w:p>
+    <w:p>
+      <w:pPr>
+        <w:spacing w:after="0" w:line="240" w:lineRule="auto"/>
+      </w:pPr>
+    </w:p>
+    <w:p>
+      <w:pPr>
+        <w:spacing w:after="0" w:line="240" w:lineRule="auto"/>
+      </w:pPr>
+    </w:p>
+    <w:p>
+      <w:pPr>
+        <w:spacing w:after="0" w:line="240" w:lineRule="auto"/>
+      </w:pPr>
+      <w:r>
+        <w:t xml:space="preserve">Vamos a añadir un </w:t>
+      </w:r>
+      <w:proofErr w:type="spellStart"/>
+      <w:r>
+        <w:t>boton</w:t>
+      </w:r>
+      <w:proofErr w:type="spellEnd"/>
+      <w:r>
+        <w:t xml:space="preserve"> con un ícono que represente Venta. Cuando se presione en este nuevo botón necesito que aparezca una ventana modal que servirá para registrar la venta de un bono. La pantalla modal desplegará la información básica de la </w:t>
+      </w:r>
+      <w:proofErr w:type="spellStart"/>
+      <w:r>
+        <w:t>inversion</w:t>
+      </w:r>
+      <w:proofErr w:type="spellEnd"/>
+      <w:r>
+        <w:t xml:space="preserve">, esto es: "ID", "Fecha de compra", "Fecha de </w:t>
+      </w:r>
+      <w:proofErr w:type="spellStart"/>
+      <w:r>
+        <w:t>Emision</w:t>
+      </w:r>
+      <w:proofErr w:type="spellEnd"/>
+      <w:r>
+        <w:t>", "Fecha de Vencimiento", "</w:t>
+      </w:r>
+      <w:proofErr w:type="spellStart"/>
+      <w:r>
+        <w:t>Liquidacion</w:t>
+      </w:r>
+      <w:proofErr w:type="spellEnd"/>
+      <w:r>
+        <w:t xml:space="preserve">", "Emisor", "Valor Nominal", "Capital Invertido", "Propietario", "Instrumento", "Tasa </w:t>
+      </w:r>
+      <w:proofErr w:type="spellStart"/>
+      <w:r>
+        <w:t>Interes</w:t>
+      </w:r>
+      <w:proofErr w:type="spellEnd"/>
+      <w:r>
+        <w:t>", "Rendimiento Nominal", "Tasa Mensual Real". También aparecerá una caja de texto para ingresar la fecha de venta de la inversi</w:t>
+      </w:r>
+      <w:r>
+        <w:t>ó</w:t>
+      </w:r>
+      <w:r>
+        <w:t>n</w:t>
+      </w:r>
     </w:p>
     <w:sectPr>
       <w:pgSz w:w="11906" w:h="16838"/>
@@ -11147,6 +11478,155 @@
     </w:lvl>
   </w:abstractNum>
   <w:abstractNum w:abstractNumId="29" w15:restartNumberingAfterBreak="0">
+    <w:nsid w:val="7B861452"/>
+    <w:multiLevelType w:val="multilevel"/>
+    <w:tmpl w:val="6E1ED4B4"/>
+    <w:lvl w:ilvl="0">
+      <w:start w:val="1"/>
+      <w:numFmt w:val="bullet"/>
+      <w:lvlText w:val=""/>
+      <w:lvlJc w:val="left"/>
+      <w:pPr>
+        <w:tabs>
+          <w:tab w:val="num" w:pos="720"/>
+        </w:tabs>
+        <w:ind w:left="720" w:hanging="360"/>
+      </w:pPr>
+      <w:rPr>
+        <w:rFonts w:ascii="Symbol" w:hAnsi="Symbol" w:hint="default"/>
+        <w:sz w:val="20"/>
+      </w:rPr>
+    </w:lvl>
+    <w:lvl w:ilvl="1" w:tentative="1">
+      <w:start w:val="1"/>
+      <w:numFmt w:val="bullet"/>
+      <w:lvlText w:val=""/>
+      <w:lvlJc w:val="left"/>
+      <w:pPr>
+        <w:tabs>
+          <w:tab w:val="num" w:pos="1440"/>
+        </w:tabs>
+        <w:ind w:left="1440" w:hanging="360"/>
+      </w:pPr>
+      <w:rPr>
+        <w:rFonts w:ascii="Symbol" w:hAnsi="Symbol" w:hint="default"/>
+        <w:sz w:val="20"/>
+      </w:rPr>
+    </w:lvl>
+    <w:lvl w:ilvl="2" w:tentative="1">
+      <w:start w:val="1"/>
+      <w:numFmt w:val="bullet"/>
+      <w:lvlText w:val=""/>
+      <w:lvlJc w:val="left"/>
+      <w:pPr>
+        <w:tabs>
+          <w:tab w:val="num" w:pos="2160"/>
+        </w:tabs>
+        <w:ind w:left="2160" w:hanging="360"/>
+      </w:pPr>
+      <w:rPr>
+        <w:rFonts w:ascii="Symbol" w:hAnsi="Symbol" w:hint="default"/>
+        <w:sz w:val="20"/>
+      </w:rPr>
+    </w:lvl>
+    <w:lvl w:ilvl="3" w:tentative="1">
+      <w:start w:val="1"/>
+      <w:numFmt w:val="bullet"/>
+      <w:lvlText w:val=""/>
+      <w:lvlJc w:val="left"/>
+      <w:pPr>
+        <w:tabs>
+          <w:tab w:val="num" w:pos="2880"/>
+        </w:tabs>
+        <w:ind w:left="2880" w:hanging="360"/>
+      </w:pPr>
+      <w:rPr>
+        <w:rFonts w:ascii="Symbol" w:hAnsi="Symbol" w:hint="default"/>
+        <w:sz w:val="20"/>
+      </w:rPr>
+    </w:lvl>
+    <w:lvl w:ilvl="4" w:tentative="1">
+      <w:start w:val="1"/>
+      <w:numFmt w:val="bullet"/>
+      <w:lvlText w:val=""/>
+      <w:lvlJc w:val="left"/>
+      <w:pPr>
+        <w:tabs>
+          <w:tab w:val="num" w:pos="3600"/>
+        </w:tabs>
+        <w:ind w:left="3600" w:hanging="360"/>
+      </w:pPr>
+      <w:rPr>
+        <w:rFonts w:ascii="Symbol" w:hAnsi="Symbol" w:hint="default"/>
+        <w:sz w:val="20"/>
+      </w:rPr>
+    </w:lvl>
+    <w:lvl w:ilvl="5" w:tentative="1">
+      <w:start w:val="1"/>
+      <w:numFmt w:val="bullet"/>
+      <w:lvlText w:val=""/>
+      <w:lvlJc w:val="left"/>
+      <w:pPr>
+        <w:tabs>
+          <w:tab w:val="num" w:pos="4320"/>
+        </w:tabs>
+        <w:ind w:left="4320" w:hanging="360"/>
+      </w:pPr>
+      <w:rPr>
+        <w:rFonts w:ascii="Symbol" w:hAnsi="Symbol" w:hint="default"/>
+        <w:sz w:val="20"/>
+      </w:rPr>
+    </w:lvl>
+    <w:lvl w:ilvl="6" w:tentative="1">
+      <w:start w:val="1"/>
+      <w:numFmt w:val="bullet"/>
+      <w:lvlText w:val=""/>
+      <w:lvlJc w:val="left"/>
+      <w:pPr>
+        <w:tabs>
+          <w:tab w:val="num" w:pos="5040"/>
+        </w:tabs>
+        <w:ind w:left="5040" w:hanging="360"/>
+      </w:pPr>
+      <w:rPr>
+        <w:rFonts w:ascii="Symbol" w:hAnsi="Symbol" w:hint="default"/>
+        <w:sz w:val="20"/>
+      </w:rPr>
+    </w:lvl>
+    <w:lvl w:ilvl="7" w:tentative="1">
+      <w:start w:val="1"/>
+      <w:numFmt w:val="bullet"/>
+      <w:lvlText w:val=""/>
+      <w:lvlJc w:val="left"/>
+      <w:pPr>
+        <w:tabs>
+          <w:tab w:val="num" w:pos="5760"/>
+        </w:tabs>
+        <w:ind w:left="5760" w:hanging="360"/>
+      </w:pPr>
+      <w:rPr>
+        <w:rFonts w:ascii="Symbol" w:hAnsi="Symbol" w:hint="default"/>
+        <w:sz w:val="20"/>
+      </w:rPr>
+    </w:lvl>
+    <w:lvl w:ilvl="8" w:tentative="1">
+      <w:start w:val="1"/>
+      <w:numFmt w:val="bullet"/>
+      <w:lvlText w:val=""/>
+      <w:lvlJc w:val="left"/>
+      <w:pPr>
+        <w:tabs>
+          <w:tab w:val="num" w:pos="6480"/>
+        </w:tabs>
+        <w:ind w:left="6480" w:hanging="360"/>
+      </w:pPr>
+      <w:rPr>
+        <w:rFonts w:ascii="Symbol" w:hAnsi="Symbol" w:hint="default"/>
+        <w:sz w:val="20"/>
+      </w:rPr>
+    </w:lvl>
+  </w:abstractNum>
+  <w:abstractNum w:abstractNumId="30" w15:restartNumberingAfterBreak="0">
     <w:nsid w:val="7F693EFF"/>
     <w:multiLevelType w:val="multilevel"/>
     <w:tmpl w:val="F5EADD5A"/>
@@ -11279,7 +11759,7 @@
     <w:abstractNumId w:val="19"/>
   </w:num>
   <w:num w:numId="6" w16cid:durableId="765223985">
-    <w:abstractNumId w:val="29"/>
+    <w:abstractNumId w:val="30"/>
   </w:num>
   <w:num w:numId="7" w16cid:durableId="805123109">
     <w:abstractNumId w:val="25"/>
@@ -11352,6 +11832,9 @@
   </w:num>
   <w:num w:numId="30" w16cid:durableId="1208638948">
     <w:abstractNumId w:val="8"/>
+  </w:num>
+  <w:num w:numId="31" w16cid:durableId="1108740531">
+    <w:abstractNumId w:val="29"/>
   </w:num>
   <w:numIdMacAtCleanup w:val="30"/>
 </w:numbering>

</xml_diff>

<commit_message>
SE continua con la persistena en las paginas restantes
</commit_message>
<xml_diff>
--- a/documentacion/ChatDesarrollo_001.docx
+++ b/documentacion/ChatDesarrollo_001.docx
@@ -6557,7 +6557,7 @@
       </w:pPr>
       <w:r>
         <w:pict w14:anchorId="78DA43F3">
-          <v:rect id="_x0000_i1114" style="width:0;height:0" o:hralign="center" o:hrstd="t" o:hr="t" fillcolor="#a0a0a0" stroked="f"/>
+          <v:rect id="_x0000_i1030" style="width:0;height:0" o:hralign="center" o:hrstd="t" o:hr="t" fillcolor="#a0a0a0" stroked="f"/>
         </w:pict>
       </w:r>
     </w:p>
@@ -6789,7 +6789,7 @@
       </w:pPr>
       <w:r>
         <w:pict w14:anchorId="686DC36D">
-          <v:rect id="_x0000_i1115" style="width:0;height:0" o:hralign="center" o:hrstd="t" o:hr="t" fillcolor="#a0a0a0" stroked="f"/>
+          <v:rect id="_x0000_i1031" style="width:0;height:0" o:hralign="center" o:hrstd="t" o:hr="t" fillcolor="#a0a0a0" stroked="f"/>
         </w:pict>
       </w:r>
     </w:p>
@@ -6918,7 +6918,7 @@
       </w:pPr>
       <w:r>
         <w:pict w14:anchorId="55EF1A11">
-          <v:rect id="_x0000_i1116" style="width:0;height:0" o:hralign="center" o:hrstd="t" o:hr="t" fillcolor="#a0a0a0" stroked="f"/>
+          <v:rect id="_x0000_i1032" style="width:0;height:0" o:hralign="center" o:hrstd="t" o:hr="t" fillcolor="#a0a0a0" stroked="f"/>
         </w:pict>
       </w:r>
     </w:p>
@@ -7217,7 +7217,7 @@
       </w:pPr>
       <w:r>
         <w:pict w14:anchorId="50C7E67A">
-          <v:rect id="_x0000_i1117" style="width:0;height:0" o:hralign="center" o:hrstd="t" o:hr="t" fillcolor="#a0a0a0" stroked="f"/>
+          <v:rect id="_x0000_i1033" style="width:0;height:0" o:hralign="center" o:hrstd="t" o:hr="t" fillcolor="#a0a0a0" stroked="f"/>
         </w:pict>
       </w:r>
     </w:p>
@@ -7326,7 +7326,7 @@
       </w:pPr>
       <w:r>
         <w:pict w14:anchorId="1FE1AA2B">
-          <v:rect id="_x0000_i1118" style="width:0;height:0" o:hralign="center" o:hrstd="t" o:hr="t" fillcolor="#a0a0a0" stroked="f"/>
+          <v:rect id="_x0000_i1034" style="width:0;height:0" o:hralign="center" o:hrstd="t" o:hr="t" fillcolor="#a0a0a0" stroked="f"/>
         </w:pict>
       </w:r>
     </w:p>
@@ -7525,7 +7525,7 @@
       </w:pPr>
       <w:r>
         <w:pict w14:anchorId="2F49F0EA">
-          <v:rect id="_x0000_i1119" style="width:0;height:0" o:hralign="center" o:hrstd="t" o:hr="t" fillcolor="#a0a0a0" stroked="f"/>
+          <v:rect id="_x0000_i1035" style="width:0;height:0" o:hralign="center" o:hrstd="t" o:hr="t" fillcolor="#a0a0a0" stroked="f"/>
         </w:pict>
       </w:r>
     </w:p>
@@ -8058,7 +8058,7 @@
       </w:pPr>
       <w:r>
         <w:pict w14:anchorId="42AC0AD0">
-          <v:rect id="_x0000_i1120" style="width:0;height:0" o:hralign="center" o:hrstd="t" o:hr="t" fillcolor="#a0a0a0" stroked="f"/>
+          <v:rect id="_x0000_i1036" style="width:0;height:0" o:hralign="center" o:hrstd="t" o:hr="t" fillcolor="#a0a0a0" stroked="f"/>
         </w:pict>
       </w:r>
     </w:p>
@@ -8211,7 +8211,7 @@
       </w:pPr>
       <w:r>
         <w:pict w14:anchorId="5D27A42E">
-          <v:rect id="_x0000_i1121" style="width:0;height:0" o:hralign="center" o:hrstd="t" o:hr="t" fillcolor="#a0a0a0" stroked="f"/>
+          <v:rect id="_x0000_i1037" style="width:0;height:0" o:hralign="center" o:hrstd="t" o:hr="t" fillcolor="#a0a0a0" stroked="f"/>
         </w:pict>
       </w:r>
     </w:p>
@@ -8329,7 +8329,7 @@
       </w:pPr>
       <w:r>
         <w:pict w14:anchorId="54D251A6">
-          <v:rect id="_x0000_i1122" style="width:0;height:0" o:hralign="center" o:hrstd="t" o:hr="t" fillcolor="#a0a0a0" stroked="f"/>
+          <v:rect id="_x0000_i1038" style="width:0;height:0" o:hralign="center" o:hrstd="t" o:hr="t" fillcolor="#a0a0a0" stroked="f"/>
         </w:pict>
       </w:r>
     </w:p>
@@ -8650,7 +8650,7 @@
       </w:pPr>
       <w:r>
         <w:pict w14:anchorId="23933E73">
-          <v:rect id="_x0000_i1123" style="width:0;height:0" o:hralign="center" o:hrstd="t" o:hr="t" fillcolor="#a0a0a0" stroked="f"/>
+          <v:rect id="_x0000_i1039" style="width:0;height:0" o:hralign="center" o:hrstd="t" o:hr="t" fillcolor="#a0a0a0" stroked="f"/>
         </w:pict>
       </w:r>
     </w:p>
@@ -8752,7 +8752,7 @@
       </w:pPr>
       <w:r>
         <w:pict w14:anchorId="62CF7FE4">
-          <v:rect id="_x0000_i1124" style="width:0;height:0" o:hralign="center" o:hrstd="t" o:hr="t" fillcolor="#a0a0a0" stroked="f"/>
+          <v:rect id="_x0000_i1040" style="width:0;height:0" o:hralign="center" o:hrstd="t" o:hr="t" fillcolor="#a0a0a0" stroked="f"/>
         </w:pict>
       </w:r>
     </w:p>
@@ -8857,7 +8857,7 @@
       </w:pPr>
       <w:r>
         <w:pict w14:anchorId="4D6A3DEC">
-          <v:rect id="_x0000_i1125" style="width:0;height:0" o:hralign="center" o:hrstd="t" o:hr="t" fillcolor="#a0a0a0" stroked="f"/>
+          <v:rect id="_x0000_i1041" style="width:0;height:0" o:hralign="center" o:hrstd="t" o:hr="t" fillcolor="#a0a0a0" stroked="f"/>
         </w:pict>
       </w:r>
     </w:p>
@@ -9055,7 +9055,7 @@
       </w:pPr>
       <w:r>
         <w:pict w14:anchorId="7FD65661">
-          <v:rect id="_x0000_i1126" style="width:0;height:0" o:hralign="center" o:hrstd="t" o:hr="t" fillcolor="#a0a0a0" stroked="f"/>
+          <v:rect id="_x0000_i1042" style="width:0;height:0" o:hralign="center" o:hrstd="t" o:hr="t" fillcolor="#a0a0a0" stroked="f"/>
         </w:pict>
       </w:r>
     </w:p>
@@ -9256,7 +9256,7 @@
       </w:pPr>
       <w:r>
         <w:pict w14:anchorId="5CBCCAA9">
-          <v:rect id="_x0000_i1127" style="width:0;height:0" o:hralign="center" o:hrstd="t" o:hr="t" fillcolor="#a0a0a0" stroked="f"/>
+          <v:rect id="_x0000_i1043" style="width:0;height:0" o:hralign="center" o:hrstd="t" o:hr="t" fillcolor="#a0a0a0" stroked="f"/>
         </w:pict>
       </w:r>
     </w:p>
@@ -9445,7 +9445,7 @@
       </w:pPr>
       <w:r>
         <w:pict w14:anchorId="4B2E62FB">
-          <v:rect id="_x0000_i1220" style="width:0;height:0" o:hralign="center" o:hrstd="t" o:hr="t" fillcolor="#a0a0a0" stroked="f"/>
+          <v:rect id="_x0000_i1044" style="width:0;height:0" o:hralign="center" o:hrstd="t" o:hr="t" fillcolor="#a0a0a0" stroked="f"/>
         </w:pict>
       </w:r>
     </w:p>
@@ -9812,7 +9812,7 @@
       </w:pPr>
       <w:r>
         <w:pict w14:anchorId="4D980662">
-          <v:rect id="_x0000_i1221" style="width:0;height:0" o:hralign="center" o:hrstd="t" o:hr="t" fillcolor="#a0a0a0" stroked="f"/>
+          <v:rect id="_x0000_i1045" style="width:0;height:0" o:hralign="center" o:hrstd="t" o:hr="t" fillcolor="#a0a0a0" stroked="f"/>
         </w:pict>
       </w:r>
     </w:p>
@@ -10143,7 +10143,7 @@
       <w:r>
         <w:lastRenderedPageBreak/>
         <w:pict w14:anchorId="5C39B737">
-          <v:rect id="_x0000_i1222" style="width:0;height:0" o:hralign="center" o:hrstd="t" o:hr="t" fillcolor="#a0a0a0" stroked="f"/>
+          <v:rect id="_x0000_i1046" style="width:0;height:0" o:hralign="center" o:hrstd="t" o:hr="t" fillcolor="#a0a0a0" stroked="f"/>
         </w:pict>
       </w:r>
     </w:p>
@@ -10294,7 +10294,7 @@
       </w:pPr>
       <w:r>
         <w:pict w14:anchorId="2D369C1D">
-          <v:rect id="_x0000_i1223" style="width:0;height:0" o:hralign="center" o:hrstd="t" o:hr="t" fillcolor="#a0a0a0" stroked="f"/>
+          <v:rect id="_x0000_i1047" style="width:0;height:0" o:hralign="center" o:hrstd="t" o:hr="t" fillcolor="#a0a0a0" stroked="f"/>
         </w:pict>
       </w:r>
     </w:p>
@@ -10602,7 +10602,7 @@
       </w:pPr>
       <w:r>
         <w:pict w14:anchorId="230FC3ED">
-          <v:rect id="_x0000_i1224" style="width:0;height:0" o:hralign="center" o:hrstd="t" o:hr="t" fillcolor="#a0a0a0" stroked="f"/>
+          <v:rect id="_x0000_i1048" style="width:0;height:0" o:hralign="center" o:hrstd="t" o:hr="t" fillcolor="#a0a0a0" stroked="f"/>
         </w:pict>
       </w:r>
     </w:p>
@@ -10727,7 +10727,7 @@
       </w:pPr>
       <w:r>
         <w:pict w14:anchorId="2EDC2833">
-          <v:rect id="_x0000_i1225" style="width:0;height:0" o:hralign="center" o:hrstd="t" o:hr="t" fillcolor="#a0a0a0" stroked="f"/>
+          <v:rect id="_x0000_i1049" style="width:0;height:0" o:hralign="center" o:hrstd="t" o:hr="t" fillcolor="#a0a0a0" stroked="f"/>
         </w:pict>
       </w:r>
     </w:p>
@@ -10939,7 +10939,7 @@
       </w:pPr>
       <w:r>
         <w:pict w14:anchorId="4EFF02D8">
-          <v:rect id="_x0000_i1226" style="width:0;height:0" o:hralign="center" o:hrstd="t" o:hr="t" fillcolor="#a0a0a0" stroked="f"/>
+          <v:rect id="_x0000_i1050" style="width:0;height:0" o:hralign="center" o:hrstd="t" o:hr="t" fillcolor="#a0a0a0" stroked="f"/>
         </w:pict>
       </w:r>
     </w:p>
@@ -11423,7 +11423,7 @@
       </w:pPr>
       <w:r>
         <w:pict w14:anchorId="281CFBE6">
-          <v:rect id="_x0000_i1227" style="width:0;height:0" o:hralign="center" o:hrstd="t" o:hr="t" fillcolor="#a0a0a0" stroked="f"/>
+          <v:rect id="_x0000_i1051" style="width:0;height:0" o:hralign="center" o:hrstd="t" o:hr="t" fillcolor="#a0a0a0" stroked="f"/>
         </w:pict>
       </w:r>
     </w:p>
@@ -11616,7 +11616,7 @@
       </w:pPr>
       <w:r>
         <w:pict w14:anchorId="7AF881D0">
-          <v:rect id="_x0000_i1228" style="width:0;height:0" o:hralign="center" o:hrstd="t" o:hr="t" fillcolor="#a0a0a0" stroked="f"/>
+          <v:rect id="_x0000_i1052" style="width:0;height:0" o:hralign="center" o:hrstd="t" o:hr="t" fillcolor="#a0a0a0" stroked="f"/>
         </w:pict>
       </w:r>
     </w:p>
@@ -11853,7 +11853,7 @@
       </w:pPr>
       <w:r>
         <w:pict w14:anchorId="2A9911E8">
-          <v:rect id="_x0000_i1229" style="width:0;height:0" o:hralign="center" o:hrstd="t" o:hr="t" fillcolor="#a0a0a0" stroked="f"/>
+          <v:rect id="_x0000_i1053" style="width:0;height:0" o:hralign="center" o:hrstd="t" o:hr="t" fillcolor="#a0a0a0" stroked="f"/>
         </w:pict>
       </w:r>
     </w:p>
@@ -12079,7 +12079,7 @@
       </w:pPr>
       <w:r>
         <w:pict w14:anchorId="4D50C92C">
-          <v:rect id="_x0000_i1230" style="width:0;height:0" o:hralign="center" o:hrstd="t" o:hr="t" fillcolor="#a0a0a0" stroked="f"/>
+          <v:rect id="_x0000_i1054" style="width:0;height:0" o:hralign="center" o:hrstd="t" o:hr="t" fillcolor="#a0a0a0" stroked="f"/>
         </w:pict>
       </w:r>
     </w:p>
@@ -12228,7 +12228,7 @@
       </w:pPr>
       <w:r>
         <w:pict w14:anchorId="2F42794C">
-          <v:rect id="_x0000_i1231" style="width:0;height:0" o:hralign="center" o:hrstd="t" o:hr="t" fillcolor="#a0a0a0" stroked="f"/>
+          <v:rect id="_x0000_i1055" style="width:0;height:0" o:hralign="center" o:hrstd="t" o:hr="t" fillcolor="#a0a0a0" stroked="f"/>
         </w:pict>
       </w:r>
     </w:p>
@@ -12375,7 +12375,7 @@
       </w:pPr>
       <w:r>
         <w:pict w14:anchorId="24342A0F">
-          <v:rect id="_x0000_i1232" style="width:0;height:0" o:hralign="center" o:hrstd="t" o:hr="t" fillcolor="#a0a0a0" stroked="f"/>
+          <v:rect id="_x0000_i1056" style="width:0;height:0" o:hralign="center" o:hrstd="t" o:hr="t" fillcolor="#a0a0a0" stroked="f"/>
         </w:pict>
       </w:r>
     </w:p>
@@ -12828,7 +12828,7 @@
       </w:pPr>
       <w:r>
         <w:pict w14:anchorId="6F4A0BF3">
-          <v:rect id="_x0000_i1252" style="width:0;height:0" o:hralign="center" o:hrstd="t" o:hr="t" fillcolor="#a0a0a0" stroked="f"/>
+          <v:rect id="_x0000_i1057" style="width:0;height:0" o:hralign="center" o:hrstd="t" o:hr="t" fillcolor="#a0a0a0" stroked="f"/>
         </w:pict>
       </w:r>
     </w:p>
@@ -13948,7 +13948,7 @@
       </w:pPr>
       <w:r>
         <w:pict w14:anchorId="03487DF0">
-          <v:rect id="_x0000_i1266" style="width:0;height:0" o:hralign="center" o:hrstd="t" o:hr="t" fillcolor="#a0a0a0" stroked="f"/>
+          <v:rect id="_x0000_i1058" style="width:0;height:0" o:hralign="center" o:hrstd="t" o:hr="t" fillcolor="#a0a0a0" stroked="f"/>
         </w:pict>
       </w:r>
     </w:p>
@@ -14082,7 +14082,7 @@
       </w:pPr>
       <w:r>
         <w:pict w14:anchorId="0F1410BF">
-          <v:rect id="_x0000_i1267" style="width:0;height:0" o:hralign="center" o:hrstd="t" o:hr="t" fillcolor="#a0a0a0" stroked="f"/>
+          <v:rect id="_x0000_i1059" style="width:0;height:0" o:hralign="center" o:hrstd="t" o:hr="t" fillcolor="#a0a0a0" stroked="f"/>
         </w:pict>
       </w:r>
     </w:p>
@@ -15008,7 +15008,7 @@
       </w:pPr>
       <w:r>
         <w:pict w14:anchorId="67D24CCD">
-          <v:rect id="_x0000_i1276" style="width:0;height:0" o:hralign="center" o:hrstd="t" o:hr="t" fillcolor="#a0a0a0" stroked="f"/>
+          <v:rect id="_x0000_i1060" style="width:0;height:0" o:hralign="center" o:hrstd="t" o:hr="t" fillcolor="#a0a0a0" stroked="f"/>
         </w:pict>
       </w:r>
     </w:p>
@@ -15659,7 +15659,7 @@
       </w:pPr>
       <w:r>
         <w:pict w14:anchorId="31087702">
-          <v:rect id="_x0000_i1284" style="width:0;height:0" o:hralign="center" o:hrstd="t" o:hr="t" fillcolor="#a0a0a0" stroked="f"/>
+          <v:rect id="_x0000_i1061" style="width:0;height:0" o:hralign="center" o:hrstd="t" o:hr="t" fillcolor="#a0a0a0" stroked="f"/>
         </w:pict>
       </w:r>
     </w:p>
@@ -16494,7 +16494,7 @@
       </w:pPr>
       <w:r>
         <w:pict w14:anchorId="16C593BD">
-          <v:rect id="_x0000_i1298" style="width:0;height:0" o:hralign="center" o:hrstd="t" o:hr="t" fillcolor="#a0a0a0" stroked="f"/>
+          <v:rect id="_x0000_i1062" style="width:0;height:0" o:hralign="center" o:hrstd="t" o:hr="t" fillcolor="#a0a0a0" stroked="f"/>
         </w:pict>
       </w:r>
     </w:p>
@@ -16723,7 +16723,7 @@
       </w:pPr>
       <w:r>
         <w:pict w14:anchorId="34C18138">
-          <v:rect id="_x0000_i1299" style="width:0;height:0" o:hralign="center" o:hrstd="t" o:hr="t" fillcolor="#a0a0a0" stroked="f"/>
+          <v:rect id="_x0000_i1063" style="width:0;height:0" o:hralign="center" o:hrstd="t" o:hr="t" fillcolor="#a0a0a0" stroked="f"/>
         </w:pict>
       </w:r>
     </w:p>
@@ -17528,7 +17528,7 @@
       </w:pPr>
       <w:r>
         <w:pict w14:anchorId="37B12071">
-          <v:rect id="_x0000_i1314" style="width:0;height:0" o:hralign="center" o:hrstd="t" o:hr="t" fillcolor="#a0a0a0" stroked="f"/>
+          <v:rect id="_x0000_i1064" style="width:0;height:0" o:hralign="center" o:hrstd="t" o:hr="t" fillcolor="#a0a0a0" stroked="f"/>
         </w:pict>
       </w:r>
     </w:p>
@@ -17785,7 +17785,7 @@
       </w:pPr>
       <w:r>
         <w:pict w14:anchorId="2136654C">
-          <v:rect id="_x0000_i1315" style="width:0;height:0" o:hralign="center" o:hrstd="t" o:hr="t" fillcolor="#a0a0a0" stroked="f"/>
+          <v:rect id="_x0000_i1065" style="width:0;height:0" o:hralign="center" o:hrstd="t" o:hr="t" fillcolor="#a0a0a0" stroked="f"/>
         </w:pict>
       </w:r>
     </w:p>
@@ -18158,7 +18158,7 @@
       </w:pPr>
       <w:r>
         <w:pict w14:anchorId="284E66E9">
-          <v:rect id="_x0000_i1444" style="width:0;height:0" o:hralign="center" o:hrstd="t" o:hr="t" fillcolor="#a0a0a0" stroked="f"/>
+          <v:rect id="_x0000_i1066" style="width:0;height:0" o:hralign="center" o:hrstd="t" o:hr="t" fillcolor="#a0a0a0" stroked="f"/>
         </w:pict>
       </w:r>
     </w:p>
@@ -18263,7 +18263,7 @@
       </w:pPr>
       <w:r>
         <w:pict w14:anchorId="62CEB4E3">
-          <v:rect id="_x0000_i1445" style="width:0;height:0" o:hralign="center" o:hrstd="t" o:hr="t" fillcolor="#a0a0a0" stroked="f"/>
+          <v:rect id="_x0000_i1067" style="width:0;height:0" o:hralign="center" o:hrstd="t" o:hr="t" fillcolor="#a0a0a0" stroked="f"/>
         </w:pict>
       </w:r>
     </w:p>
@@ -18407,7 +18407,7 @@
       </w:pPr>
       <w:r>
         <w:pict w14:anchorId="2EFE43CE">
-          <v:rect id="_x0000_i1446" style="width:0;height:0" o:hralign="center" o:hrstd="t" o:hr="t" fillcolor="#a0a0a0" stroked="f"/>
+          <v:rect id="_x0000_i1068" style="width:0;height:0" o:hralign="center" o:hrstd="t" o:hr="t" fillcolor="#a0a0a0" stroked="f"/>
         </w:pict>
       </w:r>
     </w:p>
@@ -18670,25 +18670,46 @@
     <w:p>
       <w:pPr>
         <w:spacing w:after="0" w:line="240" w:lineRule="auto"/>
-      </w:pPr>
-      <w:r>
-        <w:t xml:space="preserve">  id_inversion INT NOT NULL,              -- FK a inversion</w:t>
-      </w:r>
-    </w:p>
-    <w:p>
-      <w:pPr>
-        <w:spacing w:after="0" w:line="240" w:lineRule="auto"/>
+        <w:rPr>
+          <w:lang w:val="en-US"/>
+        </w:rPr>
       </w:pPr>
       <w:r>
         <w:t xml:space="preserve">  </w:t>
       </w:r>
-    </w:p>
-    <w:p>
-      <w:pPr>
-        <w:spacing w:after="0" w:line="240" w:lineRule="auto"/>
-      </w:pPr>
-      <w:r>
-        <w:t xml:space="preserve">  -- Datos de compra</w:t>
+      <w:r>
+        <w:rPr>
+          <w:lang w:val="en-US"/>
+        </w:rPr>
+        <w:t>id_inversion INT NOT NULL,              -- FK a inversion</w:t>
+      </w:r>
+    </w:p>
+    <w:p>
+      <w:pPr>
+        <w:spacing w:after="0" w:line="240" w:lineRule="auto"/>
+        <w:rPr>
+          <w:lang w:val="en-US"/>
+        </w:rPr>
+      </w:pPr>
+      <w:r>
+        <w:rPr>
+          <w:lang w:val="en-US"/>
+        </w:rPr>
+        <w:t xml:space="preserve">  </w:t>
+      </w:r>
+    </w:p>
+    <w:p>
+      <w:pPr>
+        <w:spacing w:after="0" w:line="240" w:lineRule="auto"/>
+      </w:pPr>
+      <w:r>
+        <w:rPr>
+          <w:lang w:val="en-US"/>
+        </w:rPr>
+        <w:t xml:space="preserve">  </w:t>
+      </w:r>
+      <w:r>
+        <w:t>-- Datos de compra</w:t>
       </w:r>
     </w:p>
     <w:p>
@@ -18825,7 +18846,7 @@
       </w:pPr>
       <w:r>
         <w:pict w14:anchorId="6B7BF96B">
-          <v:rect id="_x0000_i1447" style="width:0;height:0" o:hralign="center" o:hrstd="t" o:hr="t" fillcolor="#a0a0a0" stroked="f"/>
+          <v:rect id="_x0000_i1069" style="width:0;height:0" o:hralign="center" o:hrstd="t" o:hr="t" fillcolor="#a0a0a0" stroked="f"/>
         </w:pict>
       </w:r>
     </w:p>
@@ -19111,7 +19132,7 @@
       </w:pPr>
       <w:r>
         <w:pict w14:anchorId="0E1C77EF">
-          <v:rect id="_x0000_i1448" style="width:0;height:0" o:hralign="center" o:hrstd="t" o:hr="t" fillcolor="#a0a0a0" stroked="f"/>
+          <v:rect id="_x0000_i1070" style="width:0;height:0" o:hralign="center" o:hrstd="t" o:hr="t" fillcolor="#a0a0a0" stroked="f"/>
         </w:pict>
       </w:r>
     </w:p>
@@ -19322,7 +19343,7 @@
       </w:pPr>
       <w:r>
         <w:pict w14:anchorId="7531BB40">
-          <v:rect id="_x0000_i1449" style="width:0;height:0" o:hralign="center" o:hrstd="t" o:hr="t" fillcolor="#a0a0a0" stroked="f"/>
+          <v:rect id="_x0000_i1071" style="width:0;height:0" o:hralign="center" o:hrstd="t" o:hr="t" fillcolor="#a0a0a0" stroked="f"/>
         </w:pict>
       </w:r>
     </w:p>
@@ -19399,7 +19420,7 @@
       </w:pPr>
       <w:r>
         <w:pict w14:anchorId="0FE985A2">
-          <v:rect id="_x0000_i1450" style="width:0;height:0" o:hralign="center" o:hrstd="t" o:hr="t" fillcolor="#a0a0a0" stroked="f"/>
+          <v:rect id="_x0000_i1072" style="width:0;height:0" o:hralign="center" o:hrstd="t" o:hr="t" fillcolor="#a0a0a0" stroked="f"/>
         </w:pict>
       </w:r>
     </w:p>
@@ -19558,7 +19579,7 @@
       </w:pPr>
       <w:r>
         <w:pict w14:anchorId="0CB8433D">
-          <v:rect id="_x0000_i1451" style="width:0;height:0" o:hralign="center" o:hrstd="t" o:hr="t" fillcolor="#a0a0a0" stroked="f"/>
+          <v:rect id="_x0000_i1073" style="width:0;height:0" o:hralign="center" o:hrstd="t" o:hr="t" fillcolor="#a0a0a0" stroked="f"/>
         </w:pict>
       </w:r>
     </w:p>
@@ -19683,7 +19704,7 @@
       </w:pPr>
       <w:r>
         <w:pict w14:anchorId="13F83528">
-          <v:rect id="_x0000_i1452" style="width:0;height:0" o:hralign="center" o:hrstd="t" o:hr="t" fillcolor="#a0a0a0" stroked="f"/>
+          <v:rect id="_x0000_i1074" style="width:0;height:0" o:hralign="center" o:hrstd="t" o:hr="t" fillcolor="#a0a0a0" stroked="f"/>
         </w:pict>
       </w:r>
     </w:p>
@@ -19786,7 +19807,7 @@
       </w:pPr>
       <w:r>
         <w:pict w14:anchorId="341C09A3">
-          <v:rect id="_x0000_i1453" style="width:0;height:0" o:hralign="center" o:hrstd="t" o:hr="t" fillcolor="#a0a0a0" stroked="f"/>
+          <v:rect id="_x0000_i1075" style="width:0;height:0" o:hralign="center" o:hrstd="t" o:hr="t" fillcolor="#a0a0a0" stroked="f"/>
         </w:pict>
       </w:r>
     </w:p>
@@ -19879,7 +19900,7 @@
       </w:pPr>
       <w:r>
         <w:pict w14:anchorId="32AA7E58">
-          <v:rect id="_x0000_i1454" style="width:0;height:0" o:hralign="center" o:hrstd="t" o:hr="t" fillcolor="#a0a0a0" stroked="f"/>
+          <v:rect id="_x0000_i1076" style="width:0;height:0" o:hralign="center" o:hrstd="t" o:hr="t" fillcolor="#a0a0a0" stroked="f"/>
         </w:pict>
       </w:r>
     </w:p>
@@ -20284,7 +20305,7 @@
       </w:pPr>
       <w:r>
         <w:pict w14:anchorId="51BDBE6C">
-          <v:rect id="_x0000_i1455" style="width:0;height:0" o:hralign="center" o:hrstd="t" o:hr="t" fillcolor="#a0a0a0" stroked="f"/>
+          <v:rect id="_x0000_i1077" style="width:0;height:0" o:hralign="center" o:hrstd="t" o:hr="t" fillcolor="#a0a0a0" stroked="f"/>
         </w:pict>
       </w:r>
     </w:p>
@@ -20450,7 +20471,7 @@
       </w:pPr>
       <w:r>
         <w:pict w14:anchorId="773F27DF">
-          <v:rect id="_x0000_i1456" style="width:0;height:0" o:hralign="center" o:hrstd="t" o:hr="t" fillcolor="#a0a0a0" stroked="f"/>
+          <v:rect id="_x0000_i1078" style="width:0;height:0" o:hralign="center" o:hrstd="t" o:hr="t" fillcolor="#a0a0a0" stroked="f"/>
         </w:pict>
       </w:r>
     </w:p>
@@ -20683,7 +20704,7 @@
       </w:pPr>
       <w:r>
         <w:pict w14:anchorId="4CE992C4">
-          <v:rect id="_x0000_i1457" style="width:0;height:0" o:hralign="center" o:hrstd="t" o:hr="t" fillcolor="#a0a0a0" stroked="f"/>
+          <v:rect id="_x0000_i1079" style="width:0;height:0" o:hralign="center" o:hrstd="t" o:hr="t" fillcolor="#a0a0a0" stroked="f"/>
         </w:pict>
       </w:r>
     </w:p>
@@ -20960,7 +20981,7 @@
       </w:pPr>
       <w:r>
         <w:pict w14:anchorId="37B053AD">
-          <v:rect id="_x0000_i1458" style="width:0;height:0" o:hralign="center" o:hrstd="t" o:hr="t" fillcolor="#a0a0a0" stroked="f"/>
+          <v:rect id="_x0000_i1080" style="width:0;height:0" o:hralign="center" o:hrstd="t" o:hr="t" fillcolor="#a0a0a0" stroked="f"/>
         </w:pict>
       </w:r>
     </w:p>
@@ -21116,7 +21137,7 @@
       </w:pPr>
       <w:r>
         <w:pict w14:anchorId="0286F1F6">
-          <v:rect id="_x0000_i1459" style="width:0;height:0" o:hralign="center" o:hrstd="t" o:hr="t" fillcolor="#a0a0a0" stroked="f"/>
+          <v:rect id="_x0000_i1081" style="width:0;height:0" o:hralign="center" o:hrstd="t" o:hr="t" fillcolor="#a0a0a0" stroked="f"/>
         </w:pict>
       </w:r>
     </w:p>
@@ -21332,7 +21353,7 @@
       </w:pPr>
       <w:r>
         <w:pict w14:anchorId="0DFD233E">
-          <v:rect id="_x0000_i1460" style="width:0;height:0" o:hralign="center" o:hrstd="t" o:hr="t" fillcolor="#a0a0a0" stroked="f"/>
+          <v:rect id="_x0000_i1082" style="width:0;height:0" o:hralign="center" o:hrstd="t" o:hr="t" fillcolor="#a0a0a0" stroked="f"/>
         </w:pict>
       </w:r>
     </w:p>
@@ -21469,7 +21490,7 @@
       </w:pPr>
       <w:r>
         <w:pict w14:anchorId="433DAFD5">
-          <v:rect id="_x0000_i1461" style="width:0;height:0" o:hralign="center" o:hrstd="t" o:hr="t" fillcolor="#a0a0a0" stroked="f"/>
+          <v:rect id="_x0000_i1083" style="width:0;height:0" o:hralign="center" o:hrstd="t" o:hr="t" fillcolor="#a0a0a0" stroked="f"/>
         </w:pict>
       </w:r>
     </w:p>
@@ -21623,7 +21644,7 @@
       </w:pPr>
       <w:r>
         <w:pict w14:anchorId="308F5299">
-          <v:rect id="_x0000_i1462" style="width:0;height:0" o:hralign="center" o:hrstd="t" o:hr="t" fillcolor="#a0a0a0" stroked="f"/>
+          <v:rect id="_x0000_i1084" style="width:0;height:0" o:hralign="center" o:hrstd="t" o:hr="t" fillcolor="#a0a0a0" stroked="f"/>
         </w:pict>
       </w:r>
     </w:p>
@@ -21764,7 +21785,7 @@
       </w:pPr>
       <w:r>
         <w:pict w14:anchorId="056097B8">
-          <v:rect id="_x0000_i1463" style="width:0;height:0" o:hralign="center" o:hrstd="t" o:hr="t" fillcolor="#a0a0a0" stroked="f"/>
+          <v:rect id="_x0000_i1085" style="width:0;height:0" o:hralign="center" o:hrstd="t" o:hr="t" fillcolor="#a0a0a0" stroked="f"/>
         </w:pict>
       </w:r>
     </w:p>
@@ -21881,7 +21902,7 @@
       </w:pPr>
       <w:r>
         <w:pict w14:anchorId="65A9230A">
-          <v:rect id="_x0000_i1464" style="width:0;height:0" o:hralign="center" o:hrstd="t" o:hr="t" fillcolor="#a0a0a0" stroked="f"/>
+          <v:rect id="_x0000_i1086" style="width:0;height:0" o:hralign="center" o:hrstd="t" o:hr="t" fillcolor="#a0a0a0" stroked="f"/>
         </w:pict>
       </w:r>
     </w:p>
@@ -22098,6 +22119,506 @@
       <w:pPr>
         <w:spacing w:after="0" w:line="240" w:lineRule="auto"/>
       </w:pPr>
+    </w:p>
+    <w:p>
+      <w:pPr>
+        <w:spacing w:after="0" w:line="240" w:lineRule="auto"/>
+      </w:pPr>
+    </w:p>
+    <w:p>
+      <w:pPr>
+        <w:spacing w:after="0" w:line="240" w:lineRule="auto"/>
+      </w:pPr>
+      <w:r>
+        <w:t>==== ==============================</w:t>
+      </w:r>
+    </w:p>
+    <w:p>
+      <w:pPr>
+        <w:spacing w:after="0" w:line="240" w:lineRule="auto"/>
+      </w:pPr>
+    </w:p>
+    <w:p>
+      <w:pPr>
+        <w:spacing w:after="0" w:line="240" w:lineRule="auto"/>
+      </w:pPr>
+      <w:r>
+        <w:t>SE añadió persistencia en el paginador de las siguientes listas</w:t>
+      </w:r>
+    </w:p>
+    <w:p>
+      <w:pPr>
+        <w:spacing w:after="0" w:line="240" w:lineRule="auto"/>
+      </w:pPr>
+    </w:p>
+    <w:p>
+      <w:pPr>
+        <w:spacing w:after="0" w:line="240" w:lineRule="auto"/>
+      </w:pPr>
+      <w:r>
+        <w:rPr>
+          <w:b/>
+          <w:bCs/>
+        </w:rPr>
+        <w:t>Resumen final - Todos los componentes actualizados (14 tablas en total):</w:t>
+      </w:r>
+    </w:p>
+    <w:p>
+      <w:pPr>
+        <w:numPr>
+          <w:ilvl w:val="0"/>
+          <w:numId w:val="165"/>
+        </w:numPr>
+        <w:spacing w:after="0" w:line="240" w:lineRule="auto"/>
+      </w:pPr>
+      <w:r>
+        <w:rPr>
+          <w:rFonts w:ascii="Segoe UI Emoji" w:hAnsi="Segoe UI Emoji" w:cs="Segoe UI Emoji"/>
+        </w:rPr>
+        <w:t>✅</w:t>
+      </w:r>
+      <w:r>
+        <w:t xml:space="preserve"> Otros Valores</w:t>
+      </w:r>
+    </w:p>
+    <w:p>
+      <w:pPr>
+        <w:numPr>
+          <w:ilvl w:val="0"/>
+          <w:numId w:val="165"/>
+        </w:numPr>
+        <w:spacing w:after="0" w:line="240" w:lineRule="auto"/>
+      </w:pPr>
+      <w:r>
+        <w:rPr>
+          <w:rFonts w:ascii="Segoe UI Emoji" w:hAnsi="Segoe UI Emoji" w:cs="Segoe UI Emoji"/>
+        </w:rPr>
+        <w:t>✅</w:t>
+      </w:r>
+      <w:r>
+        <w:t xml:space="preserve"> Inversiones</w:t>
+      </w:r>
+    </w:p>
+    <w:p>
+      <w:pPr>
+        <w:numPr>
+          <w:ilvl w:val="0"/>
+          <w:numId w:val="165"/>
+        </w:numPr>
+        <w:spacing w:after="0" w:line="240" w:lineRule="auto"/>
+      </w:pPr>
+      <w:r>
+        <w:rPr>
+          <w:rFonts w:ascii="Segoe UI Emoji" w:hAnsi="Segoe UI Emoji" w:cs="Segoe UI Emoji"/>
+        </w:rPr>
+        <w:t>✅</w:t>
+      </w:r>
+      <w:r>
+        <w:t xml:space="preserve"> Movimientos de Capital</w:t>
+      </w:r>
+    </w:p>
+    <w:p>
+      <w:pPr>
+        <w:numPr>
+          <w:ilvl w:val="0"/>
+          <w:numId w:val="165"/>
+        </w:numPr>
+        <w:spacing w:after="0" w:line="240" w:lineRule="auto"/>
+      </w:pPr>
+      <w:r>
+        <w:rPr>
+          <w:rFonts w:ascii="Segoe UI Emoji" w:hAnsi="Segoe UI Emoji" w:cs="Segoe UI Emoji"/>
+        </w:rPr>
+        <w:t>✅</w:t>
+      </w:r>
+      <w:r>
+        <w:t xml:space="preserve"> Amortizaciones</w:t>
+      </w:r>
+    </w:p>
+    <w:p>
+      <w:pPr>
+        <w:numPr>
+          <w:ilvl w:val="0"/>
+          <w:numId w:val="165"/>
+        </w:numPr>
+        <w:spacing w:after="0" w:line="240" w:lineRule="auto"/>
+      </w:pPr>
+      <w:r>
+        <w:rPr>
+          <w:rFonts w:ascii="Segoe UI Emoji" w:hAnsi="Segoe UI Emoji" w:cs="Segoe UI Emoji"/>
+        </w:rPr>
+        <w:t>✅</w:t>
+      </w:r>
+      <w:r>
+        <w:t xml:space="preserve"> Catálogos</w:t>
+      </w:r>
+    </w:p>
+    <w:p>
+      <w:pPr>
+        <w:numPr>
+          <w:ilvl w:val="0"/>
+          <w:numId w:val="165"/>
+        </w:numPr>
+        <w:spacing w:after="0" w:line="240" w:lineRule="auto"/>
+      </w:pPr>
+      <w:r>
+        <w:rPr>
+          <w:rFonts w:ascii="Segoe UI Emoji" w:hAnsi="Segoe UI Emoji" w:cs="Segoe UI Emoji"/>
+        </w:rPr>
+        <w:t>✅</w:t>
+      </w:r>
+      <w:r>
+        <w:t xml:space="preserve"> Valores de Catálogo</w:t>
+      </w:r>
+    </w:p>
+    <w:p>
+      <w:pPr>
+        <w:numPr>
+          <w:ilvl w:val="0"/>
+          <w:numId w:val="165"/>
+        </w:numPr>
+        <w:spacing w:after="0" w:line="240" w:lineRule="auto"/>
+      </w:pPr>
+      <w:r>
+        <w:rPr>
+          <w:rFonts w:ascii="Segoe UI Emoji" w:hAnsi="Segoe UI Emoji" w:cs="Segoe UI Emoji"/>
+        </w:rPr>
+        <w:t>✅</w:t>
+      </w:r>
+      <w:r>
+        <w:t xml:space="preserve"> Cuentas Bancarias</w:t>
+      </w:r>
+    </w:p>
+    <w:p>
+      <w:pPr>
+        <w:numPr>
+          <w:ilvl w:val="0"/>
+          <w:numId w:val="165"/>
+        </w:numPr>
+        <w:spacing w:after="0" w:line="240" w:lineRule="auto"/>
+      </w:pPr>
+      <w:r>
+        <w:rPr>
+          <w:rFonts w:ascii="Segoe UI Emoji" w:hAnsi="Segoe UI Emoji" w:cs="Segoe UI Emoji"/>
+        </w:rPr>
+        <w:t>✅</w:t>
+      </w:r>
+      <w:r>
+        <w:t xml:space="preserve"> Emisores</w:t>
+      </w:r>
+    </w:p>
+    <w:p>
+      <w:pPr>
+        <w:numPr>
+          <w:ilvl w:val="0"/>
+          <w:numId w:val="165"/>
+        </w:numPr>
+        <w:spacing w:after="0" w:line="240" w:lineRule="auto"/>
+      </w:pPr>
+      <w:r>
+        <w:rPr>
+          <w:rFonts w:ascii="Segoe UI Emoji" w:hAnsi="Segoe UI Emoji" w:cs="Segoe UI Emoji"/>
+        </w:rPr>
+        <w:t>✅</w:t>
+      </w:r>
+      <w:r>
+        <w:t xml:space="preserve"> Grupos Familiares</w:t>
+      </w:r>
+    </w:p>
+    <w:p>
+      <w:pPr>
+        <w:numPr>
+          <w:ilvl w:val="0"/>
+          <w:numId w:val="165"/>
+        </w:numPr>
+        <w:spacing w:after="0" w:line="240" w:lineRule="auto"/>
+      </w:pPr>
+      <w:r>
+        <w:rPr>
+          <w:rFonts w:ascii="Segoe UI Emoji" w:hAnsi="Segoe UI Emoji" w:cs="Segoe UI Emoji"/>
+        </w:rPr>
+        <w:t>✅</w:t>
+      </w:r>
+      <w:r>
+        <w:t xml:space="preserve"> Instrumentos</w:t>
+      </w:r>
+    </w:p>
+    <w:p>
+      <w:pPr>
+        <w:numPr>
+          <w:ilvl w:val="0"/>
+          <w:numId w:val="165"/>
+        </w:numPr>
+        <w:spacing w:after="0" w:line="240" w:lineRule="auto"/>
+      </w:pPr>
+      <w:r>
+        <w:rPr>
+          <w:rFonts w:ascii="Segoe UI Emoji" w:hAnsi="Segoe UI Emoji" w:cs="Segoe UI Emoji"/>
+        </w:rPr>
+        <w:t>✅</w:t>
+      </w:r>
+      <w:r>
+        <w:t xml:space="preserve"> Personas</w:t>
+      </w:r>
+    </w:p>
+    <w:p>
+      <w:pPr>
+        <w:numPr>
+          <w:ilvl w:val="0"/>
+          <w:numId w:val="165"/>
+        </w:numPr>
+        <w:spacing w:after="0" w:line="240" w:lineRule="auto"/>
+      </w:pPr>
+      <w:r>
+        <w:rPr>
+          <w:rFonts w:ascii="Segoe UI Emoji" w:hAnsi="Segoe UI Emoji" w:cs="Segoe UI Emoji"/>
+        </w:rPr>
+        <w:lastRenderedPageBreak/>
+        <w:t>✅</w:t>
+      </w:r>
+      <w:r>
+        <w:t xml:space="preserve"> Ventas de Inversión</w:t>
+      </w:r>
+    </w:p>
+    <w:p>
+      <w:pPr>
+        <w:numPr>
+          <w:ilvl w:val="0"/>
+          <w:numId w:val="165"/>
+        </w:numPr>
+        <w:spacing w:after="0" w:line="240" w:lineRule="auto"/>
+      </w:pPr>
+      <w:r>
+        <w:rPr>
+          <w:rFonts w:ascii="Segoe UI Emoji" w:hAnsi="Segoe UI Emoji" w:cs="Segoe UI Emoji"/>
+        </w:rPr>
+        <w:t>✅</w:t>
+      </w:r>
+      <w:r>
+        <w:t xml:space="preserve"> Venta Agrupada (tabla principal)</w:t>
+      </w:r>
+    </w:p>
+    <w:p>
+      <w:pPr>
+        <w:numPr>
+          <w:ilvl w:val="0"/>
+          <w:numId w:val="165"/>
+        </w:numPr>
+        <w:spacing w:after="0" w:line="240" w:lineRule="auto"/>
+      </w:pPr>
+      <w:r>
+        <w:rPr>
+          <w:rFonts w:ascii="Segoe UI Emoji" w:hAnsi="Segoe UI Emoji" w:cs="Segoe UI Emoji"/>
+        </w:rPr>
+        <w:t>✅</w:t>
+      </w:r>
+      <w:r>
+        <w:t xml:space="preserve"> Venta Agrupada (tabla modal de previsualización)</w:t>
+      </w:r>
+    </w:p>
+    <w:p>
+      <w:pPr>
+        <w:spacing w:after="0" w:line="240" w:lineRule="auto"/>
+      </w:pPr>
+      <w:r>
+        <w:rPr>
+          <w:b/>
+          <w:bCs/>
+        </w:rPr>
+        <w:t>Claves usadas en localStorage:</w:t>
+      </w:r>
+    </w:p>
+    <w:p>
+      <w:pPr>
+        <w:numPr>
+          <w:ilvl w:val="0"/>
+          <w:numId w:val="166"/>
+        </w:numPr>
+        <w:spacing w:after="0" w:line="240" w:lineRule="auto"/>
+      </w:pPr>
+      <w:r>
+        <w:t>pagination_otrosValores</w:t>
+      </w:r>
+    </w:p>
+    <w:p>
+      <w:pPr>
+        <w:numPr>
+          <w:ilvl w:val="0"/>
+          <w:numId w:val="166"/>
+        </w:numPr>
+        <w:spacing w:after="0" w:line="240" w:lineRule="auto"/>
+      </w:pPr>
+      <w:r>
+        <w:t>pagination_inversiones</w:t>
+      </w:r>
+    </w:p>
+    <w:p>
+      <w:pPr>
+        <w:numPr>
+          <w:ilvl w:val="0"/>
+          <w:numId w:val="166"/>
+        </w:numPr>
+        <w:spacing w:after="0" w:line="240" w:lineRule="auto"/>
+      </w:pPr>
+      <w:r>
+        <w:t>pagination_movimientosCapital</w:t>
+      </w:r>
+    </w:p>
+    <w:p>
+      <w:pPr>
+        <w:numPr>
+          <w:ilvl w:val="0"/>
+          <w:numId w:val="166"/>
+        </w:numPr>
+        <w:spacing w:after="0" w:line="240" w:lineRule="auto"/>
+      </w:pPr>
+      <w:r>
+        <w:t>pagination_amortizaciones</w:t>
+      </w:r>
+    </w:p>
+    <w:p>
+      <w:pPr>
+        <w:numPr>
+          <w:ilvl w:val="0"/>
+          <w:numId w:val="166"/>
+        </w:numPr>
+        <w:spacing w:after="0" w:line="240" w:lineRule="auto"/>
+      </w:pPr>
+      <w:r>
+        <w:t>pagination_catalogos</w:t>
+      </w:r>
+    </w:p>
+    <w:p>
+      <w:pPr>
+        <w:numPr>
+          <w:ilvl w:val="0"/>
+          <w:numId w:val="166"/>
+        </w:numPr>
+        <w:spacing w:after="0" w:line="240" w:lineRule="auto"/>
+      </w:pPr>
+      <w:r>
+        <w:t>pagination_catalogoValores</w:t>
+      </w:r>
+    </w:p>
+    <w:p>
+      <w:pPr>
+        <w:numPr>
+          <w:ilvl w:val="0"/>
+          <w:numId w:val="166"/>
+        </w:numPr>
+        <w:spacing w:after="0" w:line="240" w:lineRule="auto"/>
+      </w:pPr>
+      <w:r>
+        <w:t>pagination_cuentasBancarias</w:t>
+      </w:r>
+    </w:p>
+    <w:p>
+      <w:pPr>
+        <w:numPr>
+          <w:ilvl w:val="0"/>
+          <w:numId w:val="166"/>
+        </w:numPr>
+        <w:spacing w:after="0" w:line="240" w:lineRule="auto"/>
+      </w:pPr>
+      <w:r>
+        <w:t>pagination_emisores</w:t>
+      </w:r>
+    </w:p>
+    <w:p>
+      <w:pPr>
+        <w:numPr>
+          <w:ilvl w:val="0"/>
+          <w:numId w:val="166"/>
+        </w:numPr>
+        <w:spacing w:after="0" w:line="240" w:lineRule="auto"/>
+      </w:pPr>
+      <w:r>
+        <w:t>pagination_gruposFamiliares</w:t>
+      </w:r>
+    </w:p>
+    <w:p>
+      <w:pPr>
+        <w:numPr>
+          <w:ilvl w:val="0"/>
+          <w:numId w:val="166"/>
+        </w:numPr>
+        <w:spacing w:after="0" w:line="240" w:lineRule="auto"/>
+      </w:pPr>
+      <w:r>
+        <w:t>pagination_instrumentos</w:t>
+      </w:r>
+    </w:p>
+    <w:p>
+      <w:pPr>
+        <w:numPr>
+          <w:ilvl w:val="0"/>
+          <w:numId w:val="166"/>
+        </w:numPr>
+        <w:spacing w:after="0" w:line="240" w:lineRule="auto"/>
+      </w:pPr>
+      <w:r>
+        <w:t>pagination_personas</w:t>
+      </w:r>
+    </w:p>
+    <w:p>
+      <w:pPr>
+        <w:numPr>
+          <w:ilvl w:val="0"/>
+          <w:numId w:val="166"/>
+        </w:numPr>
+        <w:spacing w:after="0" w:line="240" w:lineRule="auto"/>
+      </w:pPr>
+      <w:r>
+        <w:t>pagination_ventasInversion</w:t>
+      </w:r>
+    </w:p>
+    <w:p>
+      <w:pPr>
+        <w:numPr>
+          <w:ilvl w:val="0"/>
+          <w:numId w:val="166"/>
+        </w:numPr>
+        <w:spacing w:after="0" w:line="240" w:lineRule="auto"/>
+      </w:pPr>
+      <w:r>
+        <w:t>pagination_ventaAgrupada</w:t>
+      </w:r>
+    </w:p>
+    <w:p>
+      <w:pPr>
+        <w:numPr>
+          <w:ilvl w:val="0"/>
+          <w:numId w:val="166"/>
+        </w:numPr>
+        <w:spacing w:after="0" w:line="240" w:lineRule="auto"/>
+      </w:pPr>
+      <w:r>
+        <w:t>pagination_ventaAgrupadaModal</w:t>
+      </w:r>
+    </w:p>
+    <w:p>
+      <w:pPr>
+        <w:spacing w:after="0" w:line="240" w:lineRule="auto"/>
+      </w:pPr>
+      <w:r>
+        <w:t>Ahora todos los paginadores del sistema mantienen la configuración seleccionada por el usuario al navegar entre páginas.</w:t>
+      </w:r>
+    </w:p>
+    <w:p>
+      <w:pPr>
+        <w:spacing w:after="0" w:line="240" w:lineRule="auto"/>
+      </w:pPr>
+      <w:r>
+        <w:t>Feedback submitted</w:t>
+      </w:r>
+    </w:p>
+    <w:p>
+      <w:pPr>
+        <w:spacing w:after="0" w:line="240" w:lineRule="auto"/>
+      </w:pPr>
+      <w:r>
+        <w:t>Command Awaiting Approval</w:t>
+      </w:r>
     </w:p>
     <w:sectPr>
       <w:pgSz w:w="11906" w:h="16838"/>
@@ -25283,6 +25804,119 @@
     </w:lvl>
   </w:abstractNum>
   <w:abstractNum w:abstractNumId="22" w15:restartNumberingAfterBreak="0">
+    <w:nsid w:val="0EC26A78"/>
+    <w:multiLevelType w:val="multilevel"/>
+    <w:tmpl w:val="AE0C8D8A"/>
+    <w:lvl w:ilvl="0">
+      <w:start w:val="1"/>
+      <w:numFmt w:val="decimal"/>
+      <w:lvlText w:val="%1."/>
+      <w:lvlJc w:val="left"/>
+      <w:pPr>
+        <w:tabs>
+          <w:tab w:val="num" w:pos="720"/>
+        </w:tabs>
+        <w:ind w:left="720" w:hanging="360"/>
+      </w:pPr>
+    </w:lvl>
+    <w:lvl w:ilvl="1" w:tentative="1">
+      <w:start w:val="1"/>
+      <w:numFmt w:val="decimal"/>
+      <w:lvlText w:val="%2."/>
+      <w:lvlJc w:val="left"/>
+      <w:pPr>
+        <w:tabs>
+          <w:tab w:val="num" w:pos="1440"/>
+        </w:tabs>
+        <w:ind w:left="1440" w:hanging="360"/>
+      </w:pPr>
+    </w:lvl>
+    <w:lvl w:ilvl="2" w:tentative="1">
+      <w:start w:val="1"/>
+      <w:numFmt w:val="decimal"/>
+      <w:lvlText w:val="%3."/>
+      <w:lvlJc w:val="left"/>
+      <w:pPr>
+        <w:tabs>
+          <w:tab w:val="num" w:pos="2160"/>
+        </w:tabs>
+        <w:ind w:left="2160" w:hanging="360"/>
+      </w:pPr>
+    </w:lvl>
+    <w:lvl w:ilvl="3" w:tentative="1">
+      <w:start w:val="1"/>
+      <w:numFmt w:val="decimal"/>
+      <w:lvlText w:val="%4."/>
+      <w:lvlJc w:val="left"/>
+      <w:pPr>
+        <w:tabs>
+          <w:tab w:val="num" w:pos="2880"/>
+        </w:tabs>
+        <w:ind w:left="2880" w:hanging="360"/>
+      </w:pPr>
+    </w:lvl>
+    <w:lvl w:ilvl="4" w:tentative="1">
+      <w:start w:val="1"/>
+      <w:numFmt w:val="decimal"/>
+      <w:lvlText w:val="%5."/>
+      <w:lvlJc w:val="left"/>
+      <w:pPr>
+        <w:tabs>
+          <w:tab w:val="num" w:pos="3600"/>
+        </w:tabs>
+        <w:ind w:left="3600" w:hanging="360"/>
+      </w:pPr>
+    </w:lvl>
+    <w:lvl w:ilvl="5" w:tentative="1">
+      <w:start w:val="1"/>
+      <w:numFmt w:val="decimal"/>
+      <w:lvlText w:val="%6."/>
+      <w:lvlJc w:val="left"/>
+      <w:pPr>
+        <w:tabs>
+          <w:tab w:val="num" w:pos="4320"/>
+        </w:tabs>
+        <w:ind w:left="4320" w:hanging="360"/>
+      </w:pPr>
+    </w:lvl>
+    <w:lvl w:ilvl="6" w:tentative="1">
+      <w:start w:val="1"/>
+      <w:numFmt w:val="decimal"/>
+      <w:lvlText w:val="%7."/>
+      <w:lvlJc w:val="left"/>
+      <w:pPr>
+        <w:tabs>
+          <w:tab w:val="num" w:pos="5040"/>
+        </w:tabs>
+        <w:ind w:left="5040" w:hanging="360"/>
+      </w:pPr>
+    </w:lvl>
+    <w:lvl w:ilvl="7" w:tentative="1">
+      <w:start w:val="1"/>
+      <w:numFmt w:val="decimal"/>
+      <w:lvlText w:val="%8."/>
+      <w:lvlJc w:val="left"/>
+      <w:pPr>
+        <w:tabs>
+          <w:tab w:val="num" w:pos="5760"/>
+        </w:tabs>
+        <w:ind w:left="5760" w:hanging="360"/>
+      </w:pPr>
+    </w:lvl>
+    <w:lvl w:ilvl="8" w:tentative="1">
+      <w:start w:val="1"/>
+      <w:numFmt w:val="decimal"/>
+      <w:lvlText w:val="%9."/>
+      <w:lvlJc w:val="left"/>
+      <w:pPr>
+        <w:tabs>
+          <w:tab w:val="num" w:pos="6480"/>
+        </w:tabs>
+        <w:ind w:left="6480" w:hanging="360"/>
+      </w:pPr>
+    </w:lvl>
+  </w:abstractNum>
+  <w:abstractNum w:abstractNumId="23" w15:restartNumberingAfterBreak="0">
     <w:nsid w:val="0F6E2811"/>
     <w:multiLevelType w:val="multilevel"/>
     <w:tmpl w:val="784EDC46"/>
@@ -25431,7 +26065,7 @@
       </w:rPr>
     </w:lvl>
   </w:abstractNum>
-  <w:abstractNum w:abstractNumId="23" w15:restartNumberingAfterBreak="0">
+  <w:abstractNum w:abstractNumId="24" w15:restartNumberingAfterBreak="0">
     <w:nsid w:val="101828BD"/>
     <w:multiLevelType w:val="multilevel"/>
     <w:tmpl w:val="0C2EB4A8"/>
@@ -25580,7 +26214,7 @@
       </w:rPr>
     </w:lvl>
   </w:abstractNum>
-  <w:abstractNum w:abstractNumId="24" w15:restartNumberingAfterBreak="0">
+  <w:abstractNum w:abstractNumId="25" w15:restartNumberingAfterBreak="0">
     <w:nsid w:val="114A06D7"/>
     <w:multiLevelType w:val="multilevel"/>
     <w:tmpl w:val="0B58B30C"/>
@@ -25729,7 +26363,7 @@
       </w:rPr>
     </w:lvl>
   </w:abstractNum>
-  <w:abstractNum w:abstractNumId="25" w15:restartNumberingAfterBreak="0">
+  <w:abstractNum w:abstractNumId="26" w15:restartNumberingAfterBreak="0">
     <w:nsid w:val="12225D9D"/>
     <w:multiLevelType w:val="multilevel"/>
     <w:tmpl w:val="1EC60532"/>
@@ -25878,7 +26512,7 @@
       </w:rPr>
     </w:lvl>
   </w:abstractNum>
-  <w:abstractNum w:abstractNumId="26" w15:restartNumberingAfterBreak="0">
+  <w:abstractNum w:abstractNumId="27" w15:restartNumberingAfterBreak="0">
     <w:nsid w:val="13BF333E"/>
     <w:multiLevelType w:val="multilevel"/>
     <w:tmpl w:val="294CBFC6"/>
@@ -26027,7 +26661,7 @@
       </w:rPr>
     </w:lvl>
   </w:abstractNum>
-  <w:abstractNum w:abstractNumId="27" w15:restartNumberingAfterBreak="0">
+  <w:abstractNum w:abstractNumId="28" w15:restartNumberingAfterBreak="0">
     <w:nsid w:val="13FA0DF9"/>
     <w:multiLevelType w:val="multilevel"/>
     <w:tmpl w:val="58B80882"/>
@@ -26176,7 +26810,7 @@
       </w:rPr>
     </w:lvl>
   </w:abstractNum>
-  <w:abstractNum w:abstractNumId="28" w15:restartNumberingAfterBreak="0">
+  <w:abstractNum w:abstractNumId="29" w15:restartNumberingAfterBreak="0">
     <w:nsid w:val="145E0A9F"/>
     <w:multiLevelType w:val="multilevel"/>
     <w:tmpl w:val="63620500"/>
@@ -26289,7 +26923,7 @@
       </w:pPr>
     </w:lvl>
   </w:abstractNum>
-  <w:abstractNum w:abstractNumId="29" w15:restartNumberingAfterBreak="0">
+  <w:abstractNum w:abstractNumId="30" w15:restartNumberingAfterBreak="0">
     <w:nsid w:val="14D573BE"/>
     <w:multiLevelType w:val="multilevel"/>
     <w:tmpl w:val="1256E958"/>
@@ -26438,7 +27072,7 @@
       </w:rPr>
     </w:lvl>
   </w:abstractNum>
-  <w:abstractNum w:abstractNumId="30" w15:restartNumberingAfterBreak="0">
+  <w:abstractNum w:abstractNumId="31" w15:restartNumberingAfterBreak="0">
     <w:nsid w:val="17524C64"/>
     <w:multiLevelType w:val="multilevel"/>
     <w:tmpl w:val="B6BCDBBE"/>
@@ -26587,7 +27221,7 @@
       </w:rPr>
     </w:lvl>
   </w:abstractNum>
-  <w:abstractNum w:abstractNumId="31" w15:restartNumberingAfterBreak="0">
+  <w:abstractNum w:abstractNumId="32" w15:restartNumberingAfterBreak="0">
     <w:nsid w:val="177C1586"/>
     <w:multiLevelType w:val="multilevel"/>
     <w:tmpl w:val="B6F423DE"/>
@@ -26736,7 +27370,7 @@
       </w:rPr>
     </w:lvl>
   </w:abstractNum>
-  <w:abstractNum w:abstractNumId="32" w15:restartNumberingAfterBreak="0">
+  <w:abstractNum w:abstractNumId="33" w15:restartNumberingAfterBreak="0">
     <w:nsid w:val="182B5895"/>
     <w:multiLevelType w:val="multilevel"/>
     <w:tmpl w:val="2C26257C"/>
@@ -26885,7 +27519,7 @@
       </w:rPr>
     </w:lvl>
   </w:abstractNum>
-  <w:abstractNum w:abstractNumId="33" w15:restartNumberingAfterBreak="0">
+  <w:abstractNum w:abstractNumId="34" w15:restartNumberingAfterBreak="0">
     <w:nsid w:val="18C624E5"/>
     <w:multiLevelType w:val="multilevel"/>
     <w:tmpl w:val="6206FBF0"/>
@@ -27034,7 +27668,7 @@
       </w:rPr>
     </w:lvl>
   </w:abstractNum>
-  <w:abstractNum w:abstractNumId="34" w15:restartNumberingAfterBreak="0">
+  <w:abstractNum w:abstractNumId="35" w15:restartNumberingAfterBreak="0">
     <w:nsid w:val="1AA600F3"/>
     <w:multiLevelType w:val="multilevel"/>
     <w:tmpl w:val="AD5E5BBC"/>
@@ -27122,7 +27756,7 @@
       </w:pPr>
     </w:lvl>
   </w:abstractNum>
-  <w:abstractNum w:abstractNumId="35" w15:restartNumberingAfterBreak="0">
+  <w:abstractNum w:abstractNumId="36" w15:restartNumberingAfterBreak="0">
     <w:nsid w:val="1AC23B98"/>
     <w:multiLevelType w:val="hybridMultilevel"/>
     <w:tmpl w:val="1424EABA"/>
@@ -27235,7 +27869,7 @@
       </w:rPr>
     </w:lvl>
   </w:abstractNum>
-  <w:abstractNum w:abstractNumId="36" w15:restartNumberingAfterBreak="0">
+  <w:abstractNum w:abstractNumId="37" w15:restartNumberingAfterBreak="0">
     <w:nsid w:val="1AF85A20"/>
     <w:multiLevelType w:val="multilevel"/>
     <w:tmpl w:val="80D4E76C"/>
@@ -27384,7 +28018,7 @@
       </w:rPr>
     </w:lvl>
   </w:abstractNum>
-  <w:abstractNum w:abstractNumId="37" w15:restartNumberingAfterBreak="0">
+  <w:abstractNum w:abstractNumId="38" w15:restartNumberingAfterBreak="0">
     <w:nsid w:val="1B0B1D04"/>
     <w:multiLevelType w:val="hybridMultilevel"/>
     <w:tmpl w:val="879285E0"/>
@@ -27497,7 +28131,7 @@
       </w:rPr>
     </w:lvl>
   </w:abstractNum>
-  <w:abstractNum w:abstractNumId="38" w15:restartNumberingAfterBreak="0">
+  <w:abstractNum w:abstractNumId="39" w15:restartNumberingAfterBreak="0">
     <w:nsid w:val="1B362620"/>
     <w:multiLevelType w:val="multilevel"/>
     <w:tmpl w:val="890042F4"/>
@@ -27646,7 +28280,7 @@
       </w:rPr>
     </w:lvl>
   </w:abstractNum>
-  <w:abstractNum w:abstractNumId="39" w15:restartNumberingAfterBreak="0">
+  <w:abstractNum w:abstractNumId="40" w15:restartNumberingAfterBreak="0">
     <w:nsid w:val="1CC30D97"/>
     <w:multiLevelType w:val="multilevel"/>
     <w:tmpl w:val="FF3A1F0A"/>
@@ -27795,7 +28429,7 @@
       </w:rPr>
     </w:lvl>
   </w:abstractNum>
-  <w:abstractNum w:abstractNumId="40" w15:restartNumberingAfterBreak="0">
+  <w:abstractNum w:abstractNumId="41" w15:restartNumberingAfterBreak="0">
     <w:nsid w:val="2099475B"/>
     <w:multiLevelType w:val="multilevel"/>
     <w:tmpl w:val="6012FB24"/>
@@ -27944,7 +28578,7 @@
       </w:rPr>
     </w:lvl>
   </w:abstractNum>
-  <w:abstractNum w:abstractNumId="41" w15:restartNumberingAfterBreak="0">
+  <w:abstractNum w:abstractNumId="42" w15:restartNumberingAfterBreak="0">
     <w:nsid w:val="20E76B60"/>
     <w:multiLevelType w:val="multilevel"/>
     <w:tmpl w:val="2FA67BB8"/>
@@ -28093,7 +28727,7 @@
       </w:rPr>
     </w:lvl>
   </w:abstractNum>
-  <w:abstractNum w:abstractNumId="42" w15:restartNumberingAfterBreak="0">
+  <w:abstractNum w:abstractNumId="43" w15:restartNumberingAfterBreak="0">
     <w:nsid w:val="21C07AEA"/>
     <w:multiLevelType w:val="multilevel"/>
     <w:tmpl w:val="71A8B34E"/>
@@ -28242,7 +28876,7 @@
       </w:rPr>
     </w:lvl>
   </w:abstractNum>
-  <w:abstractNum w:abstractNumId="43" w15:restartNumberingAfterBreak="0">
+  <w:abstractNum w:abstractNumId="44" w15:restartNumberingAfterBreak="0">
     <w:nsid w:val="2291515C"/>
     <w:multiLevelType w:val="multilevel"/>
     <w:tmpl w:val="00F0615C"/>
@@ -28391,7 +29025,7 @@
       </w:rPr>
     </w:lvl>
   </w:abstractNum>
-  <w:abstractNum w:abstractNumId="44" w15:restartNumberingAfterBreak="0">
+  <w:abstractNum w:abstractNumId="45" w15:restartNumberingAfterBreak="0">
     <w:nsid w:val="23436B61"/>
     <w:multiLevelType w:val="multilevel"/>
     <w:tmpl w:val="5B9E437E"/>
@@ -28540,7 +29174,7 @@
       </w:rPr>
     </w:lvl>
   </w:abstractNum>
-  <w:abstractNum w:abstractNumId="45" w15:restartNumberingAfterBreak="0">
+  <w:abstractNum w:abstractNumId="46" w15:restartNumberingAfterBreak="0">
     <w:nsid w:val="24434ED4"/>
     <w:multiLevelType w:val="multilevel"/>
     <w:tmpl w:val="E5F81FDE"/>
@@ -28689,7 +29323,7 @@
       </w:rPr>
     </w:lvl>
   </w:abstractNum>
-  <w:abstractNum w:abstractNumId="46" w15:restartNumberingAfterBreak="0">
+  <w:abstractNum w:abstractNumId="47" w15:restartNumberingAfterBreak="0">
     <w:nsid w:val="26153430"/>
     <w:multiLevelType w:val="multilevel"/>
     <w:tmpl w:val="B3126368"/>
@@ -28838,7 +29472,7 @@
       </w:rPr>
     </w:lvl>
   </w:abstractNum>
-  <w:abstractNum w:abstractNumId="47" w15:restartNumberingAfterBreak="0">
+  <w:abstractNum w:abstractNumId="48" w15:restartNumberingAfterBreak="0">
     <w:nsid w:val="274B0FB3"/>
     <w:multiLevelType w:val="multilevel"/>
     <w:tmpl w:val="D436D1F2"/>
@@ -28987,7 +29621,7 @@
       </w:rPr>
     </w:lvl>
   </w:abstractNum>
-  <w:abstractNum w:abstractNumId="48" w15:restartNumberingAfterBreak="0">
+  <w:abstractNum w:abstractNumId="49" w15:restartNumberingAfterBreak="0">
     <w:nsid w:val="278559B4"/>
     <w:multiLevelType w:val="multilevel"/>
     <w:tmpl w:val="3368A96E"/>
@@ -29136,7 +29770,7 @@
       </w:rPr>
     </w:lvl>
   </w:abstractNum>
-  <w:abstractNum w:abstractNumId="49" w15:restartNumberingAfterBreak="0">
+  <w:abstractNum w:abstractNumId="50" w15:restartNumberingAfterBreak="0">
     <w:nsid w:val="27A17634"/>
     <w:multiLevelType w:val="multilevel"/>
     <w:tmpl w:val="031C86E8"/>
@@ -29285,7 +29919,7 @@
       </w:rPr>
     </w:lvl>
   </w:abstractNum>
-  <w:abstractNum w:abstractNumId="50" w15:restartNumberingAfterBreak="0">
+  <w:abstractNum w:abstractNumId="51" w15:restartNumberingAfterBreak="0">
     <w:nsid w:val="27EB1A49"/>
     <w:multiLevelType w:val="multilevel"/>
     <w:tmpl w:val="3F203782"/>
@@ -29434,7 +30068,7 @@
       </w:rPr>
     </w:lvl>
   </w:abstractNum>
-  <w:abstractNum w:abstractNumId="51" w15:restartNumberingAfterBreak="0">
+  <w:abstractNum w:abstractNumId="52" w15:restartNumberingAfterBreak="0">
     <w:nsid w:val="27FB704C"/>
     <w:multiLevelType w:val="multilevel"/>
     <w:tmpl w:val="A56CB730"/>
@@ -29583,7 +30217,7 @@
       </w:rPr>
     </w:lvl>
   </w:abstractNum>
-  <w:abstractNum w:abstractNumId="52" w15:restartNumberingAfterBreak="0">
+  <w:abstractNum w:abstractNumId="53" w15:restartNumberingAfterBreak="0">
     <w:nsid w:val="27FC2460"/>
     <w:multiLevelType w:val="multilevel"/>
     <w:tmpl w:val="607615A2"/>
@@ -29732,7 +30366,7 @@
       </w:rPr>
     </w:lvl>
   </w:abstractNum>
-  <w:abstractNum w:abstractNumId="53" w15:restartNumberingAfterBreak="0">
+  <w:abstractNum w:abstractNumId="54" w15:restartNumberingAfterBreak="0">
     <w:nsid w:val="2A2A397D"/>
     <w:multiLevelType w:val="multilevel"/>
     <w:tmpl w:val="7DB02EE2"/>
@@ -29845,7 +30479,7 @@
       </w:pPr>
     </w:lvl>
   </w:abstractNum>
-  <w:abstractNum w:abstractNumId="54" w15:restartNumberingAfterBreak="0">
+  <w:abstractNum w:abstractNumId="55" w15:restartNumberingAfterBreak="0">
     <w:nsid w:val="2AE54FFC"/>
     <w:multiLevelType w:val="multilevel"/>
     <w:tmpl w:val="7D42DE4E"/>
@@ -29994,7 +30628,156 @@
       </w:rPr>
     </w:lvl>
   </w:abstractNum>
-  <w:abstractNum w:abstractNumId="55" w15:restartNumberingAfterBreak="0">
+  <w:abstractNum w:abstractNumId="56" w15:restartNumberingAfterBreak="0">
+    <w:nsid w:val="2C101971"/>
+    <w:multiLevelType w:val="multilevel"/>
+    <w:tmpl w:val="5094B298"/>
+    <w:lvl w:ilvl="0">
+      <w:start w:val="1"/>
+      <w:numFmt w:val="bullet"/>
+      <w:lvlText w:val=""/>
+      <w:lvlJc w:val="left"/>
+      <w:pPr>
+        <w:tabs>
+          <w:tab w:val="num" w:pos="720"/>
+        </w:tabs>
+        <w:ind w:left="720" w:hanging="360"/>
+      </w:pPr>
+      <w:rPr>
+        <w:rFonts w:ascii="Symbol" w:hAnsi="Symbol" w:hint="default"/>
+        <w:sz w:val="20"/>
+      </w:rPr>
+    </w:lvl>
+    <w:lvl w:ilvl="1" w:tentative="1">
+      <w:start w:val="1"/>
+      <w:numFmt w:val="bullet"/>
+      <w:lvlText w:val=""/>
+      <w:lvlJc w:val="left"/>
+      <w:pPr>
+        <w:tabs>
+          <w:tab w:val="num" w:pos="1440"/>
+        </w:tabs>
+        <w:ind w:left="1440" w:hanging="360"/>
+      </w:pPr>
+      <w:rPr>
+        <w:rFonts w:ascii="Symbol" w:hAnsi="Symbol" w:hint="default"/>
+        <w:sz w:val="20"/>
+      </w:rPr>
+    </w:lvl>
+    <w:lvl w:ilvl="2" w:tentative="1">
+      <w:start w:val="1"/>
+      <w:numFmt w:val="bullet"/>
+      <w:lvlText w:val=""/>
+      <w:lvlJc w:val="left"/>
+      <w:pPr>
+        <w:tabs>
+          <w:tab w:val="num" w:pos="2160"/>
+        </w:tabs>
+        <w:ind w:left="2160" w:hanging="360"/>
+      </w:pPr>
+      <w:rPr>
+        <w:rFonts w:ascii="Symbol" w:hAnsi="Symbol" w:hint="default"/>
+        <w:sz w:val="20"/>
+      </w:rPr>
+    </w:lvl>
+    <w:lvl w:ilvl="3" w:tentative="1">
+      <w:start w:val="1"/>
+      <w:numFmt w:val="bullet"/>
+      <w:lvlText w:val=""/>
+      <w:lvlJc w:val="left"/>
+      <w:pPr>
+        <w:tabs>
+          <w:tab w:val="num" w:pos="2880"/>
+        </w:tabs>
+        <w:ind w:left="2880" w:hanging="360"/>
+      </w:pPr>
+      <w:rPr>
+        <w:rFonts w:ascii="Symbol" w:hAnsi="Symbol" w:hint="default"/>
+        <w:sz w:val="20"/>
+      </w:rPr>
+    </w:lvl>
+    <w:lvl w:ilvl="4" w:tentative="1">
+      <w:start w:val="1"/>
+      <w:numFmt w:val="bullet"/>
+      <w:lvlText w:val=""/>
+      <w:lvlJc w:val="left"/>
+      <w:pPr>
+        <w:tabs>
+          <w:tab w:val="num" w:pos="3600"/>
+        </w:tabs>
+        <w:ind w:left="3600" w:hanging="360"/>
+      </w:pPr>
+      <w:rPr>
+        <w:rFonts w:ascii="Symbol" w:hAnsi="Symbol" w:hint="default"/>
+        <w:sz w:val="20"/>
+      </w:rPr>
+    </w:lvl>
+    <w:lvl w:ilvl="5" w:tentative="1">
+      <w:start w:val="1"/>
+      <w:numFmt w:val="bullet"/>
+      <w:lvlText w:val=""/>
+      <w:lvlJc w:val="left"/>
+      <w:pPr>
+        <w:tabs>
+          <w:tab w:val="num" w:pos="4320"/>
+        </w:tabs>
+        <w:ind w:left="4320" w:hanging="360"/>
+      </w:pPr>
+      <w:rPr>
+        <w:rFonts w:ascii="Symbol" w:hAnsi="Symbol" w:hint="default"/>
+        <w:sz w:val="20"/>
+      </w:rPr>
+    </w:lvl>
+    <w:lvl w:ilvl="6" w:tentative="1">
+      <w:start w:val="1"/>
+      <w:numFmt w:val="bullet"/>
+      <w:lvlText w:val=""/>
+      <w:lvlJc w:val="left"/>
+      <w:pPr>
+        <w:tabs>
+          <w:tab w:val="num" w:pos="5040"/>
+        </w:tabs>
+        <w:ind w:left="5040" w:hanging="360"/>
+      </w:pPr>
+      <w:rPr>
+        <w:rFonts w:ascii="Symbol" w:hAnsi="Symbol" w:hint="default"/>
+        <w:sz w:val="20"/>
+      </w:rPr>
+    </w:lvl>
+    <w:lvl w:ilvl="7" w:tentative="1">
+      <w:start w:val="1"/>
+      <w:numFmt w:val="bullet"/>
+      <w:lvlText w:val=""/>
+      <w:lvlJc w:val="left"/>
+      <w:pPr>
+        <w:tabs>
+          <w:tab w:val="num" w:pos="5760"/>
+        </w:tabs>
+        <w:ind w:left="5760" w:hanging="360"/>
+      </w:pPr>
+      <w:rPr>
+        <w:rFonts w:ascii="Symbol" w:hAnsi="Symbol" w:hint="default"/>
+        <w:sz w:val="20"/>
+      </w:rPr>
+    </w:lvl>
+    <w:lvl w:ilvl="8" w:tentative="1">
+      <w:start w:val="1"/>
+      <w:numFmt w:val="bullet"/>
+      <w:lvlText w:val=""/>
+      <w:lvlJc w:val="left"/>
+      <w:pPr>
+        <w:tabs>
+          <w:tab w:val="num" w:pos="6480"/>
+        </w:tabs>
+        <w:ind w:left="6480" w:hanging="360"/>
+      </w:pPr>
+      <w:rPr>
+        <w:rFonts w:ascii="Symbol" w:hAnsi="Symbol" w:hint="default"/>
+        <w:sz w:val="20"/>
+      </w:rPr>
+    </w:lvl>
+  </w:abstractNum>
+  <w:abstractNum w:abstractNumId="57" w15:restartNumberingAfterBreak="0">
     <w:nsid w:val="2C9A424F"/>
     <w:multiLevelType w:val="multilevel"/>
     <w:tmpl w:val="11903610"/>
@@ -30143,7 +30926,7 @@
       </w:rPr>
     </w:lvl>
   </w:abstractNum>
-  <w:abstractNum w:abstractNumId="56" w15:restartNumberingAfterBreak="0">
+  <w:abstractNum w:abstractNumId="58" w15:restartNumberingAfterBreak="0">
     <w:nsid w:val="2CAB5DF1"/>
     <w:multiLevelType w:val="multilevel"/>
     <w:tmpl w:val="47504734"/>
@@ -30292,7 +31075,7 @@
       </w:rPr>
     </w:lvl>
   </w:abstractNum>
-  <w:abstractNum w:abstractNumId="57" w15:restartNumberingAfterBreak="0">
+  <w:abstractNum w:abstractNumId="59" w15:restartNumberingAfterBreak="0">
     <w:nsid w:val="2DEC7495"/>
     <w:multiLevelType w:val="multilevel"/>
     <w:tmpl w:val="915AC2BA"/>
@@ -30441,7 +31224,7 @@
       </w:rPr>
     </w:lvl>
   </w:abstractNum>
-  <w:abstractNum w:abstractNumId="58" w15:restartNumberingAfterBreak="0">
+  <w:abstractNum w:abstractNumId="60" w15:restartNumberingAfterBreak="0">
     <w:nsid w:val="2E0E0A2F"/>
     <w:multiLevelType w:val="multilevel"/>
     <w:tmpl w:val="C7E075E4"/>
@@ -30590,7 +31373,7 @@
       </w:rPr>
     </w:lvl>
   </w:abstractNum>
-  <w:abstractNum w:abstractNumId="59" w15:restartNumberingAfterBreak="0">
+  <w:abstractNum w:abstractNumId="61" w15:restartNumberingAfterBreak="0">
     <w:nsid w:val="2E28004A"/>
     <w:multiLevelType w:val="multilevel"/>
     <w:tmpl w:val="84DED33A"/>
@@ -30739,7 +31522,7 @@
       </w:rPr>
     </w:lvl>
   </w:abstractNum>
-  <w:abstractNum w:abstractNumId="60" w15:restartNumberingAfterBreak="0">
+  <w:abstractNum w:abstractNumId="62" w15:restartNumberingAfterBreak="0">
     <w:nsid w:val="2EB041D6"/>
     <w:multiLevelType w:val="multilevel"/>
     <w:tmpl w:val="FDF09326"/>
@@ -30888,7 +31671,7 @@
       </w:rPr>
     </w:lvl>
   </w:abstractNum>
-  <w:abstractNum w:abstractNumId="61" w15:restartNumberingAfterBreak="0">
+  <w:abstractNum w:abstractNumId="63" w15:restartNumberingAfterBreak="0">
     <w:nsid w:val="2F0F00E7"/>
     <w:multiLevelType w:val="multilevel"/>
     <w:tmpl w:val="8E9A28DE"/>
@@ -31037,7 +31820,7 @@
       </w:rPr>
     </w:lvl>
   </w:abstractNum>
-  <w:abstractNum w:abstractNumId="62" w15:restartNumberingAfterBreak="0">
+  <w:abstractNum w:abstractNumId="64" w15:restartNumberingAfterBreak="0">
     <w:nsid w:val="304C1262"/>
     <w:multiLevelType w:val="multilevel"/>
     <w:tmpl w:val="BC2C63D2"/>
@@ -31150,7 +31933,7 @@
       </w:pPr>
     </w:lvl>
   </w:abstractNum>
-  <w:abstractNum w:abstractNumId="63" w15:restartNumberingAfterBreak="0">
+  <w:abstractNum w:abstractNumId="65" w15:restartNumberingAfterBreak="0">
     <w:nsid w:val="327C0F1F"/>
     <w:multiLevelType w:val="multilevel"/>
     <w:tmpl w:val="78D28CD2"/>
@@ -31267,7 +32050,7 @@
       </w:pPr>
     </w:lvl>
   </w:abstractNum>
-  <w:abstractNum w:abstractNumId="64" w15:restartNumberingAfterBreak="0">
+  <w:abstractNum w:abstractNumId="66" w15:restartNumberingAfterBreak="0">
     <w:nsid w:val="34BE2B8C"/>
     <w:multiLevelType w:val="multilevel"/>
     <w:tmpl w:val="BB763A76"/>
@@ -31416,7 +32199,7 @@
       </w:rPr>
     </w:lvl>
   </w:abstractNum>
-  <w:abstractNum w:abstractNumId="65" w15:restartNumberingAfterBreak="0">
+  <w:abstractNum w:abstractNumId="67" w15:restartNumberingAfterBreak="0">
     <w:nsid w:val="355B226C"/>
     <w:multiLevelType w:val="multilevel"/>
     <w:tmpl w:val="8318D308"/>
@@ -31565,7 +32348,7 @@
       </w:rPr>
     </w:lvl>
   </w:abstractNum>
-  <w:abstractNum w:abstractNumId="66" w15:restartNumberingAfterBreak="0">
+  <w:abstractNum w:abstractNumId="68" w15:restartNumberingAfterBreak="0">
     <w:nsid w:val="36E36430"/>
     <w:multiLevelType w:val="multilevel"/>
     <w:tmpl w:val="B27E1E5C"/>
@@ -31714,7 +32497,7 @@
       </w:rPr>
     </w:lvl>
   </w:abstractNum>
-  <w:abstractNum w:abstractNumId="67" w15:restartNumberingAfterBreak="0">
+  <w:abstractNum w:abstractNumId="69" w15:restartNumberingAfterBreak="0">
     <w:nsid w:val="37C9620C"/>
     <w:multiLevelType w:val="multilevel"/>
     <w:tmpl w:val="470CF15A"/>
@@ -31863,7 +32646,7 @@
       </w:rPr>
     </w:lvl>
   </w:abstractNum>
-  <w:abstractNum w:abstractNumId="68" w15:restartNumberingAfterBreak="0">
+  <w:abstractNum w:abstractNumId="70" w15:restartNumberingAfterBreak="0">
     <w:nsid w:val="38414984"/>
     <w:multiLevelType w:val="multilevel"/>
     <w:tmpl w:val="230856B4"/>
@@ -32012,7 +32795,7 @@
       </w:rPr>
     </w:lvl>
   </w:abstractNum>
-  <w:abstractNum w:abstractNumId="69" w15:restartNumberingAfterBreak="0">
+  <w:abstractNum w:abstractNumId="71" w15:restartNumberingAfterBreak="0">
     <w:nsid w:val="3855497D"/>
     <w:multiLevelType w:val="multilevel"/>
     <w:tmpl w:val="0A2EDD9C"/>
@@ -32161,7 +32944,7 @@
       </w:rPr>
     </w:lvl>
   </w:abstractNum>
-  <w:abstractNum w:abstractNumId="70" w15:restartNumberingAfterBreak="0">
+  <w:abstractNum w:abstractNumId="72" w15:restartNumberingAfterBreak="0">
     <w:nsid w:val="38F8314A"/>
     <w:multiLevelType w:val="multilevel"/>
     <w:tmpl w:val="342E200C"/>
@@ -32310,7 +33093,7 @@
       </w:rPr>
     </w:lvl>
   </w:abstractNum>
-  <w:abstractNum w:abstractNumId="71" w15:restartNumberingAfterBreak="0">
+  <w:abstractNum w:abstractNumId="73" w15:restartNumberingAfterBreak="0">
     <w:nsid w:val="3A093B8C"/>
     <w:multiLevelType w:val="multilevel"/>
     <w:tmpl w:val="399C8EF2"/>
@@ -32459,7 +33242,7 @@
       </w:rPr>
     </w:lvl>
   </w:abstractNum>
-  <w:abstractNum w:abstractNumId="72" w15:restartNumberingAfterBreak="0">
+  <w:abstractNum w:abstractNumId="74" w15:restartNumberingAfterBreak="0">
     <w:nsid w:val="3A131AE3"/>
     <w:multiLevelType w:val="multilevel"/>
     <w:tmpl w:val="56C66A0E"/>
@@ -32608,7 +33391,7 @@
       </w:rPr>
     </w:lvl>
   </w:abstractNum>
-  <w:abstractNum w:abstractNumId="73" w15:restartNumberingAfterBreak="0">
+  <w:abstractNum w:abstractNumId="75" w15:restartNumberingAfterBreak="0">
     <w:nsid w:val="3A6571F8"/>
     <w:multiLevelType w:val="multilevel"/>
     <w:tmpl w:val="2FE277E0"/>
@@ -32757,7 +33540,7 @@
       </w:rPr>
     </w:lvl>
   </w:abstractNum>
-  <w:abstractNum w:abstractNumId="74" w15:restartNumberingAfterBreak="0">
+  <w:abstractNum w:abstractNumId="76" w15:restartNumberingAfterBreak="0">
     <w:nsid w:val="3B9E4CF6"/>
     <w:multiLevelType w:val="multilevel"/>
     <w:tmpl w:val="9E50E8DC"/>
@@ -32906,7 +33689,7 @@
       </w:rPr>
     </w:lvl>
   </w:abstractNum>
-  <w:abstractNum w:abstractNumId="75" w15:restartNumberingAfterBreak="0">
+  <w:abstractNum w:abstractNumId="77" w15:restartNumberingAfterBreak="0">
     <w:nsid w:val="3C1408C9"/>
     <w:multiLevelType w:val="multilevel"/>
     <w:tmpl w:val="5734E8CE"/>
@@ -33055,7 +33838,7 @@
       </w:rPr>
     </w:lvl>
   </w:abstractNum>
-  <w:abstractNum w:abstractNumId="76" w15:restartNumberingAfterBreak="0">
+  <w:abstractNum w:abstractNumId="78" w15:restartNumberingAfterBreak="0">
     <w:nsid w:val="3C2E706B"/>
     <w:multiLevelType w:val="multilevel"/>
     <w:tmpl w:val="1B16968C"/>
@@ -33204,7 +33987,7 @@
       </w:rPr>
     </w:lvl>
   </w:abstractNum>
-  <w:abstractNum w:abstractNumId="77" w15:restartNumberingAfterBreak="0">
+  <w:abstractNum w:abstractNumId="79" w15:restartNumberingAfterBreak="0">
     <w:nsid w:val="3C8B5EF5"/>
     <w:multiLevelType w:val="multilevel"/>
     <w:tmpl w:val="4F2800BC"/>
@@ -33353,7 +34136,7 @@
       </w:rPr>
     </w:lvl>
   </w:abstractNum>
-  <w:abstractNum w:abstractNumId="78" w15:restartNumberingAfterBreak="0">
+  <w:abstractNum w:abstractNumId="80" w15:restartNumberingAfterBreak="0">
     <w:nsid w:val="3CBB1D0D"/>
     <w:multiLevelType w:val="multilevel"/>
     <w:tmpl w:val="77F8F694"/>
@@ -33502,7 +34285,7 @@
       </w:rPr>
     </w:lvl>
   </w:abstractNum>
-  <w:abstractNum w:abstractNumId="79" w15:restartNumberingAfterBreak="0">
+  <w:abstractNum w:abstractNumId="81" w15:restartNumberingAfterBreak="0">
     <w:nsid w:val="3DF809D4"/>
     <w:multiLevelType w:val="multilevel"/>
     <w:tmpl w:val="84D43534"/>
@@ -33619,7 +34402,7 @@
       </w:pPr>
     </w:lvl>
   </w:abstractNum>
-  <w:abstractNum w:abstractNumId="80" w15:restartNumberingAfterBreak="0">
+  <w:abstractNum w:abstractNumId="82" w15:restartNumberingAfterBreak="0">
     <w:nsid w:val="411A56EF"/>
     <w:multiLevelType w:val="multilevel"/>
     <w:tmpl w:val="BF2ECD48"/>
@@ -33768,7 +34551,7 @@
       </w:rPr>
     </w:lvl>
   </w:abstractNum>
-  <w:abstractNum w:abstractNumId="81" w15:restartNumberingAfterBreak="0">
+  <w:abstractNum w:abstractNumId="83" w15:restartNumberingAfterBreak="0">
     <w:nsid w:val="42EE5F92"/>
     <w:multiLevelType w:val="multilevel"/>
     <w:tmpl w:val="43B25132"/>
@@ -33917,7 +34700,7 @@
       </w:rPr>
     </w:lvl>
   </w:abstractNum>
-  <w:abstractNum w:abstractNumId="82" w15:restartNumberingAfterBreak="0">
+  <w:abstractNum w:abstractNumId="84" w15:restartNumberingAfterBreak="0">
     <w:nsid w:val="458D6F32"/>
     <w:multiLevelType w:val="multilevel"/>
     <w:tmpl w:val="426EC3D6"/>
@@ -34030,7 +34813,7 @@
       </w:pPr>
     </w:lvl>
   </w:abstractNum>
-  <w:abstractNum w:abstractNumId="83" w15:restartNumberingAfterBreak="0">
+  <w:abstractNum w:abstractNumId="85" w15:restartNumberingAfterBreak="0">
     <w:nsid w:val="461E3AEC"/>
     <w:multiLevelType w:val="multilevel"/>
     <w:tmpl w:val="70BC461E"/>
@@ -34179,7 +34962,7 @@
       </w:rPr>
     </w:lvl>
   </w:abstractNum>
-  <w:abstractNum w:abstractNumId="84" w15:restartNumberingAfterBreak="0">
+  <w:abstractNum w:abstractNumId="86" w15:restartNumberingAfterBreak="0">
     <w:nsid w:val="46200CF5"/>
     <w:multiLevelType w:val="multilevel"/>
     <w:tmpl w:val="96828834"/>
@@ -34292,7 +35075,7 @@
       </w:pPr>
     </w:lvl>
   </w:abstractNum>
-  <w:abstractNum w:abstractNumId="85" w15:restartNumberingAfterBreak="0">
+  <w:abstractNum w:abstractNumId="87" w15:restartNumberingAfterBreak="0">
     <w:nsid w:val="46490F7E"/>
     <w:multiLevelType w:val="multilevel"/>
     <w:tmpl w:val="03A88E9E"/>
@@ -34441,7 +35224,7 @@
       </w:rPr>
     </w:lvl>
   </w:abstractNum>
-  <w:abstractNum w:abstractNumId="86" w15:restartNumberingAfterBreak="0">
+  <w:abstractNum w:abstractNumId="88" w15:restartNumberingAfterBreak="0">
     <w:nsid w:val="476A0206"/>
     <w:multiLevelType w:val="multilevel"/>
     <w:tmpl w:val="A6B046AE"/>
@@ -34590,7 +35373,7 @@
       </w:rPr>
     </w:lvl>
   </w:abstractNum>
-  <w:abstractNum w:abstractNumId="87" w15:restartNumberingAfterBreak="0">
+  <w:abstractNum w:abstractNumId="89" w15:restartNumberingAfterBreak="0">
     <w:nsid w:val="47E72499"/>
     <w:multiLevelType w:val="multilevel"/>
     <w:tmpl w:val="9B0E01DA"/>
@@ -34739,7 +35522,7 @@
       </w:rPr>
     </w:lvl>
   </w:abstractNum>
-  <w:abstractNum w:abstractNumId="88" w15:restartNumberingAfterBreak="0">
+  <w:abstractNum w:abstractNumId="90" w15:restartNumberingAfterBreak="0">
     <w:nsid w:val="48AB0A2A"/>
     <w:multiLevelType w:val="multilevel"/>
     <w:tmpl w:val="3A68FD86"/>
@@ -34888,7 +35671,7 @@
       </w:rPr>
     </w:lvl>
   </w:abstractNum>
-  <w:abstractNum w:abstractNumId="89" w15:restartNumberingAfterBreak="0">
+  <w:abstractNum w:abstractNumId="91" w15:restartNumberingAfterBreak="0">
     <w:nsid w:val="49366ACD"/>
     <w:multiLevelType w:val="multilevel"/>
     <w:tmpl w:val="FF0277F0"/>
@@ -35037,7 +35820,7 @@
       </w:rPr>
     </w:lvl>
   </w:abstractNum>
-  <w:abstractNum w:abstractNumId="90" w15:restartNumberingAfterBreak="0">
+  <w:abstractNum w:abstractNumId="92" w15:restartNumberingAfterBreak="0">
     <w:nsid w:val="49FA516B"/>
     <w:multiLevelType w:val="multilevel"/>
     <w:tmpl w:val="59AEE280"/>
@@ -35186,7 +35969,7 @@
       </w:rPr>
     </w:lvl>
   </w:abstractNum>
-  <w:abstractNum w:abstractNumId="91" w15:restartNumberingAfterBreak="0">
+  <w:abstractNum w:abstractNumId="93" w15:restartNumberingAfterBreak="0">
     <w:nsid w:val="4B4F68E1"/>
     <w:multiLevelType w:val="multilevel"/>
     <w:tmpl w:val="B1E64690"/>
@@ -35335,7 +36118,7 @@
       </w:rPr>
     </w:lvl>
   </w:abstractNum>
-  <w:abstractNum w:abstractNumId="92" w15:restartNumberingAfterBreak="0">
+  <w:abstractNum w:abstractNumId="94" w15:restartNumberingAfterBreak="0">
     <w:nsid w:val="4BEC51B2"/>
     <w:multiLevelType w:val="multilevel"/>
     <w:tmpl w:val="A4503B1A"/>
@@ -35484,7 +36267,7 @@
       </w:rPr>
     </w:lvl>
   </w:abstractNum>
-  <w:abstractNum w:abstractNumId="93" w15:restartNumberingAfterBreak="0">
+  <w:abstractNum w:abstractNumId="95" w15:restartNumberingAfterBreak="0">
     <w:nsid w:val="4D481931"/>
     <w:multiLevelType w:val="multilevel"/>
     <w:tmpl w:val="579C98A4"/>
@@ -35633,7 +36416,7 @@
       </w:rPr>
     </w:lvl>
   </w:abstractNum>
-  <w:abstractNum w:abstractNumId="94" w15:restartNumberingAfterBreak="0">
+  <w:abstractNum w:abstractNumId="96" w15:restartNumberingAfterBreak="0">
     <w:nsid w:val="4E39269D"/>
     <w:multiLevelType w:val="multilevel"/>
     <w:tmpl w:val="3ADA3A84"/>
@@ -35782,7 +36565,7 @@
       </w:rPr>
     </w:lvl>
   </w:abstractNum>
-  <w:abstractNum w:abstractNumId="95" w15:restartNumberingAfterBreak="0">
+  <w:abstractNum w:abstractNumId="97" w15:restartNumberingAfterBreak="0">
     <w:nsid w:val="4FDB568B"/>
     <w:multiLevelType w:val="multilevel"/>
     <w:tmpl w:val="A8160396"/>
@@ -35931,7 +36714,7 @@
       </w:rPr>
     </w:lvl>
   </w:abstractNum>
-  <w:abstractNum w:abstractNumId="96" w15:restartNumberingAfterBreak="0">
+  <w:abstractNum w:abstractNumId="98" w15:restartNumberingAfterBreak="0">
     <w:nsid w:val="4FFC3E17"/>
     <w:multiLevelType w:val="multilevel"/>
     <w:tmpl w:val="70085C72"/>
@@ -36080,7 +36863,7 @@
       </w:rPr>
     </w:lvl>
   </w:abstractNum>
-  <w:abstractNum w:abstractNumId="97" w15:restartNumberingAfterBreak="0">
+  <w:abstractNum w:abstractNumId="99" w15:restartNumberingAfterBreak="0">
     <w:nsid w:val="50C02085"/>
     <w:multiLevelType w:val="multilevel"/>
     <w:tmpl w:val="760C31C0"/>
@@ -36229,7 +37012,7 @@
       </w:rPr>
     </w:lvl>
   </w:abstractNum>
-  <w:abstractNum w:abstractNumId="98" w15:restartNumberingAfterBreak="0">
+  <w:abstractNum w:abstractNumId="100" w15:restartNumberingAfterBreak="0">
     <w:nsid w:val="51382377"/>
     <w:multiLevelType w:val="multilevel"/>
     <w:tmpl w:val="9906E956"/>
@@ -36378,7 +37161,7 @@
       </w:rPr>
     </w:lvl>
   </w:abstractNum>
-  <w:abstractNum w:abstractNumId="99" w15:restartNumberingAfterBreak="0">
+  <w:abstractNum w:abstractNumId="101" w15:restartNumberingAfterBreak="0">
     <w:nsid w:val="514210EE"/>
     <w:multiLevelType w:val="multilevel"/>
     <w:tmpl w:val="5A6E8FAE"/>
@@ -36527,7 +37310,7 @@
       </w:rPr>
     </w:lvl>
   </w:abstractNum>
-  <w:abstractNum w:abstractNumId="100" w15:restartNumberingAfterBreak="0">
+  <w:abstractNum w:abstractNumId="102" w15:restartNumberingAfterBreak="0">
     <w:nsid w:val="51A57CE7"/>
     <w:multiLevelType w:val="multilevel"/>
     <w:tmpl w:val="0138364A"/>
@@ -36676,7 +37459,7 @@
       </w:rPr>
     </w:lvl>
   </w:abstractNum>
-  <w:abstractNum w:abstractNumId="101" w15:restartNumberingAfterBreak="0">
+  <w:abstractNum w:abstractNumId="103" w15:restartNumberingAfterBreak="0">
     <w:nsid w:val="525C4A8D"/>
     <w:multiLevelType w:val="multilevel"/>
     <w:tmpl w:val="9F061476"/>
@@ -36825,7 +37608,7 @@
       </w:rPr>
     </w:lvl>
   </w:abstractNum>
-  <w:abstractNum w:abstractNumId="102" w15:restartNumberingAfterBreak="0">
+  <w:abstractNum w:abstractNumId="104" w15:restartNumberingAfterBreak="0">
     <w:nsid w:val="52887E87"/>
     <w:multiLevelType w:val="multilevel"/>
     <w:tmpl w:val="B64871D6"/>
@@ -36938,7 +37721,7 @@
       </w:pPr>
     </w:lvl>
   </w:abstractNum>
-  <w:abstractNum w:abstractNumId="103" w15:restartNumberingAfterBreak="0">
+  <w:abstractNum w:abstractNumId="105" w15:restartNumberingAfterBreak="0">
     <w:nsid w:val="535B110C"/>
     <w:multiLevelType w:val="multilevel"/>
     <w:tmpl w:val="67049804"/>
@@ -37087,7 +37870,7 @@
       </w:rPr>
     </w:lvl>
   </w:abstractNum>
-  <w:abstractNum w:abstractNumId="104" w15:restartNumberingAfterBreak="0">
+  <w:abstractNum w:abstractNumId="106" w15:restartNumberingAfterBreak="0">
     <w:nsid w:val="536D4C5D"/>
     <w:multiLevelType w:val="multilevel"/>
     <w:tmpl w:val="C5C83AD0"/>
@@ -37236,7 +38019,7 @@
       </w:rPr>
     </w:lvl>
   </w:abstractNum>
-  <w:abstractNum w:abstractNumId="105" w15:restartNumberingAfterBreak="0">
+  <w:abstractNum w:abstractNumId="107" w15:restartNumberingAfterBreak="0">
     <w:nsid w:val="54B84BE8"/>
     <w:multiLevelType w:val="multilevel"/>
     <w:tmpl w:val="6A8A8712"/>
@@ -37385,7 +38168,7 @@
       </w:rPr>
     </w:lvl>
   </w:abstractNum>
-  <w:abstractNum w:abstractNumId="106" w15:restartNumberingAfterBreak="0">
+  <w:abstractNum w:abstractNumId="108" w15:restartNumberingAfterBreak="0">
     <w:nsid w:val="573E1B6D"/>
     <w:multiLevelType w:val="multilevel"/>
     <w:tmpl w:val="C8785470"/>
@@ -37502,7 +38285,7 @@
       </w:pPr>
     </w:lvl>
   </w:abstractNum>
-  <w:abstractNum w:abstractNumId="107" w15:restartNumberingAfterBreak="0">
+  <w:abstractNum w:abstractNumId="109" w15:restartNumberingAfterBreak="0">
     <w:nsid w:val="580B6702"/>
     <w:multiLevelType w:val="multilevel"/>
     <w:tmpl w:val="F042B348"/>
@@ -37651,7 +38434,7 @@
       </w:rPr>
     </w:lvl>
   </w:abstractNum>
-  <w:abstractNum w:abstractNumId="108" w15:restartNumberingAfterBreak="0">
+  <w:abstractNum w:abstractNumId="110" w15:restartNumberingAfterBreak="0">
     <w:nsid w:val="582F3E53"/>
     <w:multiLevelType w:val="multilevel"/>
     <w:tmpl w:val="784C78C4"/>
@@ -37800,7 +38583,7 @@
       </w:rPr>
     </w:lvl>
   </w:abstractNum>
-  <w:abstractNum w:abstractNumId="109" w15:restartNumberingAfterBreak="0">
+  <w:abstractNum w:abstractNumId="111" w15:restartNumberingAfterBreak="0">
     <w:nsid w:val="5840677C"/>
     <w:multiLevelType w:val="multilevel"/>
     <w:tmpl w:val="AD10BBD0"/>
@@ -37949,7 +38732,7 @@
       </w:rPr>
     </w:lvl>
   </w:abstractNum>
-  <w:abstractNum w:abstractNumId="110" w15:restartNumberingAfterBreak="0">
+  <w:abstractNum w:abstractNumId="112" w15:restartNumberingAfterBreak="0">
     <w:nsid w:val="58AA305F"/>
     <w:multiLevelType w:val="multilevel"/>
     <w:tmpl w:val="BD447866"/>
@@ -38098,7 +38881,7 @@
       </w:rPr>
     </w:lvl>
   </w:abstractNum>
-  <w:abstractNum w:abstractNumId="111" w15:restartNumberingAfterBreak="0">
+  <w:abstractNum w:abstractNumId="113" w15:restartNumberingAfterBreak="0">
     <w:nsid w:val="58AD37E2"/>
     <w:multiLevelType w:val="multilevel"/>
     <w:tmpl w:val="24ECDA6A"/>
@@ -38247,7 +39030,7 @@
       </w:rPr>
     </w:lvl>
   </w:abstractNum>
-  <w:abstractNum w:abstractNumId="112" w15:restartNumberingAfterBreak="0">
+  <w:abstractNum w:abstractNumId="114" w15:restartNumberingAfterBreak="0">
     <w:nsid w:val="5960772A"/>
     <w:multiLevelType w:val="multilevel"/>
     <w:tmpl w:val="C414C0F8"/>
@@ -38364,7 +39147,7 @@
       </w:pPr>
     </w:lvl>
   </w:abstractNum>
-  <w:abstractNum w:abstractNumId="113" w15:restartNumberingAfterBreak="0">
+  <w:abstractNum w:abstractNumId="115" w15:restartNumberingAfterBreak="0">
     <w:nsid w:val="599043B9"/>
     <w:multiLevelType w:val="multilevel"/>
     <w:tmpl w:val="C71614F0"/>
@@ -38513,7 +39296,7 @@
       </w:rPr>
     </w:lvl>
   </w:abstractNum>
-  <w:abstractNum w:abstractNumId="114" w15:restartNumberingAfterBreak="0">
+  <w:abstractNum w:abstractNumId="116" w15:restartNumberingAfterBreak="0">
     <w:nsid w:val="59EB4366"/>
     <w:multiLevelType w:val="multilevel"/>
     <w:tmpl w:val="A140AF52"/>
@@ -38662,7 +39445,7 @@
       </w:rPr>
     </w:lvl>
   </w:abstractNum>
-  <w:abstractNum w:abstractNumId="115" w15:restartNumberingAfterBreak="0">
+  <w:abstractNum w:abstractNumId="117" w15:restartNumberingAfterBreak="0">
     <w:nsid w:val="5B186032"/>
     <w:multiLevelType w:val="multilevel"/>
     <w:tmpl w:val="665A00A8"/>
@@ -38811,7 +39594,7 @@
       </w:rPr>
     </w:lvl>
   </w:abstractNum>
-  <w:abstractNum w:abstractNumId="116" w15:restartNumberingAfterBreak="0">
+  <w:abstractNum w:abstractNumId="118" w15:restartNumberingAfterBreak="0">
     <w:nsid w:val="5B6753AE"/>
     <w:multiLevelType w:val="multilevel"/>
     <w:tmpl w:val="E75A2ABE"/>
@@ -38960,7 +39743,7 @@
       </w:rPr>
     </w:lvl>
   </w:abstractNum>
-  <w:abstractNum w:abstractNumId="117" w15:restartNumberingAfterBreak="0">
+  <w:abstractNum w:abstractNumId="119" w15:restartNumberingAfterBreak="0">
     <w:nsid w:val="5D2B1017"/>
     <w:multiLevelType w:val="multilevel"/>
     <w:tmpl w:val="E44A977E"/>
@@ -39109,7 +39892,7 @@
       </w:rPr>
     </w:lvl>
   </w:abstractNum>
-  <w:abstractNum w:abstractNumId="118" w15:restartNumberingAfterBreak="0">
+  <w:abstractNum w:abstractNumId="120" w15:restartNumberingAfterBreak="0">
     <w:nsid w:val="5D37461C"/>
     <w:multiLevelType w:val="multilevel"/>
     <w:tmpl w:val="D03C446A"/>
@@ -39258,7 +40041,7 @@
       </w:rPr>
     </w:lvl>
   </w:abstractNum>
-  <w:abstractNum w:abstractNumId="119" w15:restartNumberingAfterBreak="0">
+  <w:abstractNum w:abstractNumId="121" w15:restartNumberingAfterBreak="0">
     <w:nsid w:val="5E5A652B"/>
     <w:multiLevelType w:val="multilevel"/>
     <w:tmpl w:val="04267232"/>
@@ -39407,7 +40190,7 @@
       </w:rPr>
     </w:lvl>
   </w:abstractNum>
-  <w:abstractNum w:abstractNumId="120" w15:restartNumberingAfterBreak="0">
+  <w:abstractNum w:abstractNumId="122" w15:restartNumberingAfterBreak="0">
     <w:nsid w:val="5E7D3179"/>
     <w:multiLevelType w:val="multilevel"/>
     <w:tmpl w:val="3558E108"/>
@@ -39556,7 +40339,7 @@
       </w:rPr>
     </w:lvl>
   </w:abstractNum>
-  <w:abstractNum w:abstractNumId="121" w15:restartNumberingAfterBreak="0">
+  <w:abstractNum w:abstractNumId="123" w15:restartNumberingAfterBreak="0">
     <w:nsid w:val="5EA06044"/>
     <w:multiLevelType w:val="multilevel"/>
     <w:tmpl w:val="CE88AF76"/>
@@ -39669,7 +40452,7 @@
       </w:pPr>
     </w:lvl>
   </w:abstractNum>
-  <w:abstractNum w:abstractNumId="122" w15:restartNumberingAfterBreak="0">
+  <w:abstractNum w:abstractNumId="124" w15:restartNumberingAfterBreak="0">
     <w:nsid w:val="5F5A3FE2"/>
     <w:multiLevelType w:val="multilevel"/>
     <w:tmpl w:val="E398E596"/>
@@ -39818,7 +40601,7 @@
       </w:rPr>
     </w:lvl>
   </w:abstractNum>
-  <w:abstractNum w:abstractNumId="123" w15:restartNumberingAfterBreak="0">
+  <w:abstractNum w:abstractNumId="125" w15:restartNumberingAfterBreak="0">
     <w:nsid w:val="606A128E"/>
     <w:multiLevelType w:val="multilevel"/>
     <w:tmpl w:val="27A40982"/>
@@ -39931,7 +40714,7 @@
       </w:pPr>
     </w:lvl>
   </w:abstractNum>
-  <w:abstractNum w:abstractNumId="124" w15:restartNumberingAfterBreak="0">
+  <w:abstractNum w:abstractNumId="126" w15:restartNumberingAfterBreak="0">
     <w:nsid w:val="60EA4256"/>
     <w:multiLevelType w:val="multilevel"/>
     <w:tmpl w:val="3460AD88"/>
@@ -40080,7 +40863,7 @@
       </w:rPr>
     </w:lvl>
   </w:abstractNum>
-  <w:abstractNum w:abstractNumId="125" w15:restartNumberingAfterBreak="0">
+  <w:abstractNum w:abstractNumId="127" w15:restartNumberingAfterBreak="0">
     <w:nsid w:val="61A53E5A"/>
     <w:multiLevelType w:val="multilevel"/>
     <w:tmpl w:val="641C1FB8"/>
@@ -40229,7 +41012,7 @@
       </w:rPr>
     </w:lvl>
   </w:abstractNum>
-  <w:abstractNum w:abstractNumId="126" w15:restartNumberingAfterBreak="0">
+  <w:abstractNum w:abstractNumId="128" w15:restartNumberingAfterBreak="0">
     <w:nsid w:val="61AD04F7"/>
     <w:multiLevelType w:val="multilevel"/>
     <w:tmpl w:val="6A0479BC"/>
@@ -40378,7 +41161,7 @@
       </w:rPr>
     </w:lvl>
   </w:abstractNum>
-  <w:abstractNum w:abstractNumId="127" w15:restartNumberingAfterBreak="0">
+  <w:abstractNum w:abstractNumId="129" w15:restartNumberingAfterBreak="0">
     <w:nsid w:val="61DD35C4"/>
     <w:multiLevelType w:val="multilevel"/>
     <w:tmpl w:val="AFEEABE0"/>
@@ -40491,7 +41274,7 @@
       </w:pPr>
     </w:lvl>
   </w:abstractNum>
-  <w:abstractNum w:abstractNumId="128" w15:restartNumberingAfterBreak="0">
+  <w:abstractNum w:abstractNumId="130" w15:restartNumberingAfterBreak="0">
     <w:nsid w:val="63CE2007"/>
     <w:multiLevelType w:val="multilevel"/>
     <w:tmpl w:val="DB36306E"/>
@@ -40640,7 +41423,7 @@
       </w:rPr>
     </w:lvl>
   </w:abstractNum>
-  <w:abstractNum w:abstractNumId="129" w15:restartNumberingAfterBreak="0">
+  <w:abstractNum w:abstractNumId="131" w15:restartNumberingAfterBreak="0">
     <w:nsid w:val="64BA07F0"/>
     <w:multiLevelType w:val="multilevel"/>
     <w:tmpl w:val="73FABA1E"/>
@@ -40789,7 +41572,7 @@
       </w:rPr>
     </w:lvl>
   </w:abstractNum>
-  <w:abstractNum w:abstractNumId="130" w15:restartNumberingAfterBreak="0">
+  <w:abstractNum w:abstractNumId="132" w15:restartNumberingAfterBreak="0">
     <w:nsid w:val="66E942C2"/>
     <w:multiLevelType w:val="multilevel"/>
     <w:tmpl w:val="855CC1A4"/>
@@ -40938,7 +41721,7 @@
       </w:rPr>
     </w:lvl>
   </w:abstractNum>
-  <w:abstractNum w:abstractNumId="131" w15:restartNumberingAfterBreak="0">
+  <w:abstractNum w:abstractNumId="133" w15:restartNumberingAfterBreak="0">
     <w:nsid w:val="674E79F5"/>
     <w:multiLevelType w:val="multilevel"/>
     <w:tmpl w:val="EEB425D4"/>
@@ -41087,7 +41870,7 @@
       </w:rPr>
     </w:lvl>
   </w:abstractNum>
-  <w:abstractNum w:abstractNumId="132" w15:restartNumberingAfterBreak="0">
+  <w:abstractNum w:abstractNumId="134" w15:restartNumberingAfterBreak="0">
     <w:nsid w:val="69B21A40"/>
     <w:multiLevelType w:val="multilevel"/>
     <w:tmpl w:val="59E05004"/>
@@ -41236,7 +42019,7 @@
       </w:rPr>
     </w:lvl>
   </w:abstractNum>
-  <w:abstractNum w:abstractNumId="133" w15:restartNumberingAfterBreak="0">
+  <w:abstractNum w:abstractNumId="135" w15:restartNumberingAfterBreak="0">
     <w:nsid w:val="6AEC1B62"/>
     <w:multiLevelType w:val="multilevel"/>
     <w:tmpl w:val="5E2401EC"/>
@@ -41385,7 +42168,7 @@
       </w:rPr>
     </w:lvl>
   </w:abstractNum>
-  <w:abstractNum w:abstractNumId="134" w15:restartNumberingAfterBreak="0">
+  <w:abstractNum w:abstractNumId="136" w15:restartNumberingAfterBreak="0">
     <w:nsid w:val="6B710A52"/>
     <w:multiLevelType w:val="multilevel"/>
     <w:tmpl w:val="58BC7BCA"/>
@@ -41534,7 +42317,7 @@
       </w:rPr>
     </w:lvl>
   </w:abstractNum>
-  <w:abstractNum w:abstractNumId="135" w15:restartNumberingAfterBreak="0">
+  <w:abstractNum w:abstractNumId="137" w15:restartNumberingAfterBreak="0">
     <w:nsid w:val="6C292C3E"/>
     <w:multiLevelType w:val="multilevel"/>
     <w:tmpl w:val="E7C4DD04"/>
@@ -41683,7 +42466,7 @@
       </w:rPr>
     </w:lvl>
   </w:abstractNum>
-  <w:abstractNum w:abstractNumId="136" w15:restartNumberingAfterBreak="0">
+  <w:abstractNum w:abstractNumId="138" w15:restartNumberingAfterBreak="0">
     <w:nsid w:val="6CFF507C"/>
     <w:multiLevelType w:val="multilevel"/>
     <w:tmpl w:val="DFD80FC4"/>
@@ -41832,7 +42615,7 @@
       </w:rPr>
     </w:lvl>
   </w:abstractNum>
-  <w:abstractNum w:abstractNumId="137" w15:restartNumberingAfterBreak="0">
+  <w:abstractNum w:abstractNumId="139" w15:restartNumberingAfterBreak="0">
     <w:nsid w:val="6D703DCE"/>
     <w:multiLevelType w:val="multilevel"/>
     <w:tmpl w:val="919EE70C"/>
@@ -41981,7 +42764,7 @@
       </w:rPr>
     </w:lvl>
   </w:abstractNum>
-  <w:abstractNum w:abstractNumId="138" w15:restartNumberingAfterBreak="0">
+  <w:abstractNum w:abstractNumId="140" w15:restartNumberingAfterBreak="0">
     <w:nsid w:val="6EF7387D"/>
     <w:multiLevelType w:val="multilevel"/>
     <w:tmpl w:val="8DFA541E"/>
@@ -42130,7 +42913,7 @@
       </w:rPr>
     </w:lvl>
   </w:abstractNum>
-  <w:abstractNum w:abstractNumId="139" w15:restartNumberingAfterBreak="0">
+  <w:abstractNum w:abstractNumId="141" w15:restartNumberingAfterBreak="0">
     <w:nsid w:val="6F196D4F"/>
     <w:multiLevelType w:val="multilevel"/>
     <w:tmpl w:val="945287A4"/>
@@ -42279,7 +43062,7 @@
       </w:rPr>
     </w:lvl>
   </w:abstractNum>
-  <w:abstractNum w:abstractNumId="140" w15:restartNumberingAfterBreak="0">
+  <w:abstractNum w:abstractNumId="142" w15:restartNumberingAfterBreak="0">
     <w:nsid w:val="6F6D7D72"/>
     <w:multiLevelType w:val="multilevel"/>
     <w:tmpl w:val="80EA0CAE"/>
@@ -42428,7 +43211,7 @@
       </w:rPr>
     </w:lvl>
   </w:abstractNum>
-  <w:abstractNum w:abstractNumId="141" w15:restartNumberingAfterBreak="0">
+  <w:abstractNum w:abstractNumId="143" w15:restartNumberingAfterBreak="0">
     <w:nsid w:val="70106EAA"/>
     <w:multiLevelType w:val="multilevel"/>
     <w:tmpl w:val="9614ED02"/>
@@ -42577,7 +43360,7 @@
       </w:rPr>
     </w:lvl>
   </w:abstractNum>
-  <w:abstractNum w:abstractNumId="142" w15:restartNumberingAfterBreak="0">
+  <w:abstractNum w:abstractNumId="144" w15:restartNumberingAfterBreak="0">
     <w:nsid w:val="7164578A"/>
     <w:multiLevelType w:val="multilevel"/>
     <w:tmpl w:val="2C287DEE"/>
@@ -42726,7 +43509,7 @@
       </w:rPr>
     </w:lvl>
   </w:abstractNum>
-  <w:abstractNum w:abstractNumId="143" w15:restartNumberingAfterBreak="0">
+  <w:abstractNum w:abstractNumId="145" w15:restartNumberingAfterBreak="0">
     <w:nsid w:val="71703412"/>
     <w:multiLevelType w:val="multilevel"/>
     <w:tmpl w:val="8272B990"/>
@@ -42843,7 +43626,7 @@
       </w:pPr>
     </w:lvl>
   </w:abstractNum>
-  <w:abstractNum w:abstractNumId="144" w15:restartNumberingAfterBreak="0">
+  <w:abstractNum w:abstractNumId="146" w15:restartNumberingAfterBreak="0">
     <w:nsid w:val="718377AC"/>
     <w:multiLevelType w:val="multilevel"/>
     <w:tmpl w:val="83E45BC0"/>
@@ -42992,7 +43775,7 @@
       </w:rPr>
     </w:lvl>
   </w:abstractNum>
-  <w:abstractNum w:abstractNumId="145" w15:restartNumberingAfterBreak="0">
+  <w:abstractNum w:abstractNumId="147" w15:restartNumberingAfterBreak="0">
     <w:nsid w:val="72987BBF"/>
     <w:multiLevelType w:val="multilevel"/>
     <w:tmpl w:val="50ECD624"/>
@@ -43141,7 +43924,7 @@
       </w:rPr>
     </w:lvl>
   </w:abstractNum>
-  <w:abstractNum w:abstractNumId="146" w15:restartNumberingAfterBreak="0">
+  <w:abstractNum w:abstractNumId="148" w15:restartNumberingAfterBreak="0">
     <w:nsid w:val="730B4980"/>
     <w:multiLevelType w:val="multilevel"/>
     <w:tmpl w:val="F4F87FA0"/>
@@ -43290,7 +44073,7 @@
       </w:rPr>
     </w:lvl>
   </w:abstractNum>
-  <w:abstractNum w:abstractNumId="147" w15:restartNumberingAfterBreak="0">
+  <w:abstractNum w:abstractNumId="149" w15:restartNumberingAfterBreak="0">
     <w:nsid w:val="73362552"/>
     <w:multiLevelType w:val="multilevel"/>
     <w:tmpl w:val="D03AC734"/>
@@ -43439,7 +44222,7 @@
       </w:rPr>
     </w:lvl>
   </w:abstractNum>
-  <w:abstractNum w:abstractNumId="148" w15:restartNumberingAfterBreak="0">
+  <w:abstractNum w:abstractNumId="150" w15:restartNumberingAfterBreak="0">
     <w:nsid w:val="74FA6AFD"/>
     <w:multiLevelType w:val="multilevel"/>
     <w:tmpl w:val="5E5ED494"/>
@@ -43588,7 +44371,7 @@
       </w:rPr>
     </w:lvl>
   </w:abstractNum>
-  <w:abstractNum w:abstractNumId="149" w15:restartNumberingAfterBreak="0">
+  <w:abstractNum w:abstractNumId="151" w15:restartNumberingAfterBreak="0">
     <w:nsid w:val="760455BE"/>
     <w:multiLevelType w:val="multilevel"/>
     <w:tmpl w:val="2BD4C678"/>
@@ -43737,7 +44520,7 @@
       </w:rPr>
     </w:lvl>
   </w:abstractNum>
-  <w:abstractNum w:abstractNumId="150" w15:restartNumberingAfterBreak="0">
+  <w:abstractNum w:abstractNumId="152" w15:restartNumberingAfterBreak="0">
     <w:nsid w:val="76125551"/>
     <w:multiLevelType w:val="multilevel"/>
     <w:tmpl w:val="9C5C060A"/>
@@ -43886,7 +44669,7 @@
       </w:rPr>
     </w:lvl>
   </w:abstractNum>
-  <w:abstractNum w:abstractNumId="151" w15:restartNumberingAfterBreak="0">
+  <w:abstractNum w:abstractNumId="153" w15:restartNumberingAfterBreak="0">
     <w:nsid w:val="762C3E8D"/>
     <w:multiLevelType w:val="multilevel"/>
     <w:tmpl w:val="CF2C584E"/>
@@ -44035,7 +44818,7 @@
       </w:rPr>
     </w:lvl>
   </w:abstractNum>
-  <w:abstractNum w:abstractNumId="152" w15:restartNumberingAfterBreak="0">
+  <w:abstractNum w:abstractNumId="154" w15:restartNumberingAfterBreak="0">
     <w:nsid w:val="76555A4B"/>
     <w:multiLevelType w:val="multilevel"/>
     <w:tmpl w:val="90301AB0"/>
@@ -44184,7 +44967,7 @@
       </w:rPr>
     </w:lvl>
   </w:abstractNum>
-  <w:abstractNum w:abstractNumId="153" w15:restartNumberingAfterBreak="0">
+  <w:abstractNum w:abstractNumId="155" w15:restartNumberingAfterBreak="0">
     <w:nsid w:val="767F2668"/>
     <w:multiLevelType w:val="multilevel"/>
     <w:tmpl w:val="21727A62"/>
@@ -44333,7 +45116,7 @@
       </w:rPr>
     </w:lvl>
   </w:abstractNum>
-  <w:abstractNum w:abstractNumId="154" w15:restartNumberingAfterBreak="0">
+  <w:abstractNum w:abstractNumId="156" w15:restartNumberingAfterBreak="0">
     <w:nsid w:val="77223309"/>
     <w:multiLevelType w:val="multilevel"/>
     <w:tmpl w:val="177C30A0"/>
@@ -44482,7 +45265,7 @@
       </w:rPr>
     </w:lvl>
   </w:abstractNum>
-  <w:abstractNum w:abstractNumId="155" w15:restartNumberingAfterBreak="0">
+  <w:abstractNum w:abstractNumId="157" w15:restartNumberingAfterBreak="0">
     <w:nsid w:val="77C7688A"/>
     <w:multiLevelType w:val="multilevel"/>
     <w:tmpl w:val="7DEE9038"/>
@@ -44631,7 +45414,7 @@
       </w:rPr>
     </w:lvl>
   </w:abstractNum>
-  <w:abstractNum w:abstractNumId="156" w15:restartNumberingAfterBreak="0">
+  <w:abstractNum w:abstractNumId="158" w15:restartNumberingAfterBreak="0">
     <w:nsid w:val="78047FE7"/>
     <w:multiLevelType w:val="multilevel"/>
     <w:tmpl w:val="095ECB90"/>
@@ -44780,7 +45563,7 @@
       </w:rPr>
     </w:lvl>
   </w:abstractNum>
-  <w:abstractNum w:abstractNumId="157" w15:restartNumberingAfterBreak="0">
+  <w:abstractNum w:abstractNumId="159" w15:restartNumberingAfterBreak="0">
     <w:nsid w:val="792F4B6B"/>
     <w:multiLevelType w:val="multilevel"/>
     <w:tmpl w:val="1FDC9FAC"/>
@@ -44893,7 +45676,7 @@
       </w:pPr>
     </w:lvl>
   </w:abstractNum>
-  <w:abstractNum w:abstractNumId="158" w15:restartNumberingAfterBreak="0">
+  <w:abstractNum w:abstractNumId="160" w15:restartNumberingAfterBreak="0">
     <w:nsid w:val="793C45EA"/>
     <w:multiLevelType w:val="multilevel"/>
     <w:tmpl w:val="A68CE0F6"/>
@@ -45042,7 +45825,7 @@
       </w:rPr>
     </w:lvl>
   </w:abstractNum>
-  <w:abstractNum w:abstractNumId="159" w15:restartNumberingAfterBreak="0">
+  <w:abstractNum w:abstractNumId="161" w15:restartNumberingAfterBreak="0">
     <w:nsid w:val="79602155"/>
     <w:multiLevelType w:val="multilevel"/>
     <w:tmpl w:val="DCAEAD64"/>
@@ -45191,7 +45974,7 @@
       </w:rPr>
     </w:lvl>
   </w:abstractNum>
-  <w:abstractNum w:abstractNumId="160" w15:restartNumberingAfterBreak="0">
+  <w:abstractNum w:abstractNumId="162" w15:restartNumberingAfterBreak="0">
     <w:nsid w:val="7A611C99"/>
     <w:multiLevelType w:val="multilevel"/>
     <w:tmpl w:val="95462DA8"/>
@@ -45340,7 +46123,7 @@
       </w:rPr>
     </w:lvl>
   </w:abstractNum>
-  <w:abstractNum w:abstractNumId="161" w15:restartNumberingAfterBreak="0">
+  <w:abstractNum w:abstractNumId="163" w15:restartNumberingAfterBreak="0">
     <w:nsid w:val="7B861452"/>
     <w:multiLevelType w:val="multilevel"/>
     <w:tmpl w:val="6E1ED4B4"/>
@@ -45489,7 +46272,7 @@
       </w:rPr>
     </w:lvl>
   </w:abstractNum>
-  <w:abstractNum w:abstractNumId="162" w15:restartNumberingAfterBreak="0">
+  <w:abstractNum w:abstractNumId="164" w15:restartNumberingAfterBreak="0">
     <w:nsid w:val="7C6C1BC6"/>
     <w:multiLevelType w:val="multilevel"/>
     <w:tmpl w:val="4ACAA582"/>
@@ -45638,7 +46421,7 @@
       </w:rPr>
     </w:lvl>
   </w:abstractNum>
-  <w:abstractNum w:abstractNumId="163" w15:restartNumberingAfterBreak="0">
+  <w:abstractNum w:abstractNumId="165" w15:restartNumberingAfterBreak="0">
     <w:nsid w:val="7F693EFF"/>
     <w:multiLevelType w:val="multilevel"/>
     <w:tmpl w:val="F5EADD5A"/>
@@ -45756,127 +46539,127 @@
     </w:lvl>
   </w:abstractNum>
   <w:num w:numId="1" w16cid:durableId="626743724">
-    <w:abstractNumId w:val="34"/>
+    <w:abstractNumId w:val="35"/>
   </w:num>
   <w:num w:numId="2" w16cid:durableId="297152199">
     <w:abstractNumId w:val="0"/>
   </w:num>
   <w:num w:numId="3" w16cid:durableId="1389106037">
-    <w:abstractNumId w:val="153"/>
+    <w:abstractNumId w:val="155"/>
   </w:num>
   <w:num w:numId="4" w16cid:durableId="1488548116">
-    <w:abstractNumId w:val="26"/>
+    <w:abstractNumId w:val="27"/>
   </w:num>
   <w:num w:numId="5" w16cid:durableId="614288931">
-    <w:abstractNumId w:val="114"/>
+    <w:abstractNumId w:val="116"/>
   </w:num>
   <w:num w:numId="6" w16cid:durableId="765223985">
-    <w:abstractNumId w:val="163"/>
+    <w:abstractNumId w:val="165"/>
   </w:num>
   <w:num w:numId="7" w16cid:durableId="805123109">
-    <w:abstractNumId w:val="143"/>
+    <w:abstractNumId w:val="145"/>
   </w:num>
   <w:num w:numId="8" w16cid:durableId="1601916474">
-    <w:abstractNumId w:val="63"/>
+    <w:abstractNumId w:val="65"/>
   </w:num>
   <w:num w:numId="9" w16cid:durableId="428503132">
-    <w:abstractNumId w:val="78"/>
+    <w:abstractNumId w:val="80"/>
   </w:num>
   <w:num w:numId="10" w16cid:durableId="386301620">
-    <w:abstractNumId w:val="66"/>
+    <w:abstractNumId w:val="68"/>
   </w:num>
   <w:num w:numId="11" w16cid:durableId="1005983543">
-    <w:abstractNumId w:val="29"/>
+    <w:abstractNumId w:val="30"/>
   </w:num>
   <w:num w:numId="12" w16cid:durableId="1383094397">
-    <w:abstractNumId w:val="102"/>
+    <w:abstractNumId w:val="104"/>
   </w:num>
   <w:num w:numId="13" w16cid:durableId="132797494">
-    <w:abstractNumId w:val="156"/>
+    <w:abstractNumId w:val="158"/>
   </w:num>
   <w:num w:numId="14" w16cid:durableId="410811088">
-    <w:abstractNumId w:val="128"/>
+    <w:abstractNumId w:val="130"/>
   </w:num>
   <w:num w:numId="15" w16cid:durableId="966667809">
-    <w:abstractNumId w:val="91"/>
+    <w:abstractNumId w:val="93"/>
   </w:num>
   <w:num w:numId="16" w16cid:durableId="1544976151">
-    <w:abstractNumId w:val="124"/>
+    <w:abstractNumId w:val="126"/>
   </w:num>
   <w:num w:numId="17" w16cid:durableId="118570661">
-    <w:abstractNumId w:val="123"/>
+    <w:abstractNumId w:val="125"/>
   </w:num>
   <w:num w:numId="18" w16cid:durableId="558786331">
     <w:abstractNumId w:val="20"/>
   </w:num>
   <w:num w:numId="19" w16cid:durableId="865364272">
-    <w:abstractNumId w:val="130"/>
+    <w:abstractNumId w:val="132"/>
   </w:num>
   <w:num w:numId="20" w16cid:durableId="240606995">
     <w:abstractNumId w:val="14"/>
   </w:num>
   <w:num w:numId="21" w16cid:durableId="1074281219">
-    <w:abstractNumId w:val="48"/>
+    <w:abstractNumId w:val="49"/>
   </w:num>
   <w:num w:numId="22" w16cid:durableId="76825477">
-    <w:abstractNumId w:val="62"/>
+    <w:abstractNumId w:val="64"/>
   </w:num>
   <w:num w:numId="23" w16cid:durableId="461265046">
-    <w:abstractNumId w:val="117"/>
+    <w:abstractNumId w:val="119"/>
   </w:num>
   <w:num w:numId="24" w16cid:durableId="363403658">
-    <w:abstractNumId w:val="56"/>
+    <w:abstractNumId w:val="58"/>
   </w:num>
   <w:num w:numId="25" w16cid:durableId="1202480351">
-    <w:abstractNumId w:val="79"/>
+    <w:abstractNumId w:val="81"/>
   </w:num>
   <w:num w:numId="26" w16cid:durableId="458957407">
     <w:abstractNumId w:val="2"/>
   </w:num>
   <w:num w:numId="27" w16cid:durableId="1373506403">
-    <w:abstractNumId w:val="106"/>
+    <w:abstractNumId w:val="108"/>
   </w:num>
   <w:num w:numId="28" w16cid:durableId="1949003165">
-    <w:abstractNumId w:val="160"/>
+    <w:abstractNumId w:val="162"/>
   </w:num>
   <w:num w:numId="29" w16cid:durableId="1909219134">
-    <w:abstractNumId w:val="35"/>
+    <w:abstractNumId w:val="36"/>
   </w:num>
   <w:num w:numId="30" w16cid:durableId="1208638948">
-    <w:abstractNumId w:val="37"/>
+    <w:abstractNumId w:val="38"/>
   </w:num>
   <w:num w:numId="31" w16cid:durableId="1108740531">
-    <w:abstractNumId w:val="161"/>
+    <w:abstractNumId w:val="163"/>
   </w:num>
   <w:num w:numId="32" w16cid:durableId="594167666">
     <w:abstractNumId w:val="5"/>
   </w:num>
   <w:num w:numId="33" w16cid:durableId="170293372">
-    <w:abstractNumId w:val="59"/>
+    <w:abstractNumId w:val="61"/>
   </w:num>
   <w:num w:numId="34" w16cid:durableId="2127960538">
-    <w:abstractNumId w:val="141"/>
+    <w:abstractNumId w:val="143"/>
   </w:num>
   <w:num w:numId="35" w16cid:durableId="732777549">
     <w:abstractNumId w:val="7"/>
   </w:num>
   <w:num w:numId="36" w16cid:durableId="597519152">
-    <w:abstractNumId w:val="122"/>
+    <w:abstractNumId w:val="124"/>
   </w:num>
   <w:num w:numId="37" w16cid:durableId="419496973">
-    <w:abstractNumId w:val="144"/>
+    <w:abstractNumId w:val="146"/>
   </w:num>
   <w:num w:numId="38" w16cid:durableId="299189757">
-    <w:abstractNumId w:val="51"/>
+    <w:abstractNumId w:val="52"/>
   </w:num>
   <w:num w:numId="39" w16cid:durableId="963199171">
-    <w:abstractNumId w:val="77"/>
+    <w:abstractNumId w:val="79"/>
   </w:num>
   <w:num w:numId="40" w16cid:durableId="2126805084">
-    <w:abstractNumId w:val="53"/>
+    <w:abstractNumId w:val="54"/>
   </w:num>
   <w:num w:numId="41" w16cid:durableId="1929533806">
-    <w:abstractNumId w:val="85"/>
+    <w:abstractNumId w:val="87"/>
   </w:num>
   <w:num w:numId="42" w16cid:durableId="1528518858">
     <w:abstractNumId w:val="15"/>
@@ -45885,367 +46668,373 @@
     <w:abstractNumId w:val="6"/>
   </w:num>
   <w:num w:numId="44" w16cid:durableId="1985158651">
-    <w:abstractNumId w:val="96"/>
+    <w:abstractNumId w:val="98"/>
   </w:num>
   <w:num w:numId="45" w16cid:durableId="1034309562">
-    <w:abstractNumId w:val="135"/>
+    <w:abstractNumId w:val="137"/>
   </w:num>
   <w:num w:numId="46" w16cid:durableId="467672550">
     <w:abstractNumId w:val="11"/>
   </w:num>
   <w:num w:numId="47" w16cid:durableId="761803944">
-    <w:abstractNumId w:val="65"/>
+    <w:abstractNumId w:val="67"/>
   </w:num>
   <w:num w:numId="48" w16cid:durableId="1946499153">
-    <w:abstractNumId w:val="118"/>
+    <w:abstractNumId w:val="120"/>
   </w:num>
   <w:num w:numId="49" w16cid:durableId="1272282476">
-    <w:abstractNumId w:val="88"/>
+    <w:abstractNumId w:val="90"/>
   </w:num>
   <w:num w:numId="50" w16cid:durableId="325670176">
-    <w:abstractNumId w:val="151"/>
+    <w:abstractNumId w:val="153"/>
   </w:num>
   <w:num w:numId="51" w16cid:durableId="940645101">
-    <w:abstractNumId w:val="137"/>
+    <w:abstractNumId w:val="139"/>
   </w:num>
   <w:num w:numId="52" w16cid:durableId="1475415439">
-    <w:abstractNumId w:val="75"/>
+    <w:abstractNumId w:val="77"/>
   </w:num>
   <w:num w:numId="53" w16cid:durableId="349768632">
-    <w:abstractNumId w:val="105"/>
+    <w:abstractNumId w:val="107"/>
   </w:num>
   <w:num w:numId="54" w16cid:durableId="1702052299">
-    <w:abstractNumId w:val="67"/>
+    <w:abstractNumId w:val="69"/>
   </w:num>
   <w:num w:numId="55" w16cid:durableId="1307934670">
-    <w:abstractNumId w:val="68"/>
+    <w:abstractNumId w:val="70"/>
   </w:num>
   <w:num w:numId="56" w16cid:durableId="2022464555">
-    <w:abstractNumId w:val="157"/>
+    <w:abstractNumId w:val="159"/>
   </w:num>
   <w:num w:numId="57" w16cid:durableId="616987174">
-    <w:abstractNumId w:val="61"/>
+    <w:abstractNumId w:val="63"/>
   </w:num>
   <w:num w:numId="58" w16cid:durableId="964389958">
-    <w:abstractNumId w:val="107"/>
+    <w:abstractNumId w:val="109"/>
   </w:num>
   <w:num w:numId="59" w16cid:durableId="1273395272">
-    <w:abstractNumId w:val="30"/>
+    <w:abstractNumId w:val="31"/>
   </w:num>
   <w:num w:numId="60" w16cid:durableId="336464659">
-    <w:abstractNumId w:val="58"/>
+    <w:abstractNumId w:val="60"/>
   </w:num>
   <w:num w:numId="61" w16cid:durableId="2053308672">
     <w:abstractNumId w:val="9"/>
   </w:num>
   <w:num w:numId="62" w16cid:durableId="779373177">
-    <w:abstractNumId w:val="159"/>
+    <w:abstractNumId w:val="161"/>
   </w:num>
   <w:num w:numId="63" w16cid:durableId="336468474">
-    <w:abstractNumId w:val="69"/>
+    <w:abstractNumId w:val="71"/>
   </w:num>
   <w:num w:numId="64" w16cid:durableId="1020082934">
-    <w:abstractNumId w:val="103"/>
+    <w:abstractNumId w:val="105"/>
   </w:num>
   <w:num w:numId="65" w16cid:durableId="1837115569">
-    <w:abstractNumId w:val="45"/>
+    <w:abstractNumId w:val="46"/>
   </w:num>
   <w:num w:numId="66" w16cid:durableId="1675572939">
+    <w:abstractNumId w:val="91"/>
+  </w:num>
+  <w:num w:numId="67" w16cid:durableId="206190391">
+    <w:abstractNumId w:val="74"/>
+  </w:num>
+  <w:num w:numId="68" w16cid:durableId="822771213">
+    <w:abstractNumId w:val="136"/>
+  </w:num>
+  <w:num w:numId="69" w16cid:durableId="1850827704">
+    <w:abstractNumId w:val="28"/>
+  </w:num>
+  <w:num w:numId="70" w16cid:durableId="739786359">
     <w:abstractNumId w:val="89"/>
   </w:num>
-  <w:num w:numId="67" w16cid:durableId="206190391">
-    <w:abstractNumId w:val="72"/>
-  </w:num>
-  <w:num w:numId="68" w16cid:durableId="822771213">
-    <w:abstractNumId w:val="134"/>
-  </w:num>
-  <w:num w:numId="69" w16cid:durableId="1850827704">
-    <w:abstractNumId w:val="27"/>
-  </w:num>
-  <w:num w:numId="70" w16cid:durableId="739786359">
-    <w:abstractNumId w:val="87"/>
-  </w:num>
   <w:num w:numId="71" w16cid:durableId="139082488">
-    <w:abstractNumId w:val="39"/>
+    <w:abstractNumId w:val="40"/>
   </w:num>
   <w:num w:numId="72" w16cid:durableId="2045132756">
-    <w:abstractNumId w:val="158"/>
+    <w:abstractNumId w:val="160"/>
   </w:num>
   <w:num w:numId="73" w16cid:durableId="95755689">
-    <w:abstractNumId w:val="116"/>
+    <w:abstractNumId w:val="118"/>
   </w:num>
   <w:num w:numId="74" w16cid:durableId="726030533">
-    <w:abstractNumId w:val="31"/>
+    <w:abstractNumId w:val="32"/>
   </w:num>
   <w:num w:numId="75" w16cid:durableId="1881940598">
+    <w:abstractNumId w:val="78"/>
+  </w:num>
+  <w:num w:numId="76" w16cid:durableId="1812748606">
     <w:abstractNumId w:val="76"/>
   </w:num>
-  <w:num w:numId="76" w16cid:durableId="1812748606">
-    <w:abstractNumId w:val="74"/>
-  </w:num>
   <w:num w:numId="77" w16cid:durableId="1134177744">
-    <w:abstractNumId w:val="108"/>
+    <w:abstractNumId w:val="110"/>
   </w:num>
   <w:num w:numId="78" w16cid:durableId="665789545">
-    <w:abstractNumId w:val="98"/>
+    <w:abstractNumId w:val="100"/>
   </w:num>
   <w:num w:numId="79" w16cid:durableId="1114521056">
-    <w:abstractNumId w:val="113"/>
+    <w:abstractNumId w:val="115"/>
   </w:num>
   <w:num w:numId="80" w16cid:durableId="294873476">
-    <w:abstractNumId w:val="150"/>
+    <w:abstractNumId w:val="152"/>
   </w:num>
   <w:num w:numId="81" w16cid:durableId="1118454442">
-    <w:abstractNumId w:val="81"/>
+    <w:abstractNumId w:val="83"/>
   </w:num>
   <w:num w:numId="82" w16cid:durableId="2036880701">
-    <w:abstractNumId w:val="46"/>
+    <w:abstractNumId w:val="47"/>
   </w:num>
   <w:num w:numId="83" w16cid:durableId="1421104814">
-    <w:abstractNumId w:val="120"/>
+    <w:abstractNumId w:val="122"/>
   </w:num>
   <w:num w:numId="84" w16cid:durableId="193351273">
-    <w:abstractNumId w:val="49"/>
+    <w:abstractNumId w:val="50"/>
   </w:num>
   <w:num w:numId="85" w16cid:durableId="1254821254">
-    <w:abstractNumId w:val="111"/>
+    <w:abstractNumId w:val="113"/>
   </w:num>
   <w:num w:numId="86" w16cid:durableId="1402216703">
     <w:abstractNumId w:val="13"/>
   </w:num>
   <w:num w:numId="87" w16cid:durableId="487133786">
-    <w:abstractNumId w:val="23"/>
+    <w:abstractNumId w:val="24"/>
   </w:num>
   <w:num w:numId="88" w16cid:durableId="1796824795">
+    <w:abstractNumId w:val="86"/>
+  </w:num>
+  <w:num w:numId="89" w16cid:durableId="1239364236">
     <w:abstractNumId w:val="84"/>
   </w:num>
-  <w:num w:numId="89" w16cid:durableId="1239364236">
-    <w:abstractNumId w:val="82"/>
+  <w:num w:numId="90" w16cid:durableId="1949461618">
+    <w:abstractNumId w:val="123"/>
   </w:num>
-  <w:num w:numId="90" w16cid:durableId="1949461618">
+  <w:num w:numId="91" w16cid:durableId="303317518">
+    <w:abstractNumId w:val="29"/>
+  </w:num>
+  <w:num w:numId="92" w16cid:durableId="1212227087">
+    <w:abstractNumId w:val="131"/>
+  </w:num>
+  <w:num w:numId="93" w16cid:durableId="2122144053">
+    <w:abstractNumId w:val="97"/>
+  </w:num>
+  <w:num w:numId="94" w16cid:durableId="1111321352">
     <w:abstractNumId w:val="121"/>
   </w:num>
-  <w:num w:numId="91" w16cid:durableId="303317518">
-    <w:abstractNumId w:val="28"/>
-  </w:num>
-  <w:num w:numId="92" w16cid:durableId="1212227087">
-    <w:abstractNumId w:val="129"/>
-  </w:num>
-  <w:num w:numId="93" w16cid:durableId="2122144053">
-    <w:abstractNumId w:val="95"/>
-  </w:num>
-  <w:num w:numId="94" w16cid:durableId="1111321352">
-    <w:abstractNumId w:val="119"/>
-  </w:num>
   <w:num w:numId="95" w16cid:durableId="1099443953">
-    <w:abstractNumId w:val="110"/>
+    <w:abstractNumId w:val="112"/>
   </w:num>
   <w:num w:numId="96" w16cid:durableId="1293319362">
     <w:abstractNumId w:val="21"/>
   </w:num>
   <w:num w:numId="97" w16cid:durableId="1322201765">
-    <w:abstractNumId w:val="131"/>
+    <w:abstractNumId w:val="133"/>
   </w:num>
   <w:num w:numId="98" w16cid:durableId="981353856">
-    <w:abstractNumId w:val="115"/>
+    <w:abstractNumId w:val="117"/>
   </w:num>
   <w:num w:numId="99" w16cid:durableId="354574432">
-    <w:abstractNumId w:val="22"/>
+    <w:abstractNumId w:val="23"/>
   </w:num>
   <w:num w:numId="100" w16cid:durableId="175972229">
     <w:abstractNumId w:val="17"/>
   </w:num>
   <w:num w:numId="101" w16cid:durableId="1510295646">
-    <w:abstractNumId w:val="147"/>
+    <w:abstractNumId w:val="149"/>
   </w:num>
   <w:num w:numId="102" w16cid:durableId="1857033956">
-    <w:abstractNumId w:val="50"/>
+    <w:abstractNumId w:val="51"/>
   </w:num>
   <w:num w:numId="103" w16cid:durableId="115217511">
-    <w:abstractNumId w:val="100"/>
+    <w:abstractNumId w:val="102"/>
   </w:num>
   <w:num w:numId="104" w16cid:durableId="1564635964">
-    <w:abstractNumId w:val="148"/>
+    <w:abstractNumId w:val="150"/>
   </w:num>
   <w:num w:numId="105" w16cid:durableId="904679035">
-    <w:abstractNumId w:val="43"/>
+    <w:abstractNumId w:val="44"/>
   </w:num>
   <w:num w:numId="106" w16cid:durableId="157044778">
-    <w:abstractNumId w:val="162"/>
+    <w:abstractNumId w:val="164"/>
   </w:num>
   <w:num w:numId="107" w16cid:durableId="792479079">
-    <w:abstractNumId w:val="24"/>
+    <w:abstractNumId w:val="25"/>
   </w:num>
   <w:num w:numId="108" w16cid:durableId="105198854">
-    <w:abstractNumId w:val="64"/>
+    <w:abstractNumId w:val="66"/>
   </w:num>
   <w:num w:numId="109" w16cid:durableId="1239243023">
-    <w:abstractNumId w:val="109"/>
+    <w:abstractNumId w:val="111"/>
   </w:num>
   <w:num w:numId="110" w16cid:durableId="1106267481">
-    <w:abstractNumId w:val="112"/>
+    <w:abstractNumId w:val="114"/>
   </w:num>
   <w:num w:numId="111" w16cid:durableId="453328718">
     <w:abstractNumId w:val="18"/>
   </w:num>
   <w:num w:numId="112" w16cid:durableId="742995273">
-    <w:abstractNumId w:val="101"/>
+    <w:abstractNumId w:val="103"/>
   </w:num>
   <w:num w:numId="113" w16cid:durableId="99883853">
-    <w:abstractNumId w:val="54"/>
+    <w:abstractNumId w:val="55"/>
   </w:num>
   <w:num w:numId="114" w16cid:durableId="1851334941">
-    <w:abstractNumId w:val="38"/>
+    <w:abstractNumId w:val="39"/>
   </w:num>
   <w:num w:numId="115" w16cid:durableId="504638866">
     <w:abstractNumId w:val="3"/>
   </w:num>
   <w:num w:numId="116" w16cid:durableId="2035764819">
-    <w:abstractNumId w:val="133"/>
+    <w:abstractNumId w:val="135"/>
   </w:num>
   <w:num w:numId="117" w16cid:durableId="972366104">
     <w:abstractNumId w:val="19"/>
   </w:num>
   <w:num w:numId="118" w16cid:durableId="284699134">
-    <w:abstractNumId w:val="139"/>
+    <w:abstractNumId w:val="141"/>
   </w:num>
   <w:num w:numId="119" w16cid:durableId="1539858403">
-    <w:abstractNumId w:val="41"/>
+    <w:abstractNumId w:val="42"/>
   </w:num>
   <w:num w:numId="120" w16cid:durableId="123237660">
-    <w:abstractNumId w:val="97"/>
+    <w:abstractNumId w:val="99"/>
   </w:num>
   <w:num w:numId="121" w16cid:durableId="1412317549">
-    <w:abstractNumId w:val="142"/>
+    <w:abstractNumId w:val="144"/>
   </w:num>
   <w:num w:numId="122" w16cid:durableId="1035040179">
-    <w:abstractNumId w:val="60"/>
+    <w:abstractNumId w:val="62"/>
   </w:num>
   <w:num w:numId="123" w16cid:durableId="1108702146">
-    <w:abstractNumId w:val="32"/>
+    <w:abstractNumId w:val="33"/>
   </w:num>
   <w:num w:numId="124" w16cid:durableId="1816220112">
-    <w:abstractNumId w:val="33"/>
+    <w:abstractNumId w:val="34"/>
   </w:num>
   <w:num w:numId="125" w16cid:durableId="1720351731">
-    <w:abstractNumId w:val="36"/>
+    <w:abstractNumId w:val="37"/>
   </w:num>
   <w:num w:numId="126" w16cid:durableId="1854227660">
-    <w:abstractNumId w:val="154"/>
+    <w:abstractNumId w:val="156"/>
   </w:num>
   <w:num w:numId="127" w16cid:durableId="445584526">
     <w:abstractNumId w:val="4"/>
   </w:num>
   <w:num w:numId="128" w16cid:durableId="810711085">
-    <w:abstractNumId w:val="93"/>
+    <w:abstractNumId w:val="95"/>
   </w:num>
   <w:num w:numId="129" w16cid:durableId="1546212577">
-    <w:abstractNumId w:val="44"/>
+    <w:abstractNumId w:val="45"/>
   </w:num>
   <w:num w:numId="130" w16cid:durableId="1342126458">
-    <w:abstractNumId w:val="149"/>
+    <w:abstractNumId w:val="151"/>
   </w:num>
   <w:num w:numId="131" w16cid:durableId="653994495">
-    <w:abstractNumId w:val="83"/>
+    <w:abstractNumId w:val="85"/>
   </w:num>
   <w:num w:numId="132" w16cid:durableId="390545666">
-    <w:abstractNumId w:val="40"/>
+    <w:abstractNumId w:val="41"/>
   </w:num>
   <w:num w:numId="133" w16cid:durableId="496924944">
-    <w:abstractNumId w:val="71"/>
+    <w:abstractNumId w:val="73"/>
   </w:num>
   <w:num w:numId="134" w16cid:durableId="1601375536">
-    <w:abstractNumId w:val="70"/>
+    <w:abstractNumId w:val="72"/>
   </w:num>
   <w:num w:numId="135" w16cid:durableId="188104009">
-    <w:abstractNumId w:val="57"/>
+    <w:abstractNumId w:val="59"/>
   </w:num>
   <w:num w:numId="136" w16cid:durableId="1417824193">
-    <w:abstractNumId w:val="99"/>
+    <w:abstractNumId w:val="101"/>
   </w:num>
   <w:num w:numId="137" w16cid:durableId="316224024">
-    <w:abstractNumId w:val="152"/>
+    <w:abstractNumId w:val="154"/>
   </w:num>
   <w:num w:numId="138" w16cid:durableId="1158109124">
-    <w:abstractNumId w:val="25"/>
+    <w:abstractNumId w:val="26"/>
   </w:num>
   <w:num w:numId="139" w16cid:durableId="1518081879">
-    <w:abstractNumId w:val="92"/>
+    <w:abstractNumId w:val="94"/>
   </w:num>
   <w:num w:numId="140" w16cid:durableId="1491554642">
-    <w:abstractNumId w:val="140"/>
+    <w:abstractNumId w:val="142"/>
   </w:num>
   <w:num w:numId="141" w16cid:durableId="974405170">
     <w:abstractNumId w:val="12"/>
   </w:num>
   <w:num w:numId="142" w16cid:durableId="300773959">
-    <w:abstractNumId w:val="94"/>
+    <w:abstractNumId w:val="96"/>
   </w:num>
   <w:num w:numId="143" w16cid:durableId="408845322">
-    <w:abstractNumId w:val="42"/>
+    <w:abstractNumId w:val="43"/>
   </w:num>
   <w:num w:numId="144" w16cid:durableId="1625116960">
-    <w:abstractNumId w:val="104"/>
+    <w:abstractNumId w:val="106"/>
   </w:num>
   <w:num w:numId="145" w16cid:durableId="1645817729">
     <w:abstractNumId w:val="8"/>
   </w:num>
   <w:num w:numId="146" w16cid:durableId="1557933717">
-    <w:abstractNumId w:val="47"/>
+    <w:abstractNumId w:val="48"/>
   </w:num>
   <w:num w:numId="147" w16cid:durableId="50618807">
-    <w:abstractNumId w:val="90"/>
+    <w:abstractNumId w:val="92"/>
   </w:num>
   <w:num w:numId="148" w16cid:durableId="64036906">
     <w:abstractNumId w:val="10"/>
   </w:num>
   <w:num w:numId="149" w16cid:durableId="795565636">
-    <w:abstractNumId w:val="55"/>
+    <w:abstractNumId w:val="57"/>
   </w:num>
   <w:num w:numId="150" w16cid:durableId="670568509">
-    <w:abstractNumId w:val="52"/>
+    <w:abstractNumId w:val="53"/>
   </w:num>
   <w:num w:numId="151" w16cid:durableId="721441102">
-    <w:abstractNumId w:val="73"/>
+    <w:abstractNumId w:val="75"/>
   </w:num>
   <w:num w:numId="152" w16cid:durableId="454904555">
-    <w:abstractNumId w:val="125"/>
+    <w:abstractNumId w:val="127"/>
   </w:num>
   <w:num w:numId="153" w16cid:durableId="709383522">
+    <w:abstractNumId w:val="140"/>
+  </w:num>
+  <w:num w:numId="154" w16cid:durableId="2068453887">
+    <w:abstractNumId w:val="88"/>
+  </w:num>
+  <w:num w:numId="155" w16cid:durableId="1889032697">
+    <w:abstractNumId w:val="147"/>
+  </w:num>
+  <w:num w:numId="156" w16cid:durableId="744298927">
     <w:abstractNumId w:val="138"/>
   </w:num>
-  <w:num w:numId="154" w16cid:durableId="2068453887">
-    <w:abstractNumId w:val="86"/>
-  </w:num>
-  <w:num w:numId="155" w16cid:durableId="1889032697">
-    <w:abstractNumId w:val="145"/>
-  </w:num>
-  <w:num w:numId="156" w16cid:durableId="744298927">
-    <w:abstractNumId w:val="136"/>
-  </w:num>
   <w:num w:numId="157" w16cid:durableId="371536412">
-    <w:abstractNumId w:val="155"/>
+    <w:abstractNumId w:val="157"/>
   </w:num>
   <w:num w:numId="158" w16cid:durableId="604075798">
     <w:abstractNumId w:val="16"/>
   </w:num>
   <w:num w:numId="159" w16cid:durableId="1159807363">
-    <w:abstractNumId w:val="126"/>
+    <w:abstractNumId w:val="128"/>
   </w:num>
   <w:num w:numId="160" w16cid:durableId="1223831634">
-    <w:abstractNumId w:val="146"/>
+    <w:abstractNumId w:val="148"/>
   </w:num>
   <w:num w:numId="161" w16cid:durableId="228350784">
-    <w:abstractNumId w:val="132"/>
+    <w:abstractNumId w:val="134"/>
   </w:num>
   <w:num w:numId="162" w16cid:durableId="2013215862">
     <w:abstractNumId w:val="1"/>
   </w:num>
   <w:num w:numId="163" w16cid:durableId="2087650446">
-    <w:abstractNumId w:val="80"/>
+    <w:abstractNumId w:val="82"/>
   </w:num>
   <w:num w:numId="164" w16cid:durableId="770781969">
-    <w:abstractNumId w:val="127"/>
+    <w:abstractNumId w:val="129"/>
+  </w:num>
+  <w:num w:numId="165" w16cid:durableId="666594885">
+    <w:abstractNumId w:val="22"/>
+  </w:num>
+  <w:num w:numId="166" w16cid:durableId="83570975">
+    <w:abstractNumId w:val="56"/>
   </w:num>
   <w:numIdMacAtCleanup w:val="30"/>
 </w:numbering>

</xml_diff>

<commit_message>
Valores correctos en Venta Parcial
</commit_message>
<xml_diff>
--- a/documentacion/ChatDesarrollo_001.docx
+++ b/documentacion/ChatDesarrollo_001.docx
@@ -32859,6 +32859,7 @@
       <w:pPr>
         <w:spacing w:after="0" w:line="240" w:lineRule="auto"/>
       </w:pPr>
+      <w:bookmarkStart w:id="0" w:name="_Hlk231738209"/>
       <w:r>
         <w:t xml:space="preserve">Perfecto, el </w:t>
       </w:r>
@@ -32928,94 +32929,144 @@
     </w:p>
     <w:p>
       <w:pPr>
+        <w:spacing w:after="0" w:line="240" w:lineRule="auto"/>
+        <w:rPr>
+          <w:b/>
+          <w:bCs/>
+          <w:color w:val="FF0000"/>
+        </w:rPr>
+      </w:pPr>
+    </w:p>
+    <w:p>
+      <w:pPr>
+        <w:spacing w:after="0" w:line="240" w:lineRule="auto"/>
+        <w:rPr>
+          <w:b/>
+          <w:bCs/>
+          <w:color w:val="FF0000"/>
+        </w:rPr>
+      </w:pPr>
+      <w:r>
+        <w:rPr>
+          <w:b/>
+          <w:bCs/>
+          <w:color w:val="FF0000"/>
+        </w:rPr>
+        <w:t>1. Prorrateo de Valores Financieros</w:t>
+      </w:r>
+    </w:p>
+    <w:p>
+      <w:pPr>
+        <w:spacing w:after="0" w:line="240" w:lineRule="auto"/>
+      </w:pPr>
+      <w:r>
+        <w:t>Se calcula la proporción vendida respecto al nominal total ($factor = \</w:t>
+      </w:r>
+      <w:proofErr w:type="gramStart"/>
+      <w:r>
+        <w:t>frac{</w:t>
+      </w:r>
+      <w:proofErr w:type="spellStart"/>
+      <w:proofErr w:type="gramEnd"/>
+      <w:r>
+        <w:t>NominalSold</w:t>
+      </w:r>
+      <w:proofErr w:type="spellEnd"/>
+      <w:r>
+        <w:t>}{</w:t>
+      </w:r>
+      <w:proofErr w:type="spellStart"/>
+      <w:r>
+        <w:t>NominalTotal</w:t>
+      </w:r>
+      <w:proofErr w:type="spellEnd"/>
+      <w:r>
+        <w:t>}$) y se prorratean de manera proporcional:</w:t>
+      </w:r>
+    </w:p>
+    <w:p>
+      <w:pPr>
+        <w:numPr>
+          <w:ilvl w:val="0"/>
+          <w:numId w:val="189"/>
+        </w:numPr>
+        <w:spacing w:after="0" w:line="240" w:lineRule="auto"/>
+      </w:pPr>
+      <w:r>
+        <w:t>La comisión del operador.</w:t>
+      </w:r>
+    </w:p>
+    <w:p>
+      <w:pPr>
+        <w:numPr>
+          <w:ilvl w:val="0"/>
+          <w:numId w:val="189"/>
+        </w:numPr>
+        <w:spacing w:after="0" w:line="240" w:lineRule="auto"/>
+      </w:pPr>
+      <w:r>
+        <w:t>La comisión de la bolsa.</w:t>
+      </w:r>
+    </w:p>
+    <w:p>
+      <w:pPr>
+        <w:numPr>
+          <w:ilvl w:val="0"/>
+          <w:numId w:val="189"/>
+        </w:numPr>
+        <w:spacing w:after="0" w:line="240" w:lineRule="auto"/>
+      </w:pPr>
+      <w:r>
+        <w:t>Las retenciones.</w:t>
+      </w:r>
+    </w:p>
+    <w:p>
+      <w:pPr>
+        <w:numPr>
+          <w:ilvl w:val="0"/>
+          <w:numId w:val="189"/>
+        </w:numPr>
+        <w:spacing w:after="0" w:line="240" w:lineRule="auto"/>
+      </w:pPr>
+      <w:r>
+        <w:t>El interés previo.</w:t>
+      </w:r>
+    </w:p>
+    <w:p>
+      <w:pPr>
+        <w:spacing w:after="0" w:line="240" w:lineRule="auto"/>
+        <w:rPr>
+          <w:b/>
+          <w:bCs/>
+          <w:color w:val="FF0000"/>
+        </w:rPr>
+      </w:pPr>
+      <w:r>
+        <w:rPr>
+          <w:b/>
+          <w:bCs/>
+          <w:color w:val="FF0000"/>
+        </w:rPr>
+        <w:t>2. Inactivación de la Inversión Original</w:t>
+      </w:r>
+    </w:p>
+    <w:p>
+      <w:pPr>
         <w:numPr>
           <w:ilvl w:val="0"/>
           <w:numId w:val="190"/>
         </w:numPr>
-        <w:tabs>
-          <w:tab w:val="clear" w:pos="720"/>
-        </w:tabs>
-        <w:spacing w:after="0" w:line="240" w:lineRule="auto"/>
-      </w:pPr>
-      <w:r>
-        <w:t>1. Prorrateo de Valores Financieros</w:t>
-      </w:r>
-    </w:p>
-    <w:p>
-      <w:pPr>
-        <w:spacing w:after="0" w:line="240" w:lineRule="auto"/>
-      </w:pPr>
-      <w:r>
-        <w:t>Se calcula la proporción vendida respecto al nominal total ($factor = \</w:t>
-      </w:r>
-      <w:proofErr w:type="gramStart"/>
-      <w:r>
-        <w:t>frac{</w:t>
-      </w:r>
-      <w:proofErr w:type="spellStart"/>
-      <w:proofErr w:type="gramEnd"/>
-      <w:r>
-        <w:t>NominalSold</w:t>
-      </w:r>
-      <w:proofErr w:type="spellEnd"/>
-      <w:r>
-        <w:t>}{</w:t>
-      </w:r>
-      <w:proofErr w:type="spellStart"/>
-      <w:r>
-        <w:t>NominalTotal</w:t>
-      </w:r>
-      <w:proofErr w:type="spellEnd"/>
-      <w:r>
-        <w:t>}$) y se prorratean de manera proporcional:</w:t>
-      </w:r>
-    </w:p>
-    <w:p>
-      <w:pPr>
-        <w:numPr>
-          <w:ilvl w:val="0"/>
-          <w:numId w:val="189"/>
-        </w:numPr>
-        <w:spacing w:after="0" w:line="240" w:lineRule="auto"/>
-      </w:pPr>
-      <w:r>
-        <w:t>La comisión del operador.</w:t>
-      </w:r>
-    </w:p>
-    <w:p>
-      <w:pPr>
-        <w:numPr>
-          <w:ilvl w:val="0"/>
-          <w:numId w:val="189"/>
-        </w:numPr>
-        <w:spacing w:after="0" w:line="240" w:lineRule="auto"/>
-      </w:pPr>
-      <w:r>
-        <w:t>La comisión de la bolsa.</w:t>
-      </w:r>
-    </w:p>
-    <w:p>
-      <w:pPr>
-        <w:numPr>
-          <w:ilvl w:val="0"/>
-          <w:numId w:val="189"/>
-        </w:numPr>
-        <w:spacing w:after="0" w:line="240" w:lineRule="auto"/>
-      </w:pPr>
-      <w:r>
-        <w:t>Las retenciones.</w:t>
-      </w:r>
-    </w:p>
-    <w:p>
-      <w:pPr>
-        <w:numPr>
-          <w:ilvl w:val="0"/>
-          <w:numId w:val="189"/>
-        </w:numPr>
-        <w:spacing w:after="0" w:line="240" w:lineRule="auto"/>
-      </w:pPr>
-      <w:r>
-        <w:t>El interés previo.</w:t>
+        <w:spacing w:after="0" w:line="240" w:lineRule="auto"/>
+      </w:pPr>
+      <w:r>
+        <w:rPr>
+          <w:b/>
+          <w:bCs/>
+        </w:rPr>
+        <w:t>Estado:</w:t>
+      </w:r>
+      <w:r>
+        <w:t> Se cambia el estado de la inversión original a VENDIDA_TOTAL (activo = false).</w:t>
       </w:r>
     </w:p>
     <w:p>
@@ -33024,40 +33075,6 @@
           <w:ilvl w:val="0"/>
           <w:numId w:val="190"/>
         </w:numPr>
-        <w:tabs>
-          <w:tab w:val="clear" w:pos="720"/>
-        </w:tabs>
-        <w:spacing w:after="0" w:line="240" w:lineRule="auto"/>
-      </w:pPr>
-      <w:r>
-        <w:t>2. Inactivación de la Inversión Original</w:t>
-      </w:r>
-    </w:p>
-    <w:p>
-      <w:pPr>
-        <w:numPr>
-          <w:ilvl w:val="0"/>
-          <w:numId w:val="190"/>
-        </w:numPr>
-        <w:spacing w:after="0" w:line="240" w:lineRule="auto"/>
-      </w:pPr>
-      <w:r>
-        <w:rPr>
-          <w:b/>
-          <w:bCs/>
-        </w:rPr>
-        <w:t>Estado:</w:t>
-      </w:r>
-      <w:r>
-        <w:t> Se cambia el estado de la inversión original a VENDIDA_TOTAL (activo = false).</w:t>
-      </w:r>
-    </w:p>
-    <w:p>
-      <w:pPr>
-        <w:numPr>
-          <w:ilvl w:val="0"/>
-          <w:numId w:val="190"/>
-        </w:numPr>
         <w:spacing w:after="0" w:line="240" w:lineRule="auto"/>
       </w:pPr>
       <w:r>
@@ -33089,16 +33106,19 @@
     </w:p>
     <w:p>
       <w:pPr>
-        <w:numPr>
-          <w:ilvl w:val="0"/>
-          <w:numId w:val="190"/>
-        </w:numPr>
-        <w:tabs>
-          <w:tab w:val="clear" w:pos="720"/>
-        </w:tabs>
-        <w:spacing w:after="0" w:line="240" w:lineRule="auto"/>
-      </w:pPr>
-      <w:r>
+        <w:spacing w:after="0" w:line="240" w:lineRule="auto"/>
+        <w:rPr>
+          <w:b/>
+          <w:bCs/>
+          <w:color w:val="FF0000"/>
+        </w:rPr>
+      </w:pPr>
+      <w:r>
+        <w:rPr>
+          <w:b/>
+          <w:bCs/>
+          <w:color w:val="FF0000"/>
+        </w:rPr>
         <w:t>3. Creación de las Dos Inversiones Derivadas</w:t>
       </w:r>
     </w:p>
@@ -33232,16 +33252,19 @@
     </w:p>
     <w:p>
       <w:pPr>
-        <w:numPr>
-          <w:ilvl w:val="0"/>
-          <w:numId w:val="190"/>
-        </w:numPr>
-        <w:tabs>
-          <w:tab w:val="clear" w:pos="720"/>
-        </w:tabs>
-        <w:spacing w:after="0" w:line="240" w:lineRule="auto"/>
-      </w:pPr>
-      <w:r>
+        <w:spacing w:after="0" w:line="240" w:lineRule="auto"/>
+        <w:rPr>
+          <w:b/>
+          <w:bCs/>
+          <w:color w:val="FF0000"/>
+        </w:rPr>
+      </w:pPr>
+      <w:r>
+        <w:rPr>
+          <w:b/>
+          <w:bCs/>
+          <w:color w:val="FF0000"/>
+        </w:rPr>
         <w:t>4. Reasignación de Amortizaciones para el Remanente</w:t>
       </w:r>
     </w:p>
@@ -33289,16 +33312,21 @@
     </w:p>
     <w:p>
       <w:pPr>
-        <w:numPr>
-          <w:ilvl w:val="0"/>
-          <w:numId w:val="190"/>
-        </w:numPr>
-        <w:tabs>
-          <w:tab w:val="clear" w:pos="720"/>
-        </w:tabs>
-        <w:spacing w:after="0" w:line="240" w:lineRule="auto"/>
-      </w:pPr>
-      <w:r>
+        <w:spacing w:after="0" w:line="240" w:lineRule="auto"/>
+        <w:ind w:left="360"/>
+        <w:rPr>
+          <w:b/>
+          <w:bCs/>
+          <w:color w:val="FF0000"/>
+        </w:rPr>
+      </w:pPr>
+      <w:r>
+        <w:rPr>
+          <w:b/>
+          <w:bCs/>
+          <w:color w:val="FF0000"/>
+        </w:rPr>
+        <w:lastRenderedPageBreak/>
         <w:t>5. Registro de la Venta y Movimiento de Capital</w:t>
       </w:r>
     </w:p>
@@ -33315,7 +33343,6 @@
           <w:b/>
           <w:bCs/>
         </w:rPr>
-        <w:lastRenderedPageBreak/>
         <w:t>Venta:</w:t>
       </w:r>
       <w:r>
@@ -33385,16 +33412,20 @@
     </w:p>
     <w:p>
       <w:pPr>
-        <w:numPr>
-          <w:ilvl w:val="0"/>
-          <w:numId w:val="190"/>
-        </w:numPr>
-        <w:tabs>
-          <w:tab w:val="clear" w:pos="720"/>
-        </w:tabs>
-        <w:spacing w:after="0" w:line="240" w:lineRule="auto"/>
-      </w:pPr>
-      <w:r>
+        <w:spacing w:after="0" w:line="240" w:lineRule="auto"/>
+        <w:ind w:left="360"/>
+        <w:rPr>
+          <w:b/>
+          <w:bCs/>
+          <w:color w:val="FF0000"/>
+        </w:rPr>
+      </w:pPr>
+      <w:r>
+        <w:rPr>
+          <w:b/>
+          <w:bCs/>
+          <w:color w:val="FF0000"/>
+        </w:rPr>
         <w:t>6. Relaciones de Trazabilidad</w:t>
       </w:r>
     </w:p>
@@ -33444,7 +33475,7 @@
       </w:pPr>
       <w:r>
         <w:pict w14:anchorId="1C5E1C92">
-          <v:rect id="_x0000_i1099" style="width:471pt;height:.75pt" o:hrpct="0" o:hralign="center" o:hrstd="t" o:hr="t" fillcolor="#a0a0a0" stroked="f"/>
+          <v:rect id="_x0000_i1093" style="width:471pt;height:.75pt" o:hrpct="0" o:hralign="center" o:hrstd="t" o:hr="t" fillcolor="#a0a0a0" stroked="f"/>
         </w:pict>
       </w:r>
     </w:p>
@@ -33456,6 +33487,7 @@
         <w:t>¿Es esta la lógica exacta que deseas mantener o hay algún ajuste que debamos aplicar a este flujo (por ejemplo, en cómo se dividen las amortizaciones, comisiones o en la interfaz gráfica)?</w:t>
       </w:r>
     </w:p>
+    <w:bookmarkEnd w:id="0"/>
     <w:p>
       <w:pPr>
         <w:spacing w:after="0" w:line="240" w:lineRule="auto"/>
@@ -62065,7 +62097,7 @@
   <w:num w:numId="194" w16cid:durableId="1325205009">
     <w:abstractNumId w:val="99"/>
   </w:num>
-  <w:numIdMacAtCleanup w:val="30"/>
+  <w:numIdMacAtCleanup w:val="194"/>
 </w:numbering>
 </file>
 
@@ -62583,6 +62615,7 @@
   <w:style w:type="character" w:default="1" w:styleId="Fuentedeprrafopredeter">
     <w:name w:val="Default Paragraph Font"/>
     <w:uiPriority w:val="1"/>
+    <w:semiHidden/>
     <w:unhideWhenUsed/>
   </w:style>
   <w:style w:type="table" w:default="1" w:styleId="Tablanormal">

</xml_diff>